<commit_message>
Revise resume site content, update docx/pdf, improve email body
- index.html: rewritten intro section, dignified/matter-of-fact tone
- resume.html: updated summary, all contract descriptions, EMRTS entries
  with anchor links and JS auto-open; chronology corrections (UT Center
  end date Dec 2002, EMRTS Jan 2012, Quantuvos Jul 2021)
- books.html: rename headings ('Reading Notes', 'AI Tools & Prompt Engineering')
- job_entry.html: add optional anchor= parameter to article tag
- base.html: add scripts block before </body>
- routes.py: remove hardcoded tech-stack bullets from resume email body
- scripts/update_resume_docx.py: full rewrite using python-docx to sync
  all 20 text changes to Resume.v3.7.docx
- static/files: update Resume.v3.7.docx and .pdf; remove Don Fox.docx
- .gitignore: exclude .backup.docx and working copy files
</commit_message>
<xml_diff>
--- a/static/files/Resume.v3.7.docx
+++ b/static/files/Resume.v3.7.docx
@@ -170,7 +170,7 @@
           <w:sz w:val="16"/>
           <w:szCs w:val="16"/>
         </w:rPr>
-        <w:t xml:space="preserve">Software engineer with </w:t>
+        <w:t>Thirty years of professional software development spanning telecommunications, warehousing, healthcare IT, and data systems. Primary focus has been backend engineering on Unix/Linux platforms, with experience across a broad range of languages, databases, and system architectures. More recent work includes web development, functional programming, and applied AI/prompt engineering. Proof-of-concept development — particularly in healthcare IT — has been a recurring part of the work, as has occasional intern mentoring.</w:t>
       </w:r>
       <w:r>
         <w:rPr>
@@ -179,7 +179,6 @@
           <w:sz w:val="16"/>
           <w:szCs w:val="16"/>
         </w:rPr>
-        <w:t>a background in telecommunications, warehousing, healthcare IT, and data systems. Most of my work has been</w:t>
       </w:r>
       <w:r>
         <w:rPr>
@@ -188,7 +187,6 @@
           <w:sz w:val="16"/>
           <w:szCs w:val="16"/>
         </w:rPr>
-        <w:t xml:space="preserve"> in background development using C/C++, Python, Perl, and Elixir, with a focus on RESTful APIs, database design in  Unix/Linux environm</w:t>
       </w:r>
       <w:r>
         <w:rPr>
@@ -197,7 +195,6 @@
           <w:sz w:val="16"/>
           <w:szCs w:val="16"/>
         </w:rPr>
-        <w:t>e</w:t>
       </w:r>
       <w:r>
         <w:rPr>
@@ -206,7 +203,6 @@
           <w:sz w:val="16"/>
           <w:szCs w:val="16"/>
         </w:rPr>
-        <w:t>nts.</w:t>
       </w:r>
     </w:p>
     <w:p>
@@ -938,20 +934,7 @@
           <w:sz w:val="16"/>
           <w:szCs w:val="16"/>
         </w:rPr>
-        <w:t>Freelance developer for a healthcare IT startup across six engagements,  focused on open-source solutions for medical records, billing, provider enrollment and claims. Projects included rapid prototyping and R&amp;D with academic and professional collaborations.</w:t>
-      </w:r>
-    </w:p>
-    <w:p>
-      <w:pPr>
-        <w:rPr>
-          <w:rFonts w:ascii="Arial" w:eastAsia="Times New Roman" w:hAnsi="Arial" w:cs="Arial"/>
-          <w:color w:val="1F4E79" w:themeColor="accent5" w:themeShade="80"/>
-          <w:sz w:val="16"/>
-          <w:szCs w:val="16"/>
-        </w:rPr>
-      </w:pPr>
-      <w:r>
-        <w:t>Note: Gaps between EMRTS engagements are covered by contracts listed below.</w:t>
+        <w:t>Software engineer working with a healthcare IT startup across six engagements, developing open-source tools for medical records, billing, provider enrollment, and claims. Work has centered on proof-of-concept development and R&amp;D, often in collaboration with academic and professional partners. Contracts listed below fill the gaps between EMRTS engagements.</w:t>
       </w:r>
     </w:p>
     <w:p>
@@ -1239,7 +1222,7 @@
           <w:sz w:val="16"/>
           <w:szCs w:val="16"/>
         </w:rPr>
-        <w:t xml:space="preserve">(Interim: </w:t>
+        <w:t>Interim contracts: CSpire, Jackson MS (Jul 2018–Jan 2019); Orchid Orthopedic Solutions, Remote (Feb 2020–Dec 2020); Quantuvos, Remote (Jul 2021–Feb 2022) — see entries below.</w:t>
       </w:r>
       <w:proofErr w:type="spellStart"/>
       <w:r>
@@ -1254,7 +1237,6 @@
           <w:sz w:val="16"/>
           <w:szCs w:val="16"/>
         </w:rPr>
-        <w:t>Cspire</w:t>
       </w:r>
       <w:proofErr w:type="spellEnd"/>
       <w:r>
@@ -1269,7 +1251,6 @@
           <w:sz w:val="16"/>
           <w:szCs w:val="16"/>
         </w:rPr>
-        <w:t xml:space="preserve"> contract July 2018-jam2019</w:t>
       </w:r>
       <w:r>
         <w:rPr>
@@ -1283,7 +1264,6 @@
           <w:sz w:val="16"/>
           <w:szCs w:val="16"/>
         </w:rPr>
-        <w:t xml:space="preserve">; Orchid Orthopedic Solutions, Feb 2020-Dec 2020; Quantuvos, Nov 2021 Feb-2022) </w:t>
       </w:r>
     </w:p>
     <w:p>
@@ -1668,7 +1648,7 @@
           <w:sz w:val="16"/>
           <w:szCs w:val="16"/>
         </w:rPr>
-        <w:t>(</w:t>
+        <w:t>Interim contracts: Hilton, Memphis TN (Apr 2012–Aug 2012); Lowes Inc., Mooresville NC (Aug 2012–Jun 2013) — see entries below.</w:t>
       </w:r>
       <w:r>
         <w:rPr>
@@ -1682,7 +1662,6 @@
           <w:sz w:val="16"/>
           <w:szCs w:val="16"/>
         </w:rPr>
-        <w:t>Interim: Hilton contract Apr 2012 Aug 2012 and Lowes Inc., Aug 2012-Jun2013)</w:t>
       </w:r>
     </w:p>
     <w:p>
@@ -1708,7 +1687,9 @@
           <w:sz w:val="16"/>
           <w:szCs w:val="16"/>
         </w:rPr>
-        <w:t>December</w:t>
+        <w:t>January 2012 – March 2012: Focused on electronic medical records, claims processing, and provider enrollment applications on GNU/Linux. Developed tools for handling JSON data and extended the application’s support for additional records processing.</w:t>
+        <w:br/>
+        <w:t>Tools: Python, Django, JavaScript (jQuery, Node.js) | Databases: MariaDB, PostgreSQL, Redis</w:t>
       </w:r>
       <w:r>
         <w:rPr>
@@ -1718,16 +1699,14 @@
           <w:sz w:val="16"/>
           <w:szCs w:val="16"/>
         </w:rPr>
-        <w:t xml:space="preserve"> 2011 – March 2012:</w:t>
-      </w:r>
-      <w:r>
-        <w:rPr>
-          <w:rFonts w:ascii="Arial" w:hAnsi="Arial" w:cs="Arial"/>
-          <w:color w:val="001279"/>
-          <w:sz w:val="16"/>
-          <w:szCs w:val="16"/>
-        </w:rPr>
-        <w:t xml:space="preserve"> Focused on electronic medical records, claims processing, and provider enrollment </w:t>
+      </w:r>
+      <w:r>
+        <w:rPr>
+          <w:rFonts w:ascii="Arial" w:hAnsi="Arial" w:cs="Arial"/>
+          <w:color w:val="001279"/>
+          <w:sz w:val="16"/>
+          <w:szCs w:val="16"/>
+        </w:rPr>
       </w:r>
       <w:bookmarkStart w:id="0" w:name="_GoBack"/>
       <w:r>
@@ -1737,16 +1716,14 @@
           <w:sz w:val="16"/>
           <w:szCs w:val="16"/>
         </w:rPr>
-        <w:t>applications on GNU/Linux. Developed tools for handling JSON data and extended the application’s support for</w:t>
-      </w:r>
-      <w:r>
-        <w:rPr>
-          <w:rFonts w:ascii="Arial" w:hAnsi="Arial" w:cs="Arial"/>
-          <w:color w:val="001279"/>
-          <w:sz w:val="16"/>
-          <w:szCs w:val="16"/>
-        </w:rPr>
-        <w:t xml:space="preserve"> </w:t>
+      </w:r>
+      <w:r>
+        <w:rPr>
+          <w:rFonts w:ascii="Arial" w:hAnsi="Arial" w:cs="Arial"/>
+          <w:color w:val="001279"/>
+          <w:sz w:val="16"/>
+          <w:szCs w:val="16"/>
+        </w:rPr>
       </w:r>
       <w:bookmarkEnd w:id="0"/>
       <w:r>
@@ -1756,16 +1733,14 @@
           <w:sz w:val="16"/>
           <w:szCs w:val="16"/>
         </w:rPr>
-        <w:t>additional records processing.</w:t>
-      </w:r>
-      <w:r>
-        <w:rPr>
-          <w:rFonts w:ascii="Arial" w:hAnsi="Arial" w:cs="Arial"/>
-          <w:color w:val="001279"/>
-          <w:sz w:val="16"/>
-          <w:szCs w:val="16"/>
-        </w:rPr>
-        <w:br/>
+      </w:r>
+      <w:r>
+        <w:rPr>
+          <w:rFonts w:ascii="Arial" w:hAnsi="Arial" w:cs="Arial"/>
+          <w:color w:val="001279"/>
+          <w:sz w:val="16"/>
+          <w:szCs w:val="16"/>
+        </w:rPr>
       </w:r>
       <w:r>
         <w:rPr>
@@ -1775,16 +1750,14 @@
           <w:sz w:val="16"/>
           <w:szCs w:val="16"/>
         </w:rPr>
-        <w:t>Tools:</w:t>
-      </w:r>
-      <w:r>
-        <w:rPr>
-          <w:rFonts w:ascii="Arial" w:hAnsi="Arial" w:cs="Arial"/>
-          <w:color w:val="001279"/>
-          <w:sz w:val="16"/>
-          <w:szCs w:val="16"/>
-        </w:rPr>
-        <w:t> Python, Django, JavaScript (jQuery, Node.js) | </w:t>
+      </w:r>
+      <w:r>
+        <w:rPr>
+          <w:rFonts w:ascii="Arial" w:hAnsi="Arial" w:cs="Arial"/>
+          <w:color w:val="001279"/>
+          <w:sz w:val="16"/>
+          <w:szCs w:val="16"/>
+        </w:rPr>
       </w:r>
       <w:r>
         <w:rPr>
@@ -1794,16 +1767,14 @@
           <w:sz w:val="16"/>
           <w:szCs w:val="16"/>
         </w:rPr>
-        <w:t>Databases:</w:t>
-      </w:r>
-      <w:r>
-        <w:rPr>
-          <w:rFonts w:ascii="Arial" w:hAnsi="Arial" w:cs="Arial"/>
-          <w:color w:val="001279"/>
-          <w:sz w:val="16"/>
-          <w:szCs w:val="16"/>
-        </w:rPr>
-        <w:t> MariaDB, PostgreSQL, Redis</w:t>
+      </w:r>
+      <w:r>
+        <w:rPr>
+          <w:rFonts w:ascii="Arial" w:hAnsi="Arial" w:cs="Arial"/>
+          <w:color w:val="001279"/>
+          <w:sz w:val="16"/>
+          <w:szCs w:val="16"/>
+        </w:rPr>
       </w:r>
     </w:p>
     <w:p>
@@ -1832,7 +1803,7 @@
           <w:sz w:val="16"/>
           <w:szCs w:val="16"/>
         </w:rPr>
-        <w:t>(Interim: Hewlett-Packard contract May 2010-Dec 2011)</w:t>
+        <w:t>Interim contract: Hewlett-Packard, Nashville TN (May 2010–Dec 2011) — see entry below.</w:t>
       </w:r>
     </w:p>
     <w:p>
@@ -2006,7 +1977,7 @@
           <w:sz w:val="16"/>
           <w:szCs w:val="16"/>
         </w:rPr>
-        <w:t>Remote | Nov 2021 – Feb 2022</w:t>
+        <w:t>Remote | Jul 2021 – Feb 2022</w:t>
       </w:r>
     </w:p>
     <w:p>
@@ -2028,7 +1999,7 @@
           <w:sz w:val="16"/>
           <w:szCs w:val="16"/>
         </w:rPr>
-        <w:t>T</w:t>
+        <w:t>Technical consulting for Quantuvos, a coaching-platform startup. Reviewed and evaluated code for the client-facing MVP, supporting coaches and clients in scheduling workshops and sessions. Performed code reviews, identified issues, and recommended improvements. Contract position.</w:t>
       </w:r>
       <w:r>
         <w:rPr>
@@ -2037,7 +2008,6 @@
           <w:sz w:val="16"/>
           <w:szCs w:val="16"/>
         </w:rPr>
-        <w:t xml:space="preserve">echnical consulting for Quantuvos, a coaching-platform startup. Reviewed and tested code for the MVP used by coaches and </w:t>
       </w:r>
       <w:r>
         <w:rPr>
@@ -2046,7 +2016,6 @@
           <w:sz w:val="16"/>
           <w:szCs w:val="16"/>
         </w:rPr>
-        <w:t>clients to schedule workshops and sessions. Performed code reviews, fixed issues, and recommended improvements to functionality.</w:t>
       </w:r>
       <w:r>
         <w:rPr>
@@ -2055,7 +2024,6 @@
           <w:sz w:val="16"/>
           <w:szCs w:val="16"/>
         </w:rPr>
-        <w:t xml:space="preserve"> </w:t>
       </w:r>
       <w:r>
         <w:rPr>
@@ -2066,7 +2034,6 @@
           <w:sz w:val="16"/>
           <w:szCs w:val="16"/>
         </w:rPr>
-        <w:t>Tech:</w:t>
       </w:r>
       <w:r>
         <w:rPr>
@@ -2075,7 +2042,6 @@
           <w:sz w:val="16"/>
           <w:szCs w:val="16"/>
         </w:rPr>
-        <w:t xml:space="preserve"> Python 3.9, Django 3.1, PostgreSQL 14.1, Docker</w:t>
       </w:r>
     </w:p>
     <w:p>
@@ -2189,7 +2155,7 @@
           <w:sz w:val="16"/>
           <w:szCs w:val="16"/>
         </w:rPr>
-        <w:t>C</w:t>
+        <w:t>Contract work preparing Word, Excel, and PDF documents for archival submission to EtQ Reliance. Programmatically inserted tags and formatting in Word documents and validated spreadsheet metadata for accuracy and completeness. Contract position.</w:t>
       </w:r>
       <w:r>
         <w:rPr>
@@ -2198,7 +2164,6 @@
           <w:sz w:val="16"/>
           <w:szCs w:val="16"/>
         </w:rPr>
-        <w:t>ontract for document processing and archival, preparing Word, Excel, and PDF files for submission to EtQ Reliance. Modified Word documents by inserting tags and formatting for archival requirements. Programmatically manipulated spreadsheet metadata to verify accuracy and completeness.</w:t>
       </w:r>
       <w:r>
         <w:rPr>
@@ -2207,7 +2172,6 @@
           <w:sz w:val="16"/>
           <w:szCs w:val="16"/>
         </w:rPr>
-        <w:t xml:space="preserve"> </w:t>
       </w:r>
       <w:r>
         <w:rPr>
@@ -2218,7 +2182,6 @@
           <w:sz w:val="16"/>
           <w:szCs w:val="16"/>
         </w:rPr>
-        <w:t>Tech:</w:t>
       </w:r>
       <w:r>
         <w:rPr>
@@ -2227,7 +2190,6 @@
           <w:sz w:val="16"/>
           <w:szCs w:val="16"/>
         </w:rPr>
-        <w:t xml:space="preserve"> Python 3.8, C# | Windows/macOS</w:t>
       </w:r>
     </w:p>
     <w:p>
@@ -2329,7 +2291,7 @@
           <w:sz w:val="16"/>
           <w:szCs w:val="16"/>
         </w:rPr>
-        <w:t>D</w:t>
+        <w:t>Led development of a RESTful auto-provisioning API for tracking and managing customer services delivered through CSpire and its third-party vendor partners. The application supported logging, reporting, and administration for both business office and network teams. Contract position.</w:t>
       </w:r>
       <w:r>
         <w:rPr>
@@ -2338,7 +2300,6 @@
           <w:sz w:val="16"/>
           <w:szCs w:val="16"/>
         </w:rPr>
-        <w:t>evelo</w:t>
       </w:r>
       <w:r>
         <w:rPr>
@@ -2347,7 +2308,6 @@
           <w:sz w:val="16"/>
           <w:szCs w:val="16"/>
         </w:rPr>
-        <w:t>ped</w:t>
       </w:r>
       <w:r>
         <w:rPr>
@@ -2356,7 +2316,6 @@
           <w:sz w:val="16"/>
           <w:szCs w:val="16"/>
         </w:rPr>
-        <w:t xml:space="preserve"> a RESTful auto-provisioning API for managing customer and vendor product and services data, tracking, logging, and reporting on customer services provided by </w:t>
       </w:r>
       <w:proofErr w:type="spellStart"/>
       <w:r>
@@ -2366,7 +2325,6 @@
           <w:sz w:val="16"/>
           <w:szCs w:val="16"/>
         </w:rPr>
-        <w:t>CSpire</w:t>
       </w:r>
       <w:proofErr w:type="spellEnd"/>
       <w:r>
@@ -2376,7 +2334,6 @@
           <w:sz w:val="16"/>
           <w:szCs w:val="16"/>
         </w:rPr>
-        <w:t xml:space="preserve"> and third-party vendors. The application supported both the business office and network system administrators. Contract position.</w:t>
       </w:r>
       <w:r>
         <w:rPr>
@@ -2385,7 +2342,6 @@
           <w:sz w:val="16"/>
           <w:szCs w:val="16"/>
         </w:rPr>
-        <w:t xml:space="preserve"> </w:t>
       </w:r>
       <w:r>
         <w:rPr>
@@ -2396,7 +2352,6 @@
           <w:sz w:val="16"/>
           <w:szCs w:val="16"/>
         </w:rPr>
-        <w:t>Tech:</w:t>
       </w:r>
       <w:r>
         <w:rPr>
@@ -2405,7 +2360,6 @@
           <w:sz w:val="16"/>
           <w:szCs w:val="16"/>
         </w:rPr>
-        <w:t xml:space="preserve"> Python 2.7, Flask, SQLAlchemy, MySQL, PostgreSQL</w:t>
       </w:r>
     </w:p>
     <w:p>
@@ -2490,7 +2444,7 @@
           <w:sz w:val="16"/>
           <w:szCs w:val="16"/>
         </w:rPr>
-        <w:t xml:space="preserve">Refactored and extended legacy C code to support the transition to EMV credit and debit card transactions. Tasks included code analysis, bug fixes, and documentation. Contract </w:t>
+        <w:t>Refactored and extended legacy C code to support EMV (chip-based credit and debit card) transaction processing as part of Lowe’s transition away from magnetic stripe. Work included code analysis, bug fixes, and documentation. Contract position.</w:t>
       </w:r>
       <w:proofErr w:type="spellStart"/>
       <w:r>
@@ -2499,17 +2453,15 @@
           <w:sz w:val="16"/>
           <w:szCs w:val="16"/>
         </w:rPr>
-        <w:t>position.</w:t>
-      </w:r>
-      <w:r>
-        <w:rPr>
-          <w:rFonts w:ascii="Arial" w:hAnsi="Arial" w:cs="Arial"/>
-          <w:b/>
-          <w:bCs/>
-          <w:sz w:val="16"/>
-          <w:szCs w:val="16"/>
-        </w:rPr>
-        <w:t>Tech</w:t>
+      </w:r>
+      <w:r>
+        <w:rPr>
+          <w:rFonts w:ascii="Arial" w:hAnsi="Arial" w:cs="Arial"/>
+          <w:b/>
+          <w:bCs/>
+          <w:sz w:val="16"/>
+          <w:szCs w:val="16"/>
+        </w:rPr>
       </w:r>
       <w:proofErr w:type="spellEnd"/>
       <w:r>
@@ -2520,15 +2472,13 @@
           <w:sz w:val="16"/>
           <w:szCs w:val="16"/>
         </w:rPr>
-        <w:t>:</w:t>
-      </w:r>
-      <w:r>
-        <w:rPr>
-          <w:rFonts w:ascii="Arial" w:hAnsi="Arial" w:cs="Arial"/>
-          <w:sz w:val="16"/>
-          <w:szCs w:val="16"/>
-        </w:rPr>
-        <w:t xml:space="preserve"> C, AIX, DB2, Oracle</w:t>
+      </w:r>
+      <w:r>
+        <w:rPr>
+          <w:rFonts w:ascii="Arial" w:hAnsi="Arial" w:cs="Arial"/>
+          <w:sz w:val="16"/>
+          <w:szCs w:val="16"/>
+        </w:rPr>
       </w:r>
     </w:p>
     <w:p/>
@@ -2902,7 +2852,7 @@
           <w:sz w:val="16"/>
           <w:szCs w:val="16"/>
         </w:rPr>
-        <w:t>Migrated MMIS (Medicaid Management Information System) software for TennCare from Hewlett-Packard’s infrastructure to ACS. Developed automation scripts and analyzed legacy C modules.</w:t>
+        <w:t>Migrated MMIS (Medicaid Management Information System) software for TennCare from Hewlett-Packard’s infrastructure to ACS. Developed automation scripts and analyzed legacy C modules. Contract position.</w:t>
       </w:r>
       <w:r>
         <w:rPr>
@@ -2911,7 +2861,6 @@
           <w:sz w:val="16"/>
           <w:szCs w:val="16"/>
         </w:rPr>
-        <w:t xml:space="preserve"> </w:t>
       </w:r>
       <w:r>
         <w:rPr>
@@ -2922,7 +2871,6 @@
           <w:sz w:val="16"/>
           <w:szCs w:val="16"/>
         </w:rPr>
-        <w:t>Tech:</w:t>
       </w:r>
       <w:r>
         <w:rPr>
@@ -2931,7 +2879,6 @@
           <w:sz w:val="16"/>
           <w:szCs w:val="16"/>
         </w:rPr>
-        <w:t xml:space="preserve"> C, Python 3, Unix</w:t>
       </w:r>
     </w:p>
     <w:p>
@@ -3122,33 +3069,30 @@
           <w:sz w:val="16"/>
           <w:szCs w:val="16"/>
         </w:rPr>
-        <w:t>Performed bug fixes, code analysis, and C code refactoring for high-end prototype printers designed for secure environments (government, military, finance). Developed Python scripts for daily integration testing. Contract position.</w:t>
-      </w:r>
-      <w:r>
-        <w:rPr>
-          <w:rFonts w:ascii="Arial" w:hAnsi="Arial" w:cs="Arial"/>
-          <w:sz w:val="16"/>
-          <w:szCs w:val="16"/>
-        </w:rPr>
-        <w:t xml:space="preserve"> </w:t>
-      </w:r>
-      <w:r>
-        <w:rPr>
-          <w:rFonts w:ascii="Arial" w:hAnsi="Arial" w:cs="Arial"/>
-          <w:b/>
-          <w:bCs/>
-          <w:sz w:val="16"/>
-          <w:szCs w:val="16"/>
-        </w:rPr>
-        <w:t>Tech:</w:t>
-      </w:r>
-      <w:r>
-        <w:rPr>
-          <w:rFonts w:ascii="Arial" w:hAnsi="Arial" w:cs="Arial"/>
-          <w:sz w:val="16"/>
-          <w:szCs w:val="16"/>
-        </w:rPr>
-        <w:t xml:space="preserve"> C, Python 2.6, RHEL</w:t>
+        <w:t>Bug fixes, code analysis, and refactoring of C code for high-end prototype printers designed for secure environments (government, military, finance). Developed Python scripts for daily integration testing. Contract position.</w:t>
+      </w:r>
+      <w:r>
+        <w:rPr>
+          <w:rFonts w:ascii="Arial" w:hAnsi="Arial" w:cs="Arial"/>
+          <w:sz w:val="16"/>
+          <w:szCs w:val="16"/>
+        </w:rPr>
+      </w:r>
+      <w:r>
+        <w:rPr>
+          <w:rFonts w:ascii="Arial" w:hAnsi="Arial" w:cs="Arial"/>
+          <w:b/>
+          <w:bCs/>
+          <w:sz w:val="16"/>
+          <w:szCs w:val="16"/>
+        </w:rPr>
+      </w:r>
+      <w:r>
+        <w:rPr>
+          <w:rFonts w:ascii="Arial" w:hAnsi="Arial" w:cs="Arial"/>
+          <w:sz w:val="16"/>
+          <w:szCs w:val="16"/>
+        </w:rPr>
       </w:r>
     </w:p>
     <w:p/>
@@ -3212,7 +3156,7 @@
           <w:sz w:val="16"/>
           <w:szCs w:val="16"/>
         </w:rPr>
-        <w:t xml:space="preserve">Developed tools for porting and rebuilding C/C++ applications originally developed in Microsoft Visual Studio for deployment in Unix environments. The approach leveraged residual artifacts generated by Visual Studio, rather than relying on traditional </w:t>
+        <w:t>Developed tools for porting and rebuilding C/C++ applications from Microsoft Visual Studio to Unix environments, using Visual Studio build artifacts rather than traditional makefile-based builds. Contract position.</w:t>
       </w:r>
       <w:proofErr w:type="spellStart"/>
       <w:r>
@@ -3221,7 +3165,6 @@
           <w:sz w:val="16"/>
           <w:szCs w:val="16"/>
         </w:rPr>
-        <w:t>makefile</w:t>
       </w:r>
       <w:proofErr w:type="spellEnd"/>
       <w:r>
@@ -3230,41 +3173,36 @@
           <w:sz w:val="16"/>
           <w:szCs w:val="16"/>
         </w:rPr>
-        <w:t>-based builds. Contract position.</w:t>
-      </w:r>
-      <w:r>
-        <w:rPr>
-          <w:rFonts w:ascii="Arial" w:hAnsi="Arial" w:cs="Arial"/>
-          <w:sz w:val="16"/>
-          <w:szCs w:val="16"/>
-        </w:rPr>
-        <w:t xml:space="preserve"> </w:t>
-      </w:r>
-      <w:r>
-        <w:rPr>
-          <w:rFonts w:ascii="Arial" w:hAnsi="Arial" w:cs="Arial"/>
-          <w:sz w:val="16"/>
-          <w:szCs w:val="16"/>
-        </w:rPr>
-        <w:t>T</w:t>
-      </w:r>
-      <w:r>
-        <w:rPr>
-          <w:rFonts w:ascii="Arial" w:hAnsi="Arial" w:cs="Arial"/>
-          <w:b/>
-          <w:bCs/>
-          <w:sz w:val="16"/>
-          <w:szCs w:val="16"/>
-        </w:rPr>
-        <w:t>ech:</w:t>
-      </w:r>
-      <w:r>
-        <w:rPr>
-          <w:rFonts w:ascii="Arial" w:hAnsi="Arial" w:cs="Arial"/>
-          <w:sz w:val="16"/>
-          <w:szCs w:val="16"/>
-        </w:rPr>
-        <w:t xml:space="preserve"> C/C++, macOS, Ubuntu Linux, Windows XP</w:t>
+      </w:r>
+      <w:r>
+        <w:rPr>
+          <w:rFonts w:ascii="Arial" w:hAnsi="Arial" w:cs="Arial"/>
+          <w:sz w:val="16"/>
+          <w:szCs w:val="16"/>
+        </w:rPr>
+      </w:r>
+      <w:r>
+        <w:rPr>
+          <w:rFonts w:ascii="Arial" w:hAnsi="Arial" w:cs="Arial"/>
+          <w:sz w:val="16"/>
+          <w:szCs w:val="16"/>
+        </w:rPr>
+      </w:r>
+      <w:r>
+        <w:rPr>
+          <w:rFonts w:ascii="Arial" w:hAnsi="Arial" w:cs="Arial"/>
+          <w:b/>
+          <w:bCs/>
+          <w:sz w:val="16"/>
+          <w:szCs w:val="16"/>
+        </w:rPr>
+      </w:r>
+      <w:r>
+        <w:rPr>
+          <w:rFonts w:ascii="Arial" w:hAnsi="Arial" w:cs="Arial"/>
+          <w:sz w:val="16"/>
+          <w:szCs w:val="16"/>
+        </w:rPr>
       </w:r>
     </w:p>
     <w:p/>
@@ -3558,33 +3496,30 @@
           <w:sz w:val="16"/>
           <w:szCs w:val="16"/>
         </w:rPr>
-        <w:t>Maintained and expanded the functionality of a legacy Perl application used for network-wide resource and account maintenance at the Oak Ridge and Los Alamos National Labs until it was replaced.</w:t>
-      </w:r>
-      <w:r>
-        <w:rPr>
-          <w:rFonts w:ascii="Arial" w:hAnsi="Arial" w:cs="Arial"/>
-          <w:sz w:val="16"/>
-          <w:szCs w:val="16"/>
-        </w:rPr>
-        <w:t xml:space="preserve"> </w:t>
-      </w:r>
-      <w:r>
-        <w:rPr>
-          <w:rFonts w:ascii="Arial" w:hAnsi="Arial" w:cs="Arial"/>
-          <w:b/>
-          <w:bCs/>
-          <w:sz w:val="16"/>
-          <w:szCs w:val="16"/>
-        </w:rPr>
-        <w:t>Tech:</w:t>
-      </w:r>
-      <w:r>
-        <w:rPr>
-          <w:rFonts w:ascii="Arial" w:hAnsi="Arial" w:cs="Arial"/>
-          <w:sz w:val="16"/>
-          <w:szCs w:val="16"/>
-        </w:rPr>
-        <w:t xml:space="preserve"> Perl, C, Oracle, Unix</w:t>
+        <w:t>Maintained and extended a legacy Perl application for network-wide resource and account management at Oak Ridge and Los Alamos National Laboratories until it was decommissioned.</w:t>
+      </w:r>
+      <w:r>
+        <w:rPr>
+          <w:rFonts w:ascii="Arial" w:hAnsi="Arial" w:cs="Arial"/>
+          <w:sz w:val="16"/>
+          <w:szCs w:val="16"/>
+        </w:rPr>
+      </w:r>
+      <w:r>
+        <w:rPr>
+          <w:rFonts w:ascii="Arial" w:hAnsi="Arial" w:cs="Arial"/>
+          <w:b/>
+          <w:bCs/>
+          <w:sz w:val="16"/>
+          <w:szCs w:val="16"/>
+        </w:rPr>
+      </w:r>
+      <w:r>
+        <w:rPr>
+          <w:rFonts w:ascii="Arial" w:hAnsi="Arial" w:cs="Arial"/>
+          <w:sz w:val="16"/>
+          <w:szCs w:val="16"/>
+        </w:rPr>
       </w:r>
     </w:p>
     <w:p/>
@@ -3629,7 +3564,7 @@
           <w:sz w:val="16"/>
           <w:szCs w:val="16"/>
         </w:rPr>
-        <w:t>Knoxville, TN | Aug 2002 – Oct 2003</w:t>
+        <w:t>Knoxville, TN | Aug 2002 – Dec 2002</w:t>
       </w:r>
       <w:r>
         <w:rPr>
@@ -3767,33 +3702,30 @@
           <w:sz w:val="16"/>
           <w:szCs w:val="16"/>
         </w:rPr>
-        <w:t>Performed code maintenance on a cross-platform warehouse management application written in C++ for Linux and Windows, with Linux as the primary platform.</w:t>
-      </w:r>
-      <w:r>
-        <w:rPr>
-          <w:rFonts w:ascii="Arial" w:hAnsi="Arial" w:cs="Arial"/>
-          <w:sz w:val="16"/>
-          <w:szCs w:val="16"/>
-        </w:rPr>
-        <w:t xml:space="preserve"> </w:t>
-      </w:r>
-      <w:r>
-        <w:rPr>
-          <w:rFonts w:ascii="Arial" w:hAnsi="Arial" w:cs="Arial"/>
-          <w:b/>
-          <w:bCs/>
-          <w:sz w:val="16"/>
-          <w:szCs w:val="16"/>
-        </w:rPr>
-        <w:t>Tech:</w:t>
-      </w:r>
-      <w:r>
-        <w:rPr>
-          <w:rFonts w:ascii="Arial" w:hAnsi="Arial" w:cs="Arial"/>
-          <w:sz w:val="16"/>
-          <w:szCs w:val="16"/>
-        </w:rPr>
-        <w:t xml:space="preserve"> C++, Oracle, Linux, Windows, MKS Toolkit, Microsoft Advanced Windows Server OS</w:t>
+        <w:t>Performed code maintenance on a cross-platform warehouse management system written in C++ for Linux and Windows. Contract position.</w:t>
+      </w:r>
+      <w:r>
+        <w:rPr>
+          <w:rFonts w:ascii="Arial" w:hAnsi="Arial" w:cs="Arial"/>
+          <w:sz w:val="16"/>
+          <w:szCs w:val="16"/>
+        </w:rPr>
+      </w:r>
+      <w:r>
+        <w:rPr>
+          <w:rFonts w:ascii="Arial" w:hAnsi="Arial" w:cs="Arial"/>
+          <w:b/>
+          <w:bCs/>
+          <w:sz w:val="16"/>
+          <w:szCs w:val="16"/>
+        </w:rPr>
+      </w:r>
+      <w:r>
+        <w:rPr>
+          <w:rFonts w:ascii="Arial" w:hAnsi="Arial" w:cs="Arial"/>
+          <w:sz w:val="16"/>
+          <w:szCs w:val="16"/>
+        </w:rPr>
       </w:r>
     </w:p>
     <w:p>

</xml_diff>

<commit_message>
Fix EMRTS bullet bold, color inconsistency, and Tools->Tech in docx
- resume.html: remove double-newlines before Tech: in bullets 2 and 5
  to prevent browsers rendering them as loose (bold-looking) list items
- style.css: unify summary color to var(--color-text); add global link
  color rule to prevent browser-default blue/purple
- update_resume_docx.py: add fix_emrts_bullet_formatting() to strip
  Strong character style from all EMRTS bullet runs and rename Tools:
  to Tech: (including split-run edge case)
- Resume.v3.7.docx: bold removed from EMRTS bullets, Tech: normalised
- Resume.v3.7.pdf: regenerated from updated docx
</commit_message>
<xml_diff>
--- a/static/files/Resume.v3.7.docx
+++ b/static/files/Resume.v3.7.docx
@@ -16,6 +16,8 @@
           <w:szCs w:val="18"/>
         </w:rPr>
       </w:pPr>
+      <w:bookmarkStart w:id="0" w:name="_GoBack"/>
+      <w:bookmarkEnd w:id="0"/>
       <w:r>
         <w:rPr>
           <w:rFonts w:ascii="Tahoma" w:hAnsi="Tahoma" w:cs="Tahoma"/>
@@ -171,38 +173,6 @@
           <w:szCs w:val="16"/>
         </w:rPr>
         <w:t>Thirty years of professional software development spanning telecommunications, warehousing, healthcare IT, and data systems. Primary focus has been backend engineering on Unix/Linux platforms, with experience across a broad range of languages, databases, and system architectures. More recent work includes web development, functional programming, and applied AI/prompt engineering. Proof-of-concept development — particularly in healthcare IT — has been a recurring part of the work, as has occasional intern mentoring.</w:t>
-      </w:r>
-      <w:r>
-        <w:rPr>
-          <w:rFonts w:ascii="Arial" w:hAnsi="Arial" w:cs="Arial"/>
-          <w:color w:val="002060"/>
-          <w:sz w:val="16"/>
-          <w:szCs w:val="16"/>
-        </w:rPr>
-      </w:r>
-      <w:r>
-        <w:rPr>
-          <w:rFonts w:ascii="Arial" w:hAnsi="Arial" w:cs="Arial"/>
-          <w:color w:val="002060"/>
-          <w:sz w:val="16"/>
-          <w:szCs w:val="16"/>
-        </w:rPr>
-      </w:r>
-      <w:r>
-        <w:rPr>
-          <w:rFonts w:ascii="Arial" w:hAnsi="Arial" w:cs="Arial"/>
-          <w:color w:val="002060"/>
-          <w:sz w:val="16"/>
-          <w:szCs w:val="16"/>
-        </w:rPr>
-      </w:r>
-      <w:r>
-        <w:rPr>
-          <w:rFonts w:ascii="Arial" w:hAnsi="Arial" w:cs="Arial"/>
-          <w:color w:val="002060"/>
-          <w:sz w:val="16"/>
-          <w:szCs w:val="16"/>
-        </w:rPr>
       </w:r>
     </w:p>
     <w:p>
@@ -958,8 +928,8 @@
       </w:pPr>
       <w:r>
         <w:rPr>
-          <w:rStyle w:val="Strong"/>
-          <w:rFonts w:ascii="Arial" w:hAnsi="Arial" w:cs="Arial"/>
+          <w:rFonts w:ascii="Arial" w:hAnsi="Arial" w:cs="Arial"/>
+          <w:b w:val="0"/>
           <w:color w:val="001279"/>
           <w:sz w:val="16"/>
           <w:szCs w:val="16"/>
@@ -968,8 +938,8 @@
       </w:r>
       <w:r>
         <w:rPr>
-          <w:rStyle w:val="Strong"/>
-          <w:rFonts w:ascii="Arial" w:hAnsi="Arial" w:cs="Arial"/>
+          <w:rFonts w:ascii="Arial" w:hAnsi="Arial" w:cs="Arial"/>
+          <w:b w:val="0"/>
           <w:color w:val="001279"/>
           <w:sz w:val="16"/>
           <w:szCs w:val="16"/>
@@ -978,8 +948,8 @@
       </w:r>
       <w:r>
         <w:rPr>
-          <w:rStyle w:val="Strong"/>
-          <w:rFonts w:ascii="Arial" w:hAnsi="Arial" w:cs="Arial"/>
+          <w:rFonts w:ascii="Arial" w:hAnsi="Arial" w:cs="Arial"/>
+          <w:b w:val="0"/>
           <w:color w:val="001279"/>
           <w:sz w:val="16"/>
           <w:szCs w:val="16"/>
@@ -988,7 +958,6 @@
       </w:r>
       <w:r>
         <w:rPr>
-          <w:rStyle w:val="Strong"/>
           <w:rFonts w:ascii="Arial" w:hAnsi="Arial" w:cs="Arial"/>
           <w:b w:val="0"/>
           <w:bCs w:val="0"/>
@@ -1000,7 +969,6 @@
       </w:r>
       <w:r>
         <w:rPr>
-          <w:rStyle w:val="Strong"/>
           <w:rFonts w:ascii="Arial" w:hAnsi="Arial" w:cs="Arial"/>
           <w:b w:val="0"/>
           <w:bCs w:val="0"/>
@@ -1012,7 +980,6 @@
       </w:r>
       <w:r>
         <w:rPr>
-          <w:rStyle w:val="Strong"/>
           <w:rFonts w:ascii="Arial" w:hAnsi="Arial" w:cs="Arial"/>
           <w:b w:val="0"/>
           <w:bCs w:val="0"/>
@@ -1024,7 +991,6 @@
       </w:r>
       <w:r>
         <w:rPr>
-          <w:rStyle w:val="Strong"/>
           <w:rFonts w:ascii="Arial" w:hAnsi="Arial" w:cs="Arial"/>
           <w:b w:val="0"/>
           <w:bCs w:val="0"/>
@@ -1036,7 +1002,6 @@
       </w:r>
       <w:r>
         <w:rPr>
-          <w:rStyle w:val="Strong"/>
           <w:rFonts w:ascii="Arial" w:hAnsi="Arial" w:cs="Arial"/>
           <w:b w:val="0"/>
           <w:bCs w:val="0"/>
@@ -1048,7 +1013,6 @@
       </w:r>
       <w:r>
         <w:rPr>
-          <w:rStyle w:val="Strong"/>
           <w:rFonts w:ascii="Arial" w:hAnsi="Arial" w:cs="Arial"/>
           <w:b w:val="0"/>
           <w:bCs w:val="0"/>
@@ -1060,7 +1024,6 @@
       </w:r>
       <w:r>
         <w:rPr>
-          <w:rStyle w:val="Strong"/>
           <w:rFonts w:ascii="Arial" w:hAnsi="Arial" w:cs="Arial"/>
           <w:b w:val="0"/>
           <w:bCs w:val="0"/>
@@ -1089,8 +1052,8 @@
       </w:pPr>
       <w:r>
         <w:rPr>
-          <w:rStyle w:val="Strong"/>
-          <w:rFonts w:ascii="Arial" w:hAnsi="Arial" w:cs="Arial"/>
+          <w:rFonts w:ascii="Arial" w:hAnsi="Arial" w:cs="Arial"/>
+          <w:b w:val="0"/>
           <w:color w:val="001279"/>
           <w:sz w:val="16"/>
           <w:szCs w:val="16"/>
@@ -1099,8 +1062,8 @@
       </w:r>
       <w:r>
         <w:rPr>
-          <w:rStyle w:val="Strong"/>
-          <w:rFonts w:ascii="Arial" w:hAnsi="Arial" w:cs="Arial"/>
+          <w:rFonts w:ascii="Arial" w:hAnsi="Arial" w:cs="Arial"/>
+          <w:b w:val="0"/>
           <w:color w:val="001279"/>
           <w:sz w:val="16"/>
           <w:szCs w:val="16"/>
@@ -1109,8 +1072,8 @@
       </w:r>
       <w:r>
         <w:rPr>
-          <w:rStyle w:val="Strong"/>
-          <w:rFonts w:ascii="Arial" w:hAnsi="Arial" w:cs="Arial"/>
+          <w:rFonts w:ascii="Arial" w:hAnsi="Arial" w:cs="Arial"/>
+          <w:b w:val="0"/>
           <w:color w:val="001279"/>
           <w:sz w:val="16"/>
           <w:szCs w:val="16"/>
@@ -1119,8 +1082,8 @@
       </w:r>
       <w:r>
         <w:rPr>
-          <w:rStyle w:val="Strong"/>
-          <w:rFonts w:ascii="Arial" w:hAnsi="Arial" w:cs="Arial"/>
+          <w:rFonts w:ascii="Arial" w:hAnsi="Arial" w:cs="Arial"/>
+          <w:b w:val="0"/>
           <w:color w:val="001279"/>
           <w:sz w:val="16"/>
           <w:szCs w:val="16"/>
@@ -1129,8 +1092,8 @@
       </w:r>
       <w:r>
         <w:rPr>
-          <w:rStyle w:val="Strong"/>
-          <w:rFonts w:ascii="Arial" w:hAnsi="Arial" w:cs="Arial"/>
+          <w:rFonts w:ascii="Arial" w:hAnsi="Arial" w:cs="Arial"/>
+          <w:b w:val="0"/>
           <w:color w:val="001279"/>
           <w:sz w:val="16"/>
           <w:szCs w:val="16"/>
@@ -1212,7 +1175,6 @@
       </w:pPr>
       <w:r>
         <w:rPr>
-          <w:rStyle w:val="Strong"/>
           <w:rFonts w:ascii="Arial" w:hAnsi="Arial" w:cs="Arial"/>
           <w:b w:val="0"/>
           <w:bCs w:val="0"/>
@@ -1223,47 +1185,6 @@
           <w:szCs w:val="16"/>
         </w:rPr>
         <w:t>Interim contracts: CSpire, Jackson MS (Jul 2018–Jan 2019); Orchid Orthopedic Solutions, Remote (Feb 2020–Dec 2020); Quantuvos, Remote (Jul 2021–Feb 2022) — see entries below.</w:t>
-      </w:r>
-      <w:proofErr w:type="spellStart"/>
-      <w:r>
-        <w:rPr>
-          <w:rStyle w:val="Strong"/>
-          <w:rFonts w:ascii="Arial" w:hAnsi="Arial" w:cs="Arial"/>
-          <w:b w:val="0"/>
-          <w:bCs w:val="0"/>
-          <w:i/>
-          <w:iCs/>
-          <w:color w:val="001279"/>
-          <w:sz w:val="16"/>
-          <w:szCs w:val="16"/>
-        </w:rPr>
-      </w:r>
-      <w:proofErr w:type="spellEnd"/>
-      <w:r>
-        <w:rPr>
-          <w:rStyle w:val="Strong"/>
-          <w:rFonts w:ascii="Arial" w:hAnsi="Arial" w:cs="Arial"/>
-          <w:b w:val="0"/>
-          <w:bCs w:val="0"/>
-          <w:i/>
-          <w:iCs/>
-          <w:color w:val="001279"/>
-          <w:sz w:val="16"/>
-          <w:szCs w:val="16"/>
-        </w:rPr>
-      </w:r>
-      <w:r>
-        <w:rPr>
-          <w:rStyle w:val="Strong"/>
-          <w:rFonts w:ascii="Arial" w:hAnsi="Arial" w:cs="Arial"/>
-          <w:b w:val="0"/>
-          <w:bCs w:val="0"/>
-          <w:i/>
-          <w:iCs/>
-          <w:color w:val="001279"/>
-          <w:sz w:val="16"/>
-          <w:szCs w:val="16"/>
-        </w:rPr>
       </w:r>
     </w:p>
     <w:p>
@@ -1284,8 +1205,8 @@
       </w:pPr>
       <w:r>
         <w:rPr>
-          <w:rStyle w:val="Strong"/>
-          <w:rFonts w:ascii="Arial" w:hAnsi="Arial" w:cs="Arial"/>
+          <w:rFonts w:ascii="Arial" w:hAnsi="Arial" w:cs="Arial"/>
+          <w:b w:val="0"/>
           <w:color w:val="001279"/>
           <w:sz w:val="16"/>
           <w:szCs w:val="16"/>
@@ -1312,13 +1233,13 @@
       </w:r>
       <w:r>
         <w:rPr>
-          <w:rStyle w:val="Strong"/>
-          <w:rFonts w:ascii="Arial" w:hAnsi="Arial" w:cs="Arial"/>
-          <w:color w:val="001279"/>
-          <w:sz w:val="16"/>
-          <w:szCs w:val="16"/>
-        </w:rPr>
-        <w:t>Tools:</w:t>
+          <w:rFonts w:ascii="Arial" w:hAnsi="Arial" w:cs="Arial"/>
+          <w:b w:val="0"/>
+          <w:color w:val="001279"/>
+          <w:sz w:val="16"/>
+          <w:szCs w:val="16"/>
+        </w:rPr>
+        <w:t>Tech:</w:t>
       </w:r>
       <w:r>
         <w:rPr>
@@ -1331,8 +1252,8 @@
       </w:r>
       <w:r>
         <w:rPr>
-          <w:rStyle w:val="Strong"/>
-          <w:rFonts w:ascii="Arial" w:hAnsi="Arial" w:cs="Arial"/>
+          <w:rFonts w:ascii="Arial" w:hAnsi="Arial" w:cs="Arial"/>
+          <w:b w:val="0"/>
           <w:color w:val="001279"/>
           <w:sz w:val="16"/>
           <w:szCs w:val="16"/>
@@ -1367,8 +1288,8 @@
       </w:pPr>
       <w:r>
         <w:rPr>
-          <w:rStyle w:val="Strong"/>
-          <w:rFonts w:ascii="Arial" w:hAnsi="Arial" w:cs="Arial"/>
+          <w:rFonts w:ascii="Arial" w:hAnsi="Arial" w:cs="Arial"/>
+          <w:b w:val="0"/>
           <w:color w:val="001279"/>
           <w:sz w:val="16"/>
           <w:szCs w:val="16"/>
@@ -1377,8 +1298,8 @@
       </w:r>
       <w:r>
         <w:rPr>
-          <w:rStyle w:val="Strong"/>
-          <w:rFonts w:ascii="Arial" w:hAnsi="Arial" w:cs="Arial"/>
+          <w:rFonts w:ascii="Arial" w:hAnsi="Arial" w:cs="Arial"/>
+          <w:b w:val="0"/>
           <w:color w:val="001279"/>
           <w:sz w:val="16"/>
           <w:szCs w:val="16"/>
@@ -1387,8 +1308,8 @@
       </w:r>
       <w:r>
         <w:rPr>
-          <w:rStyle w:val="Strong"/>
-          <w:rFonts w:ascii="Arial" w:hAnsi="Arial" w:cs="Arial"/>
+          <w:rFonts w:ascii="Arial" w:hAnsi="Arial" w:cs="Arial"/>
+          <w:b w:val="0"/>
           <w:color w:val="001279"/>
           <w:sz w:val="16"/>
           <w:szCs w:val="16"/>
@@ -1397,8 +1318,8 @@
       </w:r>
       <w:r>
         <w:rPr>
-          <w:rStyle w:val="Strong"/>
-          <w:rFonts w:ascii="Arial" w:hAnsi="Arial" w:cs="Arial"/>
+          <w:rFonts w:ascii="Arial" w:hAnsi="Arial" w:cs="Arial"/>
+          <w:b w:val="0"/>
           <w:color w:val="001279"/>
           <w:sz w:val="16"/>
           <w:szCs w:val="16"/>
@@ -1407,8 +1328,8 @@
       </w:r>
       <w:r>
         <w:rPr>
-          <w:rStyle w:val="Strong"/>
-          <w:rFonts w:ascii="Arial" w:hAnsi="Arial" w:cs="Arial"/>
+          <w:rFonts w:ascii="Arial" w:hAnsi="Arial" w:cs="Arial"/>
+          <w:b w:val="0"/>
           <w:color w:val="001279"/>
           <w:sz w:val="16"/>
           <w:szCs w:val="16"/>
@@ -1444,8 +1365,8 @@
       </w:r>
       <w:r>
         <w:rPr>
-          <w:rStyle w:val="Strong"/>
-          <w:rFonts w:ascii="Arial" w:hAnsi="Arial" w:cs="Arial"/>
+          <w:rFonts w:ascii="Arial" w:hAnsi="Arial" w:cs="Arial"/>
+          <w:b w:val="0"/>
           <w:color w:val="001279"/>
           <w:sz w:val="16"/>
           <w:szCs w:val="16"/>
@@ -1454,7 +1375,6 @@
       </w:r>
       <w:r>
         <w:rPr>
-          <w:rStyle w:val="Strong"/>
           <w:rFonts w:ascii="Arial" w:hAnsi="Arial" w:cs="Arial"/>
           <w:b w:val="0"/>
           <w:bCs w:val="0"/>
@@ -1466,7 +1386,6 @@
       </w:r>
       <w:r>
         <w:rPr>
-          <w:rStyle w:val="Strong"/>
           <w:rFonts w:ascii="Arial" w:hAnsi="Arial" w:cs="Arial"/>
           <w:b w:val="0"/>
           <w:bCs w:val="0"/>
@@ -1478,7 +1397,6 @@
       </w:r>
       <w:r>
         <w:rPr>
-          <w:rStyle w:val="Strong"/>
           <w:rFonts w:ascii="Arial" w:hAnsi="Arial" w:cs="Arial"/>
           <w:b w:val="0"/>
           <w:bCs w:val="0"/>
@@ -1490,8 +1408,8 @@
       </w:r>
       <w:r>
         <w:rPr>
-          <w:rStyle w:val="Strong"/>
-          <w:rFonts w:ascii="Arial" w:hAnsi="Arial" w:cs="Arial"/>
+          <w:rFonts w:ascii="Arial" w:hAnsi="Arial" w:cs="Arial"/>
+          <w:b w:val="0"/>
           <w:color w:val="001279"/>
           <w:sz w:val="16"/>
           <w:szCs w:val="16"/>
@@ -1500,8 +1418,8 @@
       </w:r>
       <w:r>
         <w:rPr>
-          <w:rStyle w:val="Strong"/>
-          <w:rFonts w:ascii="Arial" w:hAnsi="Arial" w:cs="Arial"/>
+          <w:rFonts w:ascii="Arial" w:hAnsi="Arial" w:cs="Arial"/>
+          <w:b w:val="0"/>
           <w:color w:val="001279"/>
           <w:sz w:val="16"/>
           <w:szCs w:val="16"/>
@@ -1510,8 +1428,8 @@
       </w:r>
       <w:r>
         <w:rPr>
-          <w:rStyle w:val="Strong"/>
-          <w:rFonts w:ascii="Arial" w:hAnsi="Arial" w:cs="Arial"/>
+          <w:rFonts w:ascii="Arial" w:hAnsi="Arial" w:cs="Arial"/>
+          <w:b w:val="0"/>
           <w:color w:val="001279"/>
           <w:sz w:val="16"/>
           <w:szCs w:val="16"/>
@@ -1520,7 +1438,6 @@
       </w:r>
       <w:r>
         <w:rPr>
-          <w:rStyle w:val="Strong"/>
           <w:rFonts w:ascii="Arial" w:hAnsi="Arial" w:cs="Arial"/>
           <w:b w:val="0"/>
           <w:bCs w:val="0"/>
@@ -1532,7 +1449,6 @@
       </w:r>
       <w:r>
         <w:rPr>
-          <w:rStyle w:val="Strong"/>
           <w:rFonts w:ascii="Arial" w:hAnsi="Arial" w:cs="Arial"/>
           <w:b w:val="0"/>
           <w:bCs w:val="0"/>
@@ -1544,8 +1460,8 @@
       </w:r>
       <w:r>
         <w:rPr>
-          <w:rStyle w:val="Strong"/>
-          <w:rFonts w:ascii="Arial" w:hAnsi="Arial" w:cs="Arial"/>
+          <w:rFonts w:ascii="Arial" w:hAnsi="Arial" w:cs="Arial"/>
+          <w:b w:val="0"/>
           <w:color w:val="001279"/>
           <w:sz w:val="16"/>
           <w:szCs w:val="16"/>
@@ -1554,18 +1470,18 @@
       </w:r>
       <w:r>
         <w:rPr>
-          <w:rStyle w:val="Strong"/>
-          <w:rFonts w:ascii="Arial" w:hAnsi="Arial" w:cs="Arial"/>
-          <w:color w:val="001279"/>
-          <w:sz w:val="16"/>
-          <w:szCs w:val="16"/>
-        </w:rPr>
-        <w:t>Tools</w:t>
-      </w:r>
-      <w:r>
-        <w:rPr>
-          <w:rStyle w:val="Strong"/>
-          <w:rFonts w:ascii="Arial" w:hAnsi="Arial" w:cs="Arial"/>
+          <w:rFonts w:ascii="Arial" w:hAnsi="Arial" w:cs="Arial"/>
+          <w:b w:val="0"/>
+          <w:color w:val="001279"/>
+          <w:sz w:val="16"/>
+          <w:szCs w:val="16"/>
+        </w:rPr>
+        <w:t>Tech</w:t>
+      </w:r>
+      <w:r>
+        <w:rPr>
+          <w:rFonts w:ascii="Arial" w:hAnsi="Arial" w:cs="Arial"/>
+          <w:b w:val="0"/>
           <w:color w:val="001279"/>
           <w:sz w:val="16"/>
           <w:szCs w:val="16"/>
@@ -1583,8 +1499,8 @@
       </w:r>
       <w:r>
         <w:rPr>
-          <w:rStyle w:val="Strong"/>
-          <w:rFonts w:ascii="Arial" w:hAnsi="Arial" w:cs="Arial"/>
+          <w:rFonts w:ascii="Arial" w:hAnsi="Arial" w:cs="Arial"/>
+          <w:b w:val="0"/>
           <w:color w:val="001279"/>
           <w:sz w:val="16"/>
           <w:szCs w:val="16"/>
@@ -1602,8 +1518,8 @@
       </w:r>
       <w:r>
         <w:rPr>
-          <w:rStyle w:val="Strong"/>
-          <w:rFonts w:ascii="Arial" w:hAnsi="Arial" w:cs="Arial"/>
+          <w:rFonts w:ascii="Arial" w:hAnsi="Arial" w:cs="Arial"/>
+          <w:b w:val="0"/>
           <w:color w:val="001279"/>
           <w:sz w:val="16"/>
           <w:szCs w:val="16"/>
@@ -1640,7 +1556,6 @@
       </w:pPr>
       <w:r>
         <w:rPr>
-          <w:rStyle w:val="Strong"/>
           <w:rFonts w:ascii="Arial" w:hAnsi="Arial" w:cs="Arial"/>
           <w:b w:val="0"/>
           <w:bCs w:val="0"/>
@@ -1649,19 +1564,6 @@
           <w:szCs w:val="16"/>
         </w:rPr>
         <w:t>Interim contracts: Hilton, Memphis TN (Apr 2012–Aug 2012); Lowes Inc., Mooresville NC (Aug 2012–Jun 2013) — see entries below.</w:t>
-      </w:r>
-      <w:r>
-        <w:rPr>
-          <w:rStyle w:val="Strong"/>
-          <w:rFonts w:ascii="Arial" w:hAnsi="Arial" w:cs="Arial"/>
-          <w:b w:val="0"/>
-          <w:bCs w:val="0"/>
-          <w:i/>
-          <w:iCs/>
-          <w:color w:val="001279"/>
-          <w:sz w:val="16"/>
-          <w:szCs w:val="16"/>
-        </w:rPr>
       </w:r>
     </w:p>
     <w:p>
@@ -1681,100 +1583,24 @@
       </w:pPr>
       <w:r>
         <w:rPr>
-          <w:rStyle w:val="Strong"/>
-          <w:rFonts w:ascii="Arial" w:hAnsi="Arial" w:cs="Arial"/>
+          <w:rFonts w:ascii="Arial" w:hAnsi="Arial" w:cs="Arial"/>
+          <w:b w:val="0"/>
           <w:color w:val="001279"/>
           <w:sz w:val="16"/>
           <w:szCs w:val="16"/>
         </w:rPr>
         <w:t>January 2012 – March 2012: Focused on electronic medical records, claims processing, and provider enrollment applications on GNU/Linux. Developed tools for handling JSON data and extended the application’s support for additional records processing.</w:t>
+      </w:r>
+      <w:r>
+        <w:rPr>
+          <w:rFonts w:ascii="Arial" w:hAnsi="Arial" w:cs="Arial"/>
+          <w:b w:val="0"/>
+          <w:color w:val="001279"/>
+          <w:sz w:val="16"/>
+          <w:szCs w:val="16"/>
+        </w:rPr>
         <w:br/>
-        <w:t>Tools: Python, Django, JavaScript (jQuery, Node.js) | Databases: MariaDB, PostgreSQL, Redis</w:t>
-      </w:r>
-      <w:r>
-        <w:rPr>
-          <w:rStyle w:val="Strong"/>
-          <w:rFonts w:ascii="Arial" w:hAnsi="Arial" w:cs="Arial"/>
-          <w:color w:val="001279"/>
-          <w:sz w:val="16"/>
-          <w:szCs w:val="16"/>
-        </w:rPr>
-      </w:r>
-      <w:r>
-        <w:rPr>
-          <w:rFonts w:ascii="Arial" w:hAnsi="Arial" w:cs="Arial"/>
-          <w:color w:val="001279"/>
-          <w:sz w:val="16"/>
-          <w:szCs w:val="16"/>
-        </w:rPr>
-      </w:r>
-      <w:bookmarkStart w:id="0" w:name="_GoBack"/>
-      <w:r>
-        <w:rPr>
-          <w:rFonts w:ascii="Arial" w:hAnsi="Arial" w:cs="Arial"/>
-          <w:color w:val="001279"/>
-          <w:sz w:val="16"/>
-          <w:szCs w:val="16"/>
-        </w:rPr>
-      </w:r>
-      <w:r>
-        <w:rPr>
-          <w:rFonts w:ascii="Arial" w:hAnsi="Arial" w:cs="Arial"/>
-          <w:color w:val="001279"/>
-          <w:sz w:val="16"/>
-          <w:szCs w:val="16"/>
-        </w:rPr>
-      </w:r>
-      <w:bookmarkEnd w:id="0"/>
-      <w:r>
-        <w:rPr>
-          <w:rFonts w:ascii="Arial" w:hAnsi="Arial" w:cs="Arial"/>
-          <w:color w:val="001279"/>
-          <w:sz w:val="16"/>
-          <w:szCs w:val="16"/>
-        </w:rPr>
-      </w:r>
-      <w:r>
-        <w:rPr>
-          <w:rFonts w:ascii="Arial" w:hAnsi="Arial" w:cs="Arial"/>
-          <w:color w:val="001279"/>
-          <w:sz w:val="16"/>
-          <w:szCs w:val="16"/>
-        </w:rPr>
-      </w:r>
-      <w:r>
-        <w:rPr>
-          <w:rStyle w:val="Strong"/>
-          <w:rFonts w:ascii="Arial" w:hAnsi="Arial" w:cs="Arial"/>
-          <w:color w:val="001279"/>
-          <w:sz w:val="16"/>
-          <w:szCs w:val="16"/>
-        </w:rPr>
-      </w:r>
-      <w:r>
-        <w:rPr>
-          <w:rFonts w:ascii="Arial" w:hAnsi="Arial" w:cs="Arial"/>
-          <w:color w:val="001279"/>
-          <w:sz w:val="16"/>
-          <w:szCs w:val="16"/>
-        </w:rPr>
-      </w:r>
-      <w:r>
-        <w:rPr>
-          <w:rStyle w:val="Strong"/>
-          <w:rFonts w:ascii="Arial" w:hAnsi="Arial" w:cs="Arial"/>
-          <w:color w:val="001279"/>
-          <w:sz w:val="16"/>
-          <w:szCs w:val="16"/>
-        </w:rPr>
-      </w:r>
-      <w:r>
-        <w:rPr>
-          <w:rFonts w:ascii="Arial" w:hAnsi="Arial" w:cs="Arial"/>
-          <w:color w:val="001279"/>
-          <w:sz w:val="16"/>
-          <w:szCs w:val="16"/>
-        </w:rPr>
+        <w:t>Tech: Python, Django, JavaScript (jQuery, Node.js) | Databases: MariaDB, PostgreSQL, Redis</w:t>
       </w:r>
     </w:p>
     <w:p>
@@ -1824,8 +1650,8 @@
       </w:pPr>
       <w:r>
         <w:rPr>
-          <w:rStyle w:val="Strong"/>
-          <w:rFonts w:ascii="Arial" w:hAnsi="Arial" w:cs="Arial"/>
+          <w:rFonts w:ascii="Arial" w:hAnsi="Arial" w:cs="Arial"/>
+          <w:b w:val="0"/>
           <w:color w:val="001279"/>
           <w:sz w:val="16"/>
           <w:szCs w:val="16"/>
@@ -1852,13 +1678,13 @@
       </w:r>
       <w:r>
         <w:rPr>
-          <w:rStyle w:val="Strong"/>
-          <w:rFonts w:ascii="Arial" w:hAnsi="Arial" w:cs="Arial"/>
-          <w:color w:val="001279"/>
-          <w:sz w:val="16"/>
-          <w:szCs w:val="16"/>
-        </w:rPr>
-        <w:t>Tools:</w:t>
+          <w:rFonts w:ascii="Arial" w:hAnsi="Arial" w:cs="Arial"/>
+          <w:b w:val="0"/>
+          <w:color w:val="001279"/>
+          <w:sz w:val="16"/>
+          <w:szCs w:val="16"/>
+        </w:rPr>
+        <w:t>Tech:</w:t>
       </w:r>
       <w:r>
         <w:rPr>
@@ -1871,8 +1697,8 @@
       </w:r>
       <w:r>
         <w:rPr>
-          <w:rStyle w:val="Strong"/>
-          <w:rFonts w:ascii="Arial" w:hAnsi="Arial" w:cs="Arial"/>
+          <w:rFonts w:ascii="Arial" w:hAnsi="Arial" w:cs="Arial"/>
+          <w:b w:val="0"/>
           <w:color w:val="001279"/>
           <w:sz w:val="16"/>
           <w:szCs w:val="16"/>
@@ -2000,48 +1826,6 @@
           <w:szCs w:val="16"/>
         </w:rPr>
         <w:t>Technical consulting for Quantuvos, a coaching-platform startup. Reviewed and evaluated code for the client-facing MVP, supporting coaches and clients in scheduling workshops and sessions. Performed code reviews, identified issues, and recommended improvements. Contract position.</w:t>
-      </w:r>
-      <w:r>
-        <w:rPr>
-          <w:rFonts w:ascii="Arial" w:hAnsi="Arial" w:cs="Arial"/>
-          <w:color w:val="002060"/>
-          <w:sz w:val="16"/>
-          <w:szCs w:val="16"/>
-        </w:rPr>
-      </w:r>
-      <w:r>
-        <w:rPr>
-          <w:rFonts w:ascii="Arial" w:hAnsi="Arial" w:cs="Arial"/>
-          <w:color w:val="7030A0"/>
-          <w:sz w:val="16"/>
-          <w:szCs w:val="16"/>
-        </w:rPr>
-      </w:r>
-      <w:r>
-        <w:rPr>
-          <w:rFonts w:ascii="Arial" w:hAnsi="Arial" w:cs="Arial"/>
-          <w:color w:val="7030A0"/>
-          <w:sz w:val="16"/>
-          <w:szCs w:val="16"/>
-        </w:rPr>
-      </w:r>
-      <w:r>
-        <w:rPr>
-          <w:rFonts w:ascii="Arial" w:hAnsi="Arial" w:cs="Arial"/>
-          <w:b/>
-          <w:bCs/>
-          <w:color w:val="7030A0"/>
-          <w:sz w:val="16"/>
-          <w:szCs w:val="16"/>
-        </w:rPr>
-      </w:r>
-      <w:r>
-        <w:rPr>
-          <w:rFonts w:ascii="Arial" w:hAnsi="Arial" w:cs="Arial"/>
-          <w:color w:val="7030A0"/>
-          <w:sz w:val="16"/>
-          <w:szCs w:val="16"/>
-        </w:rPr>
       </w:r>
     </w:p>
     <w:p>
@@ -2157,40 +1941,6 @@
         </w:rPr>
         <w:t>Contract work preparing Word, Excel, and PDF documents for archival submission to EtQ Reliance. Programmatically inserted tags and formatting in Word documents and validated spreadsheet metadata for accuracy and completeness. Contract position.</w:t>
       </w:r>
-      <w:r>
-        <w:rPr>
-          <w:rFonts w:ascii="Arial" w:hAnsi="Arial" w:cs="Arial"/>
-          <w:color w:val="002060"/>
-          <w:sz w:val="16"/>
-          <w:szCs w:val="16"/>
-        </w:rPr>
-      </w:r>
-      <w:r>
-        <w:rPr>
-          <w:rFonts w:ascii="Arial" w:hAnsi="Arial" w:cs="Arial"/>
-          <w:color w:val="002060"/>
-          <w:sz w:val="16"/>
-          <w:szCs w:val="16"/>
-        </w:rPr>
-      </w:r>
-      <w:r>
-        <w:rPr>
-          <w:rFonts w:ascii="Arial" w:hAnsi="Arial" w:cs="Arial"/>
-          <w:b/>
-          <w:bCs/>
-          <w:color w:val="002060"/>
-          <w:sz w:val="16"/>
-          <w:szCs w:val="16"/>
-        </w:rPr>
-      </w:r>
-      <w:r>
-        <w:rPr>
-          <w:rFonts w:ascii="Arial" w:hAnsi="Arial" w:cs="Arial"/>
-          <w:color w:val="002060"/>
-          <w:sz w:val="16"/>
-          <w:szCs w:val="16"/>
-        </w:rPr>
-      </w:r>
     </w:p>
     <w:p>
       <w:pPr>
@@ -2293,74 +2043,6 @@
         </w:rPr>
         <w:t>Led development of a RESTful auto-provisioning API for tracking and managing customer services delivered through CSpire and its third-party vendor partners. The application supported logging, reporting, and administration for both business office and network teams. Contract position.</w:t>
       </w:r>
-      <w:r>
-        <w:rPr>
-          <w:rFonts w:ascii="Arial" w:hAnsi="Arial" w:cs="Arial"/>
-          <w:color w:val="002060"/>
-          <w:sz w:val="16"/>
-          <w:szCs w:val="16"/>
-        </w:rPr>
-      </w:r>
-      <w:r>
-        <w:rPr>
-          <w:rFonts w:ascii="Arial" w:hAnsi="Arial" w:cs="Arial"/>
-          <w:color w:val="002060"/>
-          <w:sz w:val="16"/>
-          <w:szCs w:val="16"/>
-        </w:rPr>
-      </w:r>
-      <w:r>
-        <w:rPr>
-          <w:rFonts w:ascii="Arial" w:hAnsi="Arial" w:cs="Arial"/>
-          <w:color w:val="002060"/>
-          <w:sz w:val="16"/>
-          <w:szCs w:val="16"/>
-        </w:rPr>
-      </w:r>
-      <w:proofErr w:type="spellStart"/>
-      <w:r>
-        <w:rPr>
-          <w:rFonts w:ascii="Arial" w:hAnsi="Arial" w:cs="Arial"/>
-          <w:color w:val="002060"/>
-          <w:sz w:val="16"/>
-          <w:szCs w:val="16"/>
-        </w:rPr>
-      </w:r>
-      <w:proofErr w:type="spellEnd"/>
-      <w:r>
-        <w:rPr>
-          <w:rFonts w:ascii="Arial" w:hAnsi="Arial" w:cs="Arial"/>
-          <w:color w:val="002060"/>
-          <w:sz w:val="16"/>
-          <w:szCs w:val="16"/>
-        </w:rPr>
-      </w:r>
-      <w:r>
-        <w:rPr>
-          <w:rFonts w:ascii="Arial" w:hAnsi="Arial" w:cs="Arial"/>
-          <w:color w:val="002060"/>
-          <w:sz w:val="16"/>
-          <w:szCs w:val="16"/>
-        </w:rPr>
-      </w:r>
-      <w:r>
-        <w:rPr>
-          <w:rFonts w:ascii="Arial" w:hAnsi="Arial" w:cs="Arial"/>
-          <w:b/>
-          <w:bCs/>
-          <w:color w:val="002060"/>
-          <w:sz w:val="16"/>
-          <w:szCs w:val="16"/>
-        </w:rPr>
-      </w:r>
-      <w:r>
-        <w:rPr>
-          <w:rFonts w:ascii="Arial" w:hAnsi="Arial" w:cs="Arial"/>
-          <w:color w:val="002060"/>
-          <w:sz w:val="16"/>
-          <w:szCs w:val="16"/>
-        </w:rPr>
-      </w:r>
     </w:p>
     <w:p>
       <w:pPr>
@@ -2446,40 +2128,6 @@
         </w:rPr>
         <w:t>Refactored and extended legacy C code to support EMV (chip-based credit and debit card) transaction processing as part of Lowe’s transition away from magnetic stripe. Work included code analysis, bug fixes, and documentation. Contract position.</w:t>
       </w:r>
-      <w:proofErr w:type="spellStart"/>
-      <w:r>
-        <w:rPr>
-          <w:rFonts w:ascii="Arial" w:hAnsi="Arial" w:cs="Arial"/>
-          <w:sz w:val="16"/>
-          <w:szCs w:val="16"/>
-        </w:rPr>
-      </w:r>
-      <w:r>
-        <w:rPr>
-          <w:rFonts w:ascii="Arial" w:hAnsi="Arial" w:cs="Arial"/>
-          <w:b/>
-          <w:bCs/>
-          <w:sz w:val="16"/>
-          <w:szCs w:val="16"/>
-        </w:rPr>
-      </w:r>
-      <w:proofErr w:type="spellEnd"/>
-      <w:r>
-        <w:rPr>
-          <w:rFonts w:ascii="Arial" w:hAnsi="Arial" w:cs="Arial"/>
-          <w:b/>
-          <w:bCs/>
-          <w:sz w:val="16"/>
-          <w:szCs w:val="16"/>
-        </w:rPr>
-      </w:r>
-      <w:r>
-        <w:rPr>
-          <w:rFonts w:ascii="Arial" w:hAnsi="Arial" w:cs="Arial"/>
-          <w:sz w:val="16"/>
-          <w:szCs w:val="16"/>
-        </w:rPr>
-      </w:r>
     </w:p>
     <w:p/>
     <w:p>
@@ -2853,32 +2501,6 @@
           <w:szCs w:val="16"/>
         </w:rPr>
         <w:t>Migrated MMIS (Medicaid Management Information System) software for TennCare from Hewlett-Packard’s infrastructure to ACS. Developed automation scripts and analyzed legacy C modules. Contract position.</w:t>
-      </w:r>
-      <w:r>
-        <w:rPr>
-          <w:rFonts w:ascii="Arial" w:hAnsi="Arial" w:cs="Arial"/>
-          <w:color w:val="002060"/>
-          <w:sz w:val="16"/>
-          <w:szCs w:val="16"/>
-        </w:rPr>
-      </w:r>
-      <w:r>
-        <w:rPr>
-          <w:rFonts w:ascii="Arial" w:hAnsi="Arial" w:cs="Arial"/>
-          <w:b/>
-          <w:bCs/>
-          <w:color w:val="002060"/>
-          <w:sz w:val="16"/>
-          <w:szCs w:val="16"/>
-        </w:rPr>
-      </w:r>
-      <w:r>
-        <w:rPr>
-          <w:rFonts w:ascii="Arial" w:hAnsi="Arial" w:cs="Arial"/>
-          <w:color w:val="002060"/>
-          <w:sz w:val="16"/>
-          <w:szCs w:val="16"/>
-        </w:rPr>
       </w:r>
     </w:p>
     <w:p>
@@ -3071,29 +2693,6 @@
         </w:rPr>
         <w:t>Bug fixes, code analysis, and refactoring of C code for high-end prototype printers designed for secure environments (government, military, finance). Developed Python scripts for daily integration testing. Contract position.</w:t>
       </w:r>
-      <w:r>
-        <w:rPr>
-          <w:rFonts w:ascii="Arial" w:hAnsi="Arial" w:cs="Arial"/>
-          <w:sz w:val="16"/>
-          <w:szCs w:val="16"/>
-        </w:rPr>
-      </w:r>
-      <w:r>
-        <w:rPr>
-          <w:rFonts w:ascii="Arial" w:hAnsi="Arial" w:cs="Arial"/>
-          <w:b/>
-          <w:bCs/>
-          <w:sz w:val="16"/>
-          <w:szCs w:val="16"/>
-        </w:rPr>
-      </w:r>
-      <w:r>
-        <w:rPr>
-          <w:rFonts w:ascii="Arial" w:hAnsi="Arial" w:cs="Arial"/>
-          <w:sz w:val="16"/>
-          <w:szCs w:val="16"/>
-        </w:rPr>
-      </w:r>
     </w:p>
     <w:p/>
     <w:p>
@@ -3115,116 +2714,70 @@
           <w:sz w:val="16"/>
           <w:szCs w:val="16"/>
         </w:rPr>
+        <w:t>IBM Internet Security Systems</w:t>
+      </w:r>
+    </w:p>
+    <w:p>
+      <w:pPr>
+        <w:pStyle w:val="Heading3"/>
+        <w:rPr>
+          <w:rFonts w:ascii="Arial" w:hAnsi="Arial" w:cs="Arial"/>
+          <w:b/>
+          <w:bCs/>
+          <w:sz w:val="16"/>
+          <w:szCs w:val="16"/>
+        </w:rPr>
+      </w:pPr>
+      <w:r>
+        <w:rPr>
+          <w:rFonts w:ascii="Arial" w:hAnsi="Arial" w:cs="Arial"/>
+          <w:b/>
+          <w:bCs/>
+          <w:sz w:val="16"/>
+          <w:szCs w:val="16"/>
+        </w:rPr>
+        <w:t>Atlanta, GA | Jan 2007 – May 2007</w:t>
+      </w:r>
+    </w:p>
+    <w:p>
+      <w:pPr>
+        <w:pStyle w:val="Heading3"/>
+        <w:rPr>
+          <w:rFonts w:ascii="Arial" w:hAnsi="Arial" w:cs="Arial"/>
+          <w:sz w:val="16"/>
+          <w:szCs w:val="16"/>
+        </w:rPr>
+      </w:pPr>
+      <w:r>
+        <w:rPr>
+          <w:rFonts w:ascii="Arial" w:hAnsi="Arial" w:cs="Arial"/>
+          <w:sz w:val="16"/>
+          <w:szCs w:val="16"/>
+        </w:rPr>
+        <w:t>Developed tools for porting and rebuilding C/C++ applications from Microsoft Visual Studio to Unix environments, using Visual Studio build artifacts rather than traditional makefile-based builds. Contract position.</w:t>
+      </w:r>
+    </w:p>
+    <w:p/>
+    <w:p>
+      <w:pPr>
+        <w:pStyle w:val="Heading3"/>
+        <w:rPr>
+          <w:rFonts w:ascii="Arial" w:hAnsi="Arial" w:cs="Arial"/>
+          <w:b/>
+          <w:bCs/>
+          <w:sz w:val="16"/>
+          <w:szCs w:val="16"/>
+        </w:rPr>
+      </w:pPr>
+      <w:r>
+        <w:rPr>
+          <w:rFonts w:ascii="Arial" w:hAnsi="Arial" w:cs="Arial"/>
+          <w:b/>
+          <w:bCs/>
+          <w:sz w:val="16"/>
+          <w:szCs w:val="16"/>
+        </w:rPr>
         <w:lastRenderedPageBreak/>
-        <w:t>IBM Internet Security Systems</w:t>
-      </w:r>
-    </w:p>
-    <w:p>
-      <w:pPr>
-        <w:pStyle w:val="Heading3"/>
-        <w:rPr>
-          <w:rFonts w:ascii="Arial" w:hAnsi="Arial" w:cs="Arial"/>
-          <w:b/>
-          <w:bCs/>
-          <w:sz w:val="16"/>
-          <w:szCs w:val="16"/>
-        </w:rPr>
-      </w:pPr>
-      <w:r>
-        <w:rPr>
-          <w:rFonts w:ascii="Arial" w:hAnsi="Arial" w:cs="Arial"/>
-          <w:b/>
-          <w:bCs/>
-          <w:sz w:val="16"/>
-          <w:szCs w:val="16"/>
-        </w:rPr>
-        <w:t>Atlanta, GA | Jan 2007 – May 2007</w:t>
-      </w:r>
-    </w:p>
-    <w:p>
-      <w:pPr>
-        <w:pStyle w:val="Heading3"/>
-        <w:rPr>
-          <w:rFonts w:ascii="Arial" w:hAnsi="Arial" w:cs="Arial"/>
-          <w:sz w:val="16"/>
-          <w:szCs w:val="16"/>
-        </w:rPr>
-      </w:pPr>
-      <w:r>
-        <w:rPr>
-          <w:rFonts w:ascii="Arial" w:hAnsi="Arial" w:cs="Arial"/>
-          <w:sz w:val="16"/>
-          <w:szCs w:val="16"/>
-        </w:rPr>
-        <w:t>Developed tools for porting and rebuilding C/C++ applications from Microsoft Visual Studio to Unix environments, using Visual Studio build artifacts rather than traditional makefile-based builds. Contract position.</w:t>
-      </w:r>
-      <w:proofErr w:type="spellStart"/>
-      <w:r>
-        <w:rPr>
-          <w:rFonts w:ascii="Arial" w:hAnsi="Arial" w:cs="Arial"/>
-          <w:sz w:val="16"/>
-          <w:szCs w:val="16"/>
-        </w:rPr>
-      </w:r>
-      <w:proofErr w:type="spellEnd"/>
-      <w:r>
-        <w:rPr>
-          <w:rFonts w:ascii="Arial" w:hAnsi="Arial" w:cs="Arial"/>
-          <w:sz w:val="16"/>
-          <w:szCs w:val="16"/>
-        </w:rPr>
-      </w:r>
-      <w:r>
-        <w:rPr>
-          <w:rFonts w:ascii="Arial" w:hAnsi="Arial" w:cs="Arial"/>
-          <w:sz w:val="16"/>
-          <w:szCs w:val="16"/>
-        </w:rPr>
-      </w:r>
-      <w:r>
-        <w:rPr>
-          <w:rFonts w:ascii="Arial" w:hAnsi="Arial" w:cs="Arial"/>
-          <w:sz w:val="16"/>
-          <w:szCs w:val="16"/>
-        </w:rPr>
-      </w:r>
-      <w:r>
-        <w:rPr>
-          <w:rFonts w:ascii="Arial" w:hAnsi="Arial" w:cs="Arial"/>
-          <w:b/>
-          <w:bCs/>
-          <w:sz w:val="16"/>
-          <w:szCs w:val="16"/>
-        </w:rPr>
-      </w:r>
-      <w:r>
-        <w:rPr>
-          <w:rFonts w:ascii="Arial" w:hAnsi="Arial" w:cs="Arial"/>
-          <w:sz w:val="16"/>
-          <w:szCs w:val="16"/>
-        </w:rPr>
-      </w:r>
-    </w:p>
-    <w:p/>
-    <w:p>
-      <w:pPr>
-        <w:pStyle w:val="Heading3"/>
-        <w:rPr>
-          <w:rFonts w:ascii="Arial" w:hAnsi="Arial" w:cs="Arial"/>
-          <w:b/>
-          <w:bCs/>
-          <w:sz w:val="16"/>
-          <w:szCs w:val="16"/>
-        </w:rPr>
-      </w:pPr>
-      <w:r>
-        <w:rPr>
-          <w:rFonts w:ascii="Arial" w:hAnsi="Arial" w:cs="Arial"/>
-          <w:b/>
-          <w:bCs/>
-          <w:sz w:val="16"/>
-          <w:szCs w:val="16"/>
-        </w:rPr>
         <w:t>Lowe’s Inc.</w:t>
       </w:r>
     </w:p>
@@ -3498,29 +3051,6 @@
         </w:rPr>
         <w:t>Maintained and extended a legacy Perl application for network-wide resource and account management at Oak Ridge and Los Alamos National Laboratories until it was decommissioned.</w:t>
       </w:r>
-      <w:r>
-        <w:rPr>
-          <w:rFonts w:ascii="Arial" w:hAnsi="Arial" w:cs="Arial"/>
-          <w:sz w:val="16"/>
-          <w:szCs w:val="16"/>
-        </w:rPr>
-      </w:r>
-      <w:r>
-        <w:rPr>
-          <w:rFonts w:ascii="Arial" w:hAnsi="Arial" w:cs="Arial"/>
-          <w:b/>
-          <w:bCs/>
-          <w:sz w:val="16"/>
-          <w:szCs w:val="16"/>
-        </w:rPr>
-      </w:r>
-      <w:r>
-        <w:rPr>
-          <w:rFonts w:ascii="Arial" w:hAnsi="Arial" w:cs="Arial"/>
-          <w:sz w:val="16"/>
-          <w:szCs w:val="16"/>
-        </w:rPr>
-      </w:r>
     </w:p>
     <w:p/>
     <w:p>
@@ -3703,29 +3233,6 @@
           <w:szCs w:val="16"/>
         </w:rPr>
         <w:t>Performed code maintenance on a cross-platform warehouse management system written in C++ for Linux and Windows. Contract position.</w:t>
-      </w:r>
-      <w:r>
-        <w:rPr>
-          <w:rFonts w:ascii="Arial" w:hAnsi="Arial" w:cs="Arial"/>
-          <w:sz w:val="16"/>
-          <w:szCs w:val="16"/>
-        </w:rPr>
-      </w:r>
-      <w:r>
-        <w:rPr>
-          <w:rFonts w:ascii="Arial" w:hAnsi="Arial" w:cs="Arial"/>
-          <w:b/>
-          <w:bCs/>
-          <w:sz w:val="16"/>
-          <w:szCs w:val="16"/>
-        </w:rPr>
-      </w:r>
-      <w:r>
-        <w:rPr>
-          <w:rFonts w:ascii="Arial" w:hAnsi="Arial" w:cs="Arial"/>
-          <w:sz w:val="16"/>
-          <w:szCs w:val="16"/>
-        </w:rPr>
       </w:r>
     </w:p>
     <w:p>

</xml_diff>

<commit_message>
Update resume docx and pdf files
</commit_message>
<xml_diff>
--- a/static/files/Resume.v3.7.docx
+++ b/static/files/Resume.v3.7.docx
@@ -16,8 +16,6 @@
           <w:szCs w:val="18"/>
         </w:rPr>
       </w:pPr>
-      <w:bookmarkStart w:id="0" w:name="_GoBack"/>
-      <w:bookmarkEnd w:id="0"/>
       <w:r>
         <w:rPr>
           <w:rFonts w:ascii="Tahoma" w:hAnsi="Tahoma" w:cs="Tahoma"/>
@@ -929,7 +927,6 @@
       <w:r>
         <w:rPr>
           <w:rFonts w:ascii="Arial" w:hAnsi="Arial" w:cs="Arial"/>
-          <w:b w:val="0"/>
           <w:color w:val="001279"/>
           <w:sz w:val="16"/>
           <w:szCs w:val="16"/>
@@ -939,7 +936,6 @@
       <w:r>
         <w:rPr>
           <w:rFonts w:ascii="Arial" w:hAnsi="Arial" w:cs="Arial"/>
-          <w:b w:val="0"/>
           <w:color w:val="001279"/>
           <w:sz w:val="16"/>
           <w:szCs w:val="16"/>
@@ -949,7 +945,6 @@
       <w:r>
         <w:rPr>
           <w:rFonts w:ascii="Arial" w:hAnsi="Arial" w:cs="Arial"/>
-          <w:b w:val="0"/>
           <w:color w:val="001279"/>
           <w:sz w:val="16"/>
           <w:szCs w:val="16"/>
@@ -959,8 +954,6 @@
       <w:r>
         <w:rPr>
           <w:rFonts w:ascii="Arial" w:hAnsi="Arial" w:cs="Arial"/>
-          <w:b w:val="0"/>
-          <w:bCs w:val="0"/>
           <w:color w:val="001279"/>
           <w:sz w:val="16"/>
           <w:szCs w:val="16"/>
@@ -970,8 +963,6 @@
       <w:r>
         <w:rPr>
           <w:rFonts w:ascii="Arial" w:hAnsi="Arial" w:cs="Arial"/>
-          <w:b w:val="0"/>
-          <w:bCs w:val="0"/>
           <w:color w:val="001279"/>
           <w:sz w:val="16"/>
           <w:szCs w:val="16"/>
@@ -981,8 +972,6 @@
       <w:r>
         <w:rPr>
           <w:rFonts w:ascii="Arial" w:hAnsi="Arial" w:cs="Arial"/>
-          <w:b w:val="0"/>
-          <w:bCs w:val="0"/>
           <w:color w:val="001279"/>
           <w:sz w:val="16"/>
           <w:szCs w:val="16"/>
@@ -992,8 +981,6 @@
       <w:r>
         <w:rPr>
           <w:rFonts w:ascii="Arial" w:hAnsi="Arial" w:cs="Arial"/>
-          <w:b w:val="0"/>
-          <w:bCs w:val="0"/>
           <w:color w:val="001279"/>
           <w:sz w:val="16"/>
           <w:szCs w:val="16"/>
@@ -1003,8 +990,6 @@
       <w:r>
         <w:rPr>
           <w:rFonts w:ascii="Arial" w:hAnsi="Arial" w:cs="Arial"/>
-          <w:b w:val="0"/>
-          <w:bCs w:val="0"/>
           <w:color w:val="001279"/>
           <w:sz w:val="16"/>
           <w:szCs w:val="16"/>
@@ -1014,8 +999,6 @@
       <w:r>
         <w:rPr>
           <w:rFonts w:ascii="Arial" w:hAnsi="Arial" w:cs="Arial"/>
-          <w:b w:val="0"/>
-          <w:bCs w:val="0"/>
           <w:color w:val="001279"/>
           <w:sz w:val="16"/>
           <w:szCs w:val="16"/>
@@ -1025,8 +1008,6 @@
       <w:r>
         <w:rPr>
           <w:rFonts w:ascii="Arial" w:hAnsi="Arial" w:cs="Arial"/>
-          <w:b w:val="0"/>
-          <w:bCs w:val="0"/>
           <w:color w:val="001279"/>
           <w:sz w:val="16"/>
           <w:szCs w:val="16"/>
@@ -1053,7 +1034,6 @@
       <w:r>
         <w:rPr>
           <w:rFonts w:ascii="Arial" w:hAnsi="Arial" w:cs="Arial"/>
-          <w:b w:val="0"/>
           <w:color w:val="001279"/>
           <w:sz w:val="16"/>
           <w:szCs w:val="16"/>
@@ -1063,7 +1043,6 @@
       <w:r>
         <w:rPr>
           <w:rFonts w:ascii="Arial" w:hAnsi="Arial" w:cs="Arial"/>
-          <w:b w:val="0"/>
           <w:color w:val="001279"/>
           <w:sz w:val="16"/>
           <w:szCs w:val="16"/>
@@ -1073,7 +1052,6 @@
       <w:r>
         <w:rPr>
           <w:rFonts w:ascii="Arial" w:hAnsi="Arial" w:cs="Arial"/>
-          <w:b w:val="0"/>
           <w:color w:val="001279"/>
           <w:sz w:val="16"/>
           <w:szCs w:val="16"/>
@@ -1083,7 +1061,6 @@
       <w:r>
         <w:rPr>
           <w:rFonts w:ascii="Arial" w:hAnsi="Arial" w:cs="Arial"/>
-          <w:b w:val="0"/>
           <w:color w:val="001279"/>
           <w:sz w:val="16"/>
           <w:szCs w:val="16"/>
@@ -1093,21 +1070,11 @@
       <w:r>
         <w:rPr>
           <w:rFonts w:ascii="Arial" w:hAnsi="Arial" w:cs="Arial"/>
-          <w:b w:val="0"/>
-          <w:color w:val="001279"/>
-          <w:sz w:val="16"/>
-          <w:szCs w:val="16"/>
-        </w:rPr>
-        <w:t xml:space="preserve"> 2024:</w:t>
-      </w:r>
-      <w:r>
-        <w:rPr>
-          <w:rFonts w:ascii="Arial" w:hAnsi="Arial" w:cs="Arial"/>
-          <w:color w:val="001279"/>
-          <w:sz w:val="16"/>
-          <w:szCs w:val="16"/>
-        </w:rPr>
-        <w:t> </w:t>
+          <w:color w:val="001279"/>
+          <w:sz w:val="16"/>
+          <w:szCs w:val="16"/>
+        </w:rPr>
+        <w:t xml:space="preserve"> 2024: </w:t>
       </w:r>
       <w:r>
         <w:rPr>
@@ -1176,8 +1143,6 @@
       <w:r>
         <w:rPr>
           <w:rFonts w:ascii="Arial" w:hAnsi="Arial" w:cs="Arial"/>
-          <w:b w:val="0"/>
-          <w:bCs w:val="0"/>
           <w:i/>
           <w:iCs/>
           <w:color w:val="001279"/>
@@ -1206,21 +1171,11 @@
       <w:r>
         <w:rPr>
           <w:rFonts w:ascii="Arial" w:hAnsi="Arial" w:cs="Arial"/>
-          <w:b w:val="0"/>
-          <w:color w:val="001279"/>
-          <w:sz w:val="16"/>
-          <w:szCs w:val="16"/>
-        </w:rPr>
-        <w:t>July 2015 – January 2017:</w:t>
-      </w:r>
-      <w:r>
-        <w:rPr>
-          <w:rFonts w:ascii="Arial" w:hAnsi="Arial" w:cs="Arial"/>
-          <w:color w:val="001279"/>
-          <w:sz w:val="16"/>
-          <w:szCs w:val="16"/>
-        </w:rPr>
-        <w:t> Developed proof-of-concept tools and prototypes for processing medical transaction data (EDI_X12_837) and handling large medical provider datasets (JSON, XML). Extended a web services application for state governments and clinics to facilitate medical provider data registration and validation.</w:t>
+          <w:color w:val="001279"/>
+          <w:sz w:val="16"/>
+          <w:szCs w:val="16"/>
+        </w:rPr>
+        <w:t>July 2015 – January 2017: Developed proof-of-concept tools and prototypes for processing medical transaction data (EDI_X12_837) and handling large medical provider datasets (JSON, XML). Extended a web services application for state governments and clinics to facilitate medical provider data registration and validation.</w:t>
       </w:r>
       <w:r>
         <w:rPr>
@@ -1230,44 +1185,7 @@
           <w:szCs w:val="16"/>
         </w:rPr>
         <w:br/>
-      </w:r>
-      <w:r>
-        <w:rPr>
-          <w:rFonts w:ascii="Arial" w:hAnsi="Arial" w:cs="Arial"/>
-          <w:b w:val="0"/>
-          <w:color w:val="001279"/>
-          <w:sz w:val="16"/>
-          <w:szCs w:val="16"/>
-        </w:rPr>
-        <w:t>Tech:</w:t>
-      </w:r>
-      <w:r>
-        <w:rPr>
-          <w:rFonts w:ascii="Arial" w:hAnsi="Arial" w:cs="Arial"/>
-          <w:color w:val="001279"/>
-          <w:sz w:val="16"/>
-          <w:szCs w:val="16"/>
-        </w:rPr>
-        <w:t> Python 3.5, PostgreSQL, Django, JavaScript | </w:t>
-      </w:r>
-      <w:r>
-        <w:rPr>
-          <w:rFonts w:ascii="Arial" w:hAnsi="Arial" w:cs="Arial"/>
-          <w:b w:val="0"/>
-          <w:color w:val="001279"/>
-          <w:sz w:val="16"/>
-          <w:szCs w:val="16"/>
-        </w:rPr>
-        <w:t>Platform:</w:t>
-      </w:r>
-      <w:r>
-        <w:rPr>
-          <w:rFonts w:ascii="Arial" w:hAnsi="Arial" w:cs="Arial"/>
-          <w:color w:val="001279"/>
-          <w:sz w:val="16"/>
-          <w:szCs w:val="16"/>
-        </w:rPr>
-        <w:t> Unix</w:t>
+        <w:t>Tech: Python 3.5, PostgreSQL, Django, JavaScript | Platform: Unix</w:t>
       </w:r>
     </w:p>
     <w:p>
@@ -1289,7 +1207,6 @@
       <w:r>
         <w:rPr>
           <w:rFonts w:ascii="Arial" w:hAnsi="Arial" w:cs="Arial"/>
-          <w:b w:val="0"/>
           <w:color w:val="001279"/>
           <w:sz w:val="16"/>
           <w:szCs w:val="16"/>
@@ -1299,7 +1216,6 @@
       <w:r>
         <w:rPr>
           <w:rFonts w:ascii="Arial" w:hAnsi="Arial" w:cs="Arial"/>
-          <w:b w:val="0"/>
           <w:color w:val="001279"/>
           <w:sz w:val="16"/>
           <w:szCs w:val="16"/>
@@ -1309,7 +1225,6 @@
       <w:r>
         <w:rPr>
           <w:rFonts w:ascii="Arial" w:hAnsi="Arial" w:cs="Arial"/>
-          <w:b w:val="0"/>
           <w:color w:val="001279"/>
           <w:sz w:val="16"/>
           <w:szCs w:val="16"/>
@@ -1319,7 +1234,6 @@
       <w:r>
         <w:rPr>
           <w:rFonts w:ascii="Arial" w:hAnsi="Arial" w:cs="Arial"/>
-          <w:b w:val="0"/>
           <w:color w:val="001279"/>
           <w:sz w:val="16"/>
           <w:szCs w:val="16"/>
@@ -1329,21 +1243,11 @@
       <w:r>
         <w:rPr>
           <w:rFonts w:ascii="Arial" w:hAnsi="Arial" w:cs="Arial"/>
-          <w:b w:val="0"/>
-          <w:color w:val="001279"/>
-          <w:sz w:val="16"/>
-          <w:szCs w:val="16"/>
-        </w:rPr>
-        <w:t>:</w:t>
-      </w:r>
-      <w:r>
-        <w:rPr>
-          <w:rFonts w:ascii="Arial" w:hAnsi="Arial" w:cs="Arial"/>
-          <w:color w:val="001279"/>
-          <w:sz w:val="16"/>
-          <w:szCs w:val="16"/>
-        </w:rPr>
-        <w:t> </w:t>
+          <w:color w:val="001279"/>
+          <w:sz w:val="16"/>
+          <w:szCs w:val="16"/>
+        </w:rPr>
+        <w:t>: </w:t>
       </w:r>
       <w:r>
         <w:rPr>
@@ -1366,7 +1270,6 @@
       <w:r>
         <w:rPr>
           <w:rFonts w:ascii="Arial" w:hAnsi="Arial" w:cs="Arial"/>
-          <w:b w:val="0"/>
           <w:color w:val="001279"/>
           <w:sz w:val="16"/>
           <w:szCs w:val="16"/>
@@ -1376,8 +1279,6 @@
       <w:r>
         <w:rPr>
           <w:rFonts w:ascii="Arial" w:hAnsi="Arial" w:cs="Arial"/>
-          <w:b w:val="0"/>
-          <w:bCs w:val="0"/>
           <w:color w:val="001279"/>
           <w:sz w:val="16"/>
           <w:szCs w:val="16"/>
@@ -1387,8 +1288,6 @@
       <w:r>
         <w:rPr>
           <w:rFonts w:ascii="Arial" w:hAnsi="Arial" w:cs="Arial"/>
-          <w:b w:val="0"/>
-          <w:bCs w:val="0"/>
           <w:color w:val="001279"/>
           <w:sz w:val="16"/>
           <w:szCs w:val="16"/>
@@ -1398,8 +1297,6 @@
       <w:r>
         <w:rPr>
           <w:rFonts w:ascii="Arial" w:hAnsi="Arial" w:cs="Arial"/>
-          <w:b w:val="0"/>
-          <w:bCs w:val="0"/>
           <w:color w:val="001279"/>
           <w:sz w:val="16"/>
           <w:szCs w:val="16"/>
@@ -1409,7 +1306,6 @@
       <w:r>
         <w:rPr>
           <w:rFonts w:ascii="Arial" w:hAnsi="Arial" w:cs="Arial"/>
-          <w:b w:val="0"/>
           <w:color w:val="001279"/>
           <w:sz w:val="16"/>
           <w:szCs w:val="16"/>
@@ -1419,7 +1315,6 @@
       <w:r>
         <w:rPr>
           <w:rFonts w:ascii="Arial" w:hAnsi="Arial" w:cs="Arial"/>
-          <w:b w:val="0"/>
           <w:color w:val="001279"/>
           <w:sz w:val="16"/>
           <w:szCs w:val="16"/>
@@ -1429,7 +1324,6 @@
       <w:r>
         <w:rPr>
           <w:rFonts w:ascii="Arial" w:hAnsi="Arial" w:cs="Arial"/>
-          <w:b w:val="0"/>
           <w:color w:val="001279"/>
           <w:sz w:val="16"/>
           <w:szCs w:val="16"/>
@@ -1439,8 +1333,6 @@
       <w:r>
         <w:rPr>
           <w:rFonts w:ascii="Arial" w:hAnsi="Arial" w:cs="Arial"/>
-          <w:b w:val="0"/>
-          <w:bCs w:val="0"/>
           <w:color w:val="001279"/>
           <w:sz w:val="16"/>
           <w:szCs w:val="16"/>
@@ -1450,28 +1342,15 @@
       <w:r>
         <w:rPr>
           <w:rFonts w:ascii="Arial" w:hAnsi="Arial" w:cs="Arial"/>
-          <w:b w:val="0"/>
-          <w:bCs w:val="0"/>
-          <w:color w:val="001279"/>
-          <w:sz w:val="16"/>
-          <w:szCs w:val="16"/>
-        </w:rPr>
-        <w:t xml:space="preserve"> to developing a Health Information Exchange(HIE) application for hospitals.</w:t>
-      </w:r>
-      <w:r>
-        <w:rPr>
-          <w:rFonts w:ascii="Arial" w:hAnsi="Arial" w:cs="Arial"/>
-          <w:b w:val="0"/>
-          <w:color w:val="001279"/>
-          <w:sz w:val="16"/>
-          <w:szCs w:val="16"/>
-        </w:rPr>
-        <w:t xml:space="preserve"> </w:t>
-      </w:r>
-      <w:r>
-        <w:rPr>
-          <w:rFonts w:ascii="Arial" w:hAnsi="Arial" w:cs="Arial"/>
-          <w:b w:val="0"/>
+          <w:color w:val="001279"/>
+          <w:sz w:val="16"/>
+          <w:szCs w:val="16"/>
+        </w:rPr>
+        <w:t xml:space="preserve"> to developing a Health Information Exchange(HIE) application for hospitals. </w:t>
+      </w:r>
+      <w:r>
+        <w:rPr>
+          <w:rFonts w:ascii="Arial" w:hAnsi="Arial" w:cs="Arial"/>
           <w:color w:val="001279"/>
           <w:sz w:val="16"/>
           <w:szCs w:val="16"/>
@@ -1481,59 +1360,11 @@
       <w:r>
         <w:rPr>
           <w:rFonts w:ascii="Arial" w:hAnsi="Arial" w:cs="Arial"/>
-          <w:b w:val="0"/>
-          <w:color w:val="001279"/>
-          <w:sz w:val="16"/>
-          <w:szCs w:val="16"/>
-        </w:rPr>
-        <w:t>:</w:t>
-      </w:r>
-      <w:r>
-        <w:rPr>
-          <w:rFonts w:ascii="Arial" w:hAnsi="Arial" w:cs="Arial"/>
-          <w:color w:val="001279"/>
-          <w:sz w:val="16"/>
-          <w:szCs w:val="16"/>
-        </w:rPr>
-        <w:t> Elixir/Phoenix | </w:t>
-      </w:r>
-      <w:r>
-        <w:rPr>
-          <w:rFonts w:ascii="Arial" w:hAnsi="Arial" w:cs="Arial"/>
-          <w:b w:val="0"/>
-          <w:color w:val="001279"/>
-          <w:sz w:val="16"/>
-          <w:szCs w:val="16"/>
-        </w:rPr>
-        <w:t>Platform:</w:t>
-      </w:r>
-      <w:r>
-        <w:rPr>
-          <w:rFonts w:ascii="Arial" w:hAnsi="Arial" w:cs="Arial"/>
-          <w:color w:val="001279"/>
-          <w:sz w:val="16"/>
-          <w:szCs w:val="16"/>
-        </w:rPr>
-        <w:t> Ubuntu Linux, macOS | </w:t>
-      </w:r>
-      <w:r>
-        <w:rPr>
-          <w:rFonts w:ascii="Arial" w:hAnsi="Arial" w:cs="Arial"/>
-          <w:b w:val="0"/>
-          <w:color w:val="001279"/>
-          <w:sz w:val="16"/>
-          <w:szCs w:val="16"/>
-        </w:rPr>
-        <w:t>Databases:</w:t>
-      </w:r>
-      <w:r>
-        <w:rPr>
-          <w:rFonts w:ascii="Arial" w:hAnsi="Arial" w:cs="Arial"/>
-          <w:color w:val="001279"/>
-          <w:sz w:val="16"/>
-          <w:szCs w:val="16"/>
-        </w:rPr>
-        <w:t> MariaDB, PostgreSQL, MongoDB</w:t>
+          <w:color w:val="001279"/>
+          <w:sz w:val="16"/>
+          <w:szCs w:val="16"/>
+        </w:rPr>
+        <w:t>: Elixir/Phoenix | Platform: Ubuntu Linux, macOS | Databases: MariaDB, PostgreSQL, MongoDB</w:t>
       </w:r>
     </w:p>
     <w:p>
@@ -1557,8 +1388,6 @@
       <w:r>
         <w:rPr>
           <w:rFonts w:ascii="Arial" w:hAnsi="Arial" w:cs="Arial"/>
-          <w:b w:val="0"/>
-          <w:bCs w:val="0"/>
           <w:color w:val="001279"/>
           <w:sz w:val="16"/>
           <w:szCs w:val="16"/>
@@ -1584,22 +1413,39 @@
       <w:r>
         <w:rPr>
           <w:rFonts w:ascii="Arial" w:hAnsi="Arial" w:cs="Arial"/>
-          <w:b w:val="0"/>
-          <w:color w:val="001279"/>
-          <w:sz w:val="16"/>
-          <w:szCs w:val="16"/>
-        </w:rPr>
-        <w:t>January 2012 – March 2012: Focused on electronic medical records, claims processing, and provider enrollment applications on GNU/Linux. Developed tools for handling JSON data and extended the application’s support for additional records processing.</w:t>
-      </w:r>
-      <w:r>
-        <w:rPr>
-          <w:rFonts w:ascii="Arial" w:hAnsi="Arial" w:cs="Arial"/>
-          <w:b w:val="0"/>
+          <w:color w:val="001279"/>
+          <w:sz w:val="16"/>
+          <w:szCs w:val="16"/>
+        </w:rPr>
+        <w:t>January 2012 – March 2012: </w:t>
+      </w:r>
+      <w:bookmarkStart w:id="0" w:name="_GoBack"/>
+      <w:r>
+        <w:rPr>
+          <w:rFonts w:ascii="Arial" w:hAnsi="Arial" w:cs="Arial"/>
+          <w:color w:val="001279"/>
+          <w:sz w:val="16"/>
+          <w:szCs w:val="16"/>
+        </w:rPr>
+        <w:t>Focused on electronic medical records, claims processing, and provider enrollment applications on GNU/Linux. Developed tools for handling JSON data and extended the application’s support for additional records processing.</w:t>
+      </w:r>
+      <w:r>
+        <w:rPr>
+          <w:rFonts w:ascii="Arial" w:hAnsi="Arial" w:cs="Arial"/>
           <w:color w:val="001279"/>
           <w:sz w:val="16"/>
           <w:szCs w:val="16"/>
         </w:rPr>
         <w:br/>
+      </w:r>
+      <w:bookmarkEnd w:id="0"/>
+      <w:r>
+        <w:rPr>
+          <w:rFonts w:ascii="Arial" w:hAnsi="Arial" w:cs="Arial"/>
+          <w:color w:val="001279"/>
+          <w:sz w:val="16"/>
+          <w:szCs w:val="16"/>
+        </w:rPr>
         <w:t>Tech: Python, Django, JavaScript (jQuery, Node.js) | Databases: MariaDB, PostgreSQL, Redis</w:t>
       </w:r>
     </w:p>
@@ -1651,21 +1497,11 @@
       <w:r>
         <w:rPr>
           <w:rFonts w:ascii="Arial" w:hAnsi="Arial" w:cs="Arial"/>
-          <w:b w:val="0"/>
-          <w:color w:val="001279"/>
-          <w:sz w:val="16"/>
-          <w:szCs w:val="16"/>
-        </w:rPr>
-        <w:t>July 2009 – May 2010:</w:t>
-      </w:r>
-      <w:r>
-        <w:rPr>
-          <w:rFonts w:ascii="Arial" w:hAnsi="Arial" w:cs="Arial"/>
-          <w:color w:val="001279"/>
-          <w:sz w:val="16"/>
-          <w:szCs w:val="16"/>
-        </w:rPr>
-        <w:t> Conducted code analysis for GNUmed, an open-source electronic medical record system, to evaluate its suitability for client needs. Built a RESTful web service for state medical provider validation.</w:t>
+          <w:color w:val="001279"/>
+          <w:sz w:val="16"/>
+          <w:szCs w:val="16"/>
+        </w:rPr>
+        <w:t>July 2009 – May 2010: Conducted code analysis for GNUmed, an open-source electronic medical record system, to evaluate its suitability for client needs. Built a RESTful web service for state medical provider validation.</w:t>
       </w:r>
       <w:r>
         <w:rPr>
@@ -1675,44 +1511,7 @@
           <w:szCs w:val="16"/>
         </w:rPr>
         <w:br/>
-      </w:r>
-      <w:r>
-        <w:rPr>
-          <w:rFonts w:ascii="Arial" w:hAnsi="Arial" w:cs="Arial"/>
-          <w:b w:val="0"/>
-          <w:color w:val="001279"/>
-          <w:sz w:val="16"/>
-          <w:szCs w:val="16"/>
-        </w:rPr>
-        <w:t>Tech:</w:t>
-      </w:r>
-      <w:r>
-        <w:rPr>
-          <w:rFonts w:ascii="Arial" w:hAnsi="Arial" w:cs="Arial"/>
-          <w:color w:val="001279"/>
-          <w:sz w:val="16"/>
-          <w:szCs w:val="16"/>
-        </w:rPr>
-        <w:t> Python, Django | </w:t>
-      </w:r>
-      <w:r>
-        <w:rPr>
-          <w:rFonts w:ascii="Arial" w:hAnsi="Arial" w:cs="Arial"/>
-          <w:b w:val="0"/>
-          <w:color w:val="001279"/>
-          <w:sz w:val="16"/>
-          <w:szCs w:val="16"/>
-        </w:rPr>
-        <w:t>Platform:</w:t>
-      </w:r>
-      <w:r>
-        <w:rPr>
-          <w:rFonts w:ascii="Arial" w:hAnsi="Arial" w:cs="Arial"/>
-          <w:color w:val="001279"/>
-          <w:sz w:val="16"/>
-          <w:szCs w:val="16"/>
-        </w:rPr>
-        <w:t> GNU/Linu</w:t>
+        <w:t>Tech: Python, Django | Platform: GNU/Linu</w:t>
       </w:r>
       <w:r>
         <w:rPr>
@@ -2239,17 +2038,15 @@
           <w:rFonts w:ascii="Arial" w:hAnsi="Arial" w:cs="Arial"/>
           <w:b/>
           <w:bCs/>
-          <w:color w:val="7030A0"/>
-          <w:sz w:val="16"/>
-          <w:szCs w:val="16"/>
-        </w:rPr>
-      </w:pPr>
-      <w:r>
-        <w:rPr>
-          <w:rFonts w:ascii="Arial" w:hAnsi="Arial" w:cs="Arial"/>
-          <w:b/>
-          <w:bCs/>
-          <w:color w:val="7030A0"/>
+          <w:sz w:val="16"/>
+          <w:szCs w:val="16"/>
+        </w:rPr>
+      </w:pPr>
+      <w:r>
+        <w:rPr>
+          <w:rFonts w:ascii="Arial" w:hAnsi="Arial" w:cs="Arial"/>
+          <w:b/>
+          <w:bCs/>
           <w:sz w:val="16"/>
           <w:szCs w:val="16"/>
         </w:rPr>
@@ -2263,17 +2060,15 @@
           <w:rFonts w:ascii="Arial" w:hAnsi="Arial" w:cs="Arial"/>
           <w:b/>
           <w:bCs/>
-          <w:color w:val="7030A0"/>
-          <w:sz w:val="16"/>
-          <w:szCs w:val="16"/>
-        </w:rPr>
-      </w:pPr>
-      <w:r>
-        <w:rPr>
-          <w:rFonts w:ascii="Arial" w:hAnsi="Arial" w:cs="Arial"/>
-          <w:b/>
-          <w:bCs/>
-          <w:color w:val="7030A0"/>
+          <w:sz w:val="16"/>
+          <w:szCs w:val="16"/>
+        </w:rPr>
+      </w:pPr>
+      <w:r>
+        <w:rPr>
+          <w:rFonts w:ascii="Arial" w:hAnsi="Arial" w:cs="Arial"/>
+          <w:b/>
+          <w:bCs/>
           <w:sz w:val="16"/>
           <w:szCs w:val="16"/>
         </w:rPr>
@@ -2287,15 +2082,13 @@
           <w:rFonts w:ascii="Arial" w:hAnsi="Arial" w:cs="Arial"/>
           <w:b/>
           <w:bCs/>
-          <w:color w:val="7030A0"/>
-          <w:sz w:val="16"/>
-          <w:szCs w:val="16"/>
-        </w:rPr>
-      </w:pPr>
-      <w:r>
-        <w:rPr>
-          <w:rFonts w:ascii="Arial" w:hAnsi="Arial" w:cs="Arial"/>
-          <w:color w:val="7030A0"/>
+          <w:sz w:val="16"/>
+          <w:szCs w:val="16"/>
+        </w:rPr>
+      </w:pPr>
+      <w:r>
+        <w:rPr>
+          <w:rFonts w:ascii="Arial" w:hAnsi="Arial" w:cs="Arial"/>
           <w:sz w:val="16"/>
           <w:szCs w:val="16"/>
         </w:rPr>
@@ -2311,17 +2104,17 @@
         </w:numPr>
         <w:rPr>
           <w:rFonts w:ascii="Arial" w:hAnsi="Arial" w:cs="Arial"/>
-          <w:color w:val="7030A0"/>
-          <w:sz w:val="16"/>
-          <w:szCs w:val="16"/>
-        </w:rPr>
-      </w:pPr>
-      <w:r>
-        <w:rPr>
-          <w:rFonts w:ascii="Arial" w:hAnsi="Arial" w:cs="Arial"/>
-          <w:color w:val="7030A0"/>
-          <w:sz w:val="16"/>
-          <w:szCs w:val="16"/>
+          <w:sz w:val="16"/>
+          <w:szCs w:val="16"/>
+          <w:color w:val="1F3763"/>
+        </w:rPr>
+      </w:pPr>
+      <w:r>
+        <w:rPr>
+          <w:rFonts w:ascii="Arial" w:hAnsi="Arial" w:cs="Arial"/>
+          <w:sz w:val="16"/>
+          <w:szCs w:val="16"/>
+          <w:color w:val="1F3763"/>
         </w:rPr>
         <w:t>Refactored and extended a SOAP server (written in C) for enhanced data exchange within the Medicaid Management Information System (MMIS).</w:t>
       </w:r>
@@ -2335,17 +2128,17 @@
         </w:numPr>
         <w:rPr>
           <w:rFonts w:ascii="Arial" w:hAnsi="Arial" w:cs="Arial"/>
-          <w:color w:val="7030A0"/>
-          <w:sz w:val="16"/>
-          <w:szCs w:val="16"/>
-        </w:rPr>
-      </w:pPr>
-      <w:r>
-        <w:rPr>
-          <w:rFonts w:ascii="Arial" w:hAnsi="Arial" w:cs="Arial"/>
-          <w:color w:val="7030A0"/>
-          <w:sz w:val="16"/>
-          <w:szCs w:val="16"/>
+          <w:sz w:val="16"/>
+          <w:szCs w:val="16"/>
+          <w:color w:val="1F3763"/>
+        </w:rPr>
+      </w:pPr>
+      <w:r>
+        <w:rPr>
+          <w:rFonts w:ascii="Arial" w:hAnsi="Arial" w:cs="Arial"/>
+          <w:sz w:val="16"/>
+          <w:szCs w:val="16"/>
+          <w:color w:val="1F3763"/>
         </w:rPr>
         <w:t>Developed monthly report generators for medical claims processing.</w:t>
       </w:r>
@@ -2359,17 +2152,17 @@
         </w:numPr>
         <w:rPr>
           <w:rFonts w:ascii="Arial" w:hAnsi="Arial" w:cs="Arial"/>
-          <w:color w:val="7030A0"/>
-          <w:sz w:val="16"/>
-          <w:szCs w:val="16"/>
-        </w:rPr>
-      </w:pPr>
-      <w:r>
-        <w:rPr>
-          <w:rFonts w:ascii="Arial" w:hAnsi="Arial" w:cs="Arial"/>
-          <w:color w:val="7030A0"/>
-          <w:sz w:val="16"/>
-          <w:szCs w:val="16"/>
+          <w:sz w:val="16"/>
+          <w:szCs w:val="16"/>
+          <w:color w:val="1F3763"/>
+        </w:rPr>
+      </w:pPr>
+      <w:r>
+        <w:rPr>
+          <w:rFonts w:ascii="Arial" w:hAnsi="Arial" w:cs="Arial"/>
+          <w:sz w:val="16"/>
+          <w:szCs w:val="16"/>
+          <w:color w:val="1F3763"/>
         </w:rPr>
         <w:t>Ported the entire application codebase to a new 64-bit Solaris network with updated compilers and Oracle database version.</w:t>
       </w:r>
@@ -2383,17 +2176,17 @@
         </w:numPr>
         <w:rPr>
           <w:rFonts w:ascii="Arial" w:hAnsi="Arial" w:cs="Arial"/>
-          <w:color w:val="7030A0"/>
-          <w:sz w:val="16"/>
-          <w:szCs w:val="16"/>
-        </w:rPr>
-      </w:pPr>
-      <w:r>
-        <w:rPr>
-          <w:rFonts w:ascii="Arial" w:hAnsi="Arial" w:cs="Arial"/>
-          <w:color w:val="7030A0"/>
-          <w:sz w:val="16"/>
-          <w:szCs w:val="16"/>
+          <w:sz w:val="16"/>
+          <w:szCs w:val="16"/>
+          <w:color w:val="1F3763"/>
+        </w:rPr>
+      </w:pPr>
+      <w:r>
+        <w:rPr>
+          <w:rFonts w:ascii="Arial" w:hAnsi="Arial" w:cs="Arial"/>
+          <w:sz w:val="16"/>
+          <w:szCs w:val="16"/>
+          <w:color w:val="1F3763"/>
         </w:rPr>
         <w:t>Contributed to technical writing and documentation.</w:t>
       </w:r>
@@ -2403,37 +2196,37 @@
         <w:pStyle w:val="FirstParagraph"/>
         <w:rPr>
           <w:rFonts w:ascii="Arial" w:hAnsi="Arial" w:cs="Arial"/>
-          <w:color w:val="002060"/>
-          <w:sz w:val="16"/>
-          <w:szCs w:val="16"/>
-        </w:rPr>
-      </w:pPr>
-      <w:r>
-        <w:rPr>
-          <w:rFonts w:ascii="Arial" w:hAnsi="Arial" w:cs="Arial"/>
-          <w:b/>
-          <w:bCs/>
-          <w:color w:val="7030A0"/>
-          <w:sz w:val="16"/>
-          <w:szCs w:val="16"/>
+          <w:sz w:val="16"/>
+          <w:szCs w:val="16"/>
+          <w:color w:val="1F3763"/>
+        </w:rPr>
+      </w:pPr>
+      <w:r>
+        <w:rPr>
+          <w:rFonts w:ascii="Arial" w:hAnsi="Arial" w:cs="Arial"/>
+          <w:b/>
+          <w:bCs/>
+          <w:sz w:val="16"/>
+          <w:szCs w:val="16"/>
+          <w:color w:val="1F3763"/>
         </w:rPr>
         <w:t>Tech:</w:t>
       </w:r>
       <w:r>
         <w:rPr>
           <w:rFonts w:ascii="Arial" w:hAnsi="Arial" w:cs="Arial"/>
-          <w:color w:val="7030A0"/>
-          <w:sz w:val="16"/>
-          <w:szCs w:val="16"/>
+          <w:sz w:val="16"/>
+          <w:szCs w:val="16"/>
+          <w:color w:val="1F3763"/>
         </w:rPr>
         <w:t xml:space="preserve"> C, PL/SQL, SOAP, Oracle</w:t>
       </w:r>
       <w:r>
         <w:rPr>
           <w:rFonts w:ascii="Arial" w:hAnsi="Arial" w:cs="Arial"/>
-          <w:color w:val="002060"/>
-          <w:sz w:val="16"/>
-          <w:szCs w:val="16"/>
+          <w:sz w:val="16"/>
+          <w:szCs w:val="16"/>
+          <w:color w:val="1F3763"/>
         </w:rPr>
         <w:t>, Solaris</w:t>
       </w:r>
@@ -2754,7 +2547,7 @@
           <w:sz w:val="16"/>
           <w:szCs w:val="16"/>
         </w:rPr>
-        <w:t>Developed tools for porting and rebuilding C/C++ applications from Microsoft Visual Studio to Unix environments, using Visual Studio build artifacts rather than traditional makefile-based builds. Contract position.</w:t>
+        <w:t>Bug fixes, code analysis, and refactoring of C code for high-end prototype printers designed for secure environments (government, military, finance). Developed Python scripts for daily integration testing. Contract position.</w:t>
       </w:r>
     </w:p>
     <w:p/>

</xml_diff>

<commit_message>
Normalize resume colors to consistent dark blue (001279)
</commit_message>
<xml_diff>
--- a/static/files/Resume.v3.7.docx
+++ b/static/files/Resume.v3.7.docx
@@ -16,12 +16,14 @@
           <w:szCs w:val="18"/>
         </w:rPr>
       </w:pPr>
+      <w:bookmarkStart w:id="0" w:name="_GoBack"/>
+      <w:bookmarkEnd w:id="0"/>
       <w:r>
         <w:rPr>
           <w:rFonts w:ascii="Tahoma" w:hAnsi="Tahoma" w:cs="Tahoma"/>
           <w:b/>
           <w:bCs/>
-          <w:color w:val="000090"/>
+          <w:color w:val="001279"/>
           <w:sz w:val="18"/>
           <w:szCs w:val="18"/>
         </w:rPr>
@@ -47,6 +49,7 @@
             <w:rFonts w:ascii="Tahoma" w:hAnsi="Tahoma" w:cs="Tahoma"/>
             <w:sz w:val="18"/>
             <w:szCs w:val="18"/>
+            <w:color w:val="0563C1"/>
           </w:rPr>
           <w:t>donfox1@mac.com</w:t>
         </w:r>
@@ -54,7 +57,7 @@
       <w:r>
         <w:rPr>
           <w:rFonts w:ascii="Tahoma" w:hAnsi="Tahoma" w:cs="Tahoma"/>
-          <w:color w:val="000090"/>
+          <w:color w:val="001279"/>
           <w:sz w:val="18"/>
           <w:szCs w:val="18"/>
         </w:rPr>
@@ -63,7 +66,7 @@
       <w:r>
         <w:rPr>
           <w:rFonts w:ascii="Tahoma" w:hAnsi="Tahoma" w:cs="Tahoma"/>
-          <w:color w:val="000090"/>
+          <w:color w:val="001279"/>
           <w:sz w:val="18"/>
           <w:szCs w:val="18"/>
         </w:rPr>
@@ -72,7 +75,7 @@
       <w:r>
         <w:rPr>
           <w:rFonts w:ascii="Tahoma" w:hAnsi="Tahoma" w:cs="Tahoma"/>
-          <w:color w:val="000090"/>
+          <w:color w:val="001279"/>
           <w:sz w:val="18"/>
           <w:szCs w:val="18"/>
         </w:rPr>
@@ -81,7 +84,7 @@
       <w:r>
         <w:rPr>
           <w:rFonts w:ascii="Tahoma" w:hAnsi="Tahoma" w:cs="Tahoma"/>
-          <w:color w:val="000090"/>
+          <w:color w:val="001279"/>
           <w:sz w:val="18"/>
           <w:szCs w:val="18"/>
         </w:rPr>
@@ -90,7 +93,7 @@
       <w:r>
         <w:rPr>
           <w:rFonts w:ascii="Tahoma" w:hAnsi="Tahoma" w:cs="Tahoma"/>
-          <w:color w:val="000090"/>
+          <w:color w:val="001279"/>
           <w:sz w:val="18"/>
           <w:szCs w:val="18"/>
         </w:rPr>
@@ -99,7 +102,7 @@
       <w:r>
         <w:rPr>
           <w:rFonts w:ascii="Tahoma" w:hAnsi="Tahoma" w:cs="Tahoma"/>
-          <w:color w:val="000090"/>
+          <w:color w:val="001279"/>
           <w:sz w:val="18"/>
           <w:szCs w:val="18"/>
         </w:rPr>
@@ -131,6 +134,7 @@
           <w:rFonts w:ascii="Arial" w:hAnsi="Arial" w:cs="Arial"/>
           <w:b/>
           <w:bCs/>
+          <w:color w:val="001279"/>
           <w:sz w:val="18"/>
           <w:szCs w:val="18"/>
           <w:u w:val="single"/>
@@ -140,6 +144,7 @@
       <w:r>
         <w:rPr>
           <w:rFonts w:ascii="Arial" w:hAnsi="Arial" w:cs="Arial"/>
+          <w:color w:val="001279"/>
           <w:sz w:val="18"/>
           <w:szCs w:val="18"/>
         </w:rPr>
@@ -166,7 +171,7 @@
       <w:r>
         <w:rPr>
           <w:rFonts w:ascii="Arial" w:hAnsi="Arial" w:cs="Arial"/>
-          <w:color w:val="002060"/>
+          <w:color w:val="001279"/>
           <w:sz w:val="16"/>
           <w:szCs w:val="16"/>
         </w:rPr>
@@ -186,7 +191,7 @@
       <w:r>
         <w:rPr>
           <w:rFonts w:ascii="Arial" w:hAnsi="Arial" w:cs="Arial"/>
-          <w:color w:val="7030A0"/>
+          <w:color w:val="001279"/>
           <w:sz w:val="16"/>
           <w:szCs w:val="16"/>
         </w:rPr>
@@ -195,7 +200,7 @@
       <w:r>
         <w:rPr>
           <w:rFonts w:ascii="Arial" w:hAnsi="Arial" w:cs="Arial"/>
-          <w:color w:val="7030A0"/>
+          <w:color w:val="001279"/>
           <w:sz w:val="16"/>
           <w:szCs w:val="16"/>
         </w:rPr>
@@ -204,7 +209,7 @@
       <w:r>
         <w:rPr>
           <w:rFonts w:ascii="Arial" w:hAnsi="Arial" w:cs="Arial"/>
-          <w:color w:val="7030A0"/>
+          <w:color w:val="001279"/>
           <w:sz w:val="16"/>
           <w:szCs w:val="16"/>
         </w:rPr>
@@ -213,7 +218,7 @@
       <w:r>
         <w:rPr>
           <w:rFonts w:ascii="Arial" w:hAnsi="Arial" w:cs="Arial"/>
-          <w:color w:val="7030A0"/>
+          <w:color w:val="001279"/>
           <w:sz w:val="16"/>
           <w:szCs w:val="16"/>
         </w:rPr>
@@ -222,7 +227,7 @@
       <w:r>
         <w:rPr>
           <w:rFonts w:ascii="Arial" w:hAnsi="Arial" w:cs="Arial"/>
-          <w:color w:val="7030A0"/>
+          <w:color w:val="001279"/>
           <w:sz w:val="16"/>
           <w:szCs w:val="16"/>
         </w:rPr>
@@ -231,7 +236,7 @@
       <w:r>
         <w:rPr>
           <w:rFonts w:ascii="Arial" w:hAnsi="Arial" w:cs="Arial"/>
-          <w:color w:val="7030A0"/>
+          <w:color w:val="001279"/>
           <w:sz w:val="16"/>
           <w:szCs w:val="16"/>
         </w:rPr>
@@ -240,7 +245,7 @@
       <w:r>
         <w:rPr>
           <w:rFonts w:ascii="Arial" w:hAnsi="Arial" w:cs="Arial"/>
-          <w:color w:val="7030A0"/>
+          <w:color w:val="001279"/>
           <w:sz w:val="16"/>
           <w:szCs w:val="16"/>
         </w:rPr>
@@ -249,7 +254,7 @@
       <w:r>
         <w:rPr>
           <w:rFonts w:ascii="Arial" w:hAnsi="Arial" w:cs="Arial"/>
-          <w:color w:val="7030A0"/>
+          <w:color w:val="001279"/>
           <w:sz w:val="16"/>
           <w:szCs w:val="16"/>
         </w:rPr>
@@ -258,7 +263,7 @@
       <w:r>
         <w:rPr>
           <w:rFonts w:ascii="Arial" w:hAnsi="Arial" w:cs="Arial"/>
-          <w:color w:val="7030A0"/>
+          <w:color w:val="001279"/>
           <w:sz w:val="16"/>
           <w:szCs w:val="16"/>
         </w:rPr>
@@ -267,7 +272,7 @@
       <w:r>
         <w:rPr>
           <w:rFonts w:ascii="Arial" w:hAnsi="Arial" w:cs="Arial"/>
-          <w:color w:val="7030A0"/>
+          <w:color w:val="001279"/>
           <w:sz w:val="16"/>
           <w:szCs w:val="16"/>
         </w:rPr>
@@ -276,7 +281,7 @@
       <w:r>
         <w:rPr>
           <w:rFonts w:ascii="Arial" w:hAnsi="Arial" w:cs="Arial"/>
-          <w:color w:val="7030A0"/>
+          <w:color w:val="001279"/>
           <w:sz w:val="16"/>
           <w:szCs w:val="16"/>
         </w:rPr>
@@ -302,7 +307,7 @@
         <w:rPr>
           <w:rFonts w:ascii="Arial" w:hAnsi="Arial" w:cs="Arial"/>
           <w:b/>
-          <w:color w:val="000090"/>
+          <w:color w:val="001279"/>
           <w:sz w:val="18"/>
           <w:szCs w:val="18"/>
           <w:u w:val="single"/>
@@ -313,7 +318,7 @@
         <w:rPr>
           <w:rFonts w:ascii="Arial" w:hAnsi="Arial" w:cs="Arial"/>
           <w:b/>
-          <w:color w:val="000090"/>
+          <w:color w:val="001279"/>
           <w:sz w:val="18"/>
           <w:szCs w:val="18"/>
         </w:rPr>
@@ -323,7 +328,7 @@
         <w:rPr>
           <w:rFonts w:ascii="Arial" w:hAnsi="Arial" w:cs="Arial"/>
           <w:b/>
-          <w:color w:val="000090"/>
+          <w:color w:val="001279"/>
           <w:sz w:val="18"/>
           <w:szCs w:val="18"/>
         </w:rPr>
@@ -352,33 +357,11 @@
           <w:rFonts w:ascii="Arial" w:hAnsi="Arial" w:cs="Arial"/>
           <w:b/>
           <w:bCs/>
-          <w:color w:val="000090"/>
-          <w:sz w:val="16"/>
-          <w:szCs w:val="16"/>
-        </w:rPr>
-        <w:t xml:space="preserve">Bachelor of Arts in </w:t>
-      </w:r>
-      <w:r>
-        <w:rPr>
-          <w:rFonts w:ascii="Arial" w:hAnsi="Arial" w:cs="Arial"/>
-          <w:b/>
-          <w:bCs/>
-          <w:color w:val="001279"/>
-          <w:sz w:val="16"/>
-          <w:szCs w:val="16"/>
-        </w:rPr>
-        <w:t>Philosophy</w:t>
-      </w:r>
-      <w:r>
-        <w:rPr>
-          <w:rFonts w:ascii="Arial" w:hAnsi="Arial" w:cs="Arial"/>
-          <w:b/>
-          <w:bCs/>
-          <w:color w:val="000090"/>
-          <w:sz w:val="16"/>
-          <w:szCs w:val="16"/>
-        </w:rPr>
-        <w:t>, 1982</w:t>
+          <w:color w:val="001279"/>
+          <w:sz w:val="16"/>
+          <w:szCs w:val="16"/>
+        </w:rPr>
+        <w:t>Bachelor of Arts in Philosophy, 1982</w:t>
       </w:r>
     </w:p>
     <w:p>
@@ -396,7 +379,7 @@
       <w:r>
         <w:rPr>
           <w:rFonts w:ascii="Arial" w:hAnsi="Arial" w:cs="Arial"/>
-          <w:color w:val="000090"/>
+          <w:color w:val="001279"/>
           <w:sz w:val="16"/>
           <w:szCs w:val="16"/>
         </w:rPr>
@@ -422,7 +405,7 @@
           <w:rFonts w:ascii="Arial" w:hAnsi="Arial" w:cs="Arial"/>
           <w:b/>
           <w:bCs/>
-          <w:color w:val="000090"/>
+          <w:color w:val="001279"/>
           <w:sz w:val="18"/>
           <w:szCs w:val="18"/>
           <w:u w:val="single"/>
@@ -451,7 +434,7 @@
           <w:rFonts w:ascii="Arial" w:hAnsi="Arial" w:cs="Arial"/>
           <w:b/>
           <w:bCs/>
-          <w:color w:val="000090"/>
+          <w:color w:val="001279"/>
           <w:sz w:val="16"/>
           <w:szCs w:val="16"/>
         </w:rPr>
@@ -464,7 +447,7 @@
           <w:bCs/>
           <w:i/>
           <w:iCs/>
-          <w:color w:val="000090"/>
+          <w:color w:val="001279"/>
           <w:sz w:val="16"/>
           <w:szCs w:val="16"/>
         </w:rPr>
@@ -475,7 +458,7 @@
           <w:rFonts w:ascii="Arial" w:hAnsi="Arial" w:cs="Arial"/>
           <w:b/>
           <w:bCs/>
-          <w:color w:val="000090"/>
+          <w:color w:val="001279"/>
           <w:sz w:val="16"/>
           <w:szCs w:val="16"/>
         </w:rPr>
@@ -498,7 +481,7 @@
       <w:r>
         <w:rPr>
           <w:rFonts w:ascii="Arial" w:hAnsi="Arial" w:cs="Arial"/>
-          <w:color w:val="000090"/>
+          <w:color w:val="001279"/>
           <w:sz w:val="16"/>
           <w:szCs w:val="16"/>
         </w:rPr>
@@ -540,25 +523,42 @@
           <w:rFonts w:ascii="Arial" w:hAnsi="Arial" w:cs="Arial"/>
           <w:b/>
           <w:bCs/>
+          <w:color w:val="001279"/>
+          <w:sz w:val="18"/>
+          <w:szCs w:val="18"/>
+          <w:u w:val="single"/>
+        </w:rPr>
+        <w:t xml:space="preserve">Technical </w:t>
+      </w:r>
+      <w:r>
+        <w:rPr>
+          <w:rFonts w:ascii="Arial" w:hAnsi="Arial" w:cs="Arial"/>
+          <w:b/>
+          <w:bCs/>
+          <w:color w:val="001279"/>
+          <w:sz w:val="18"/>
+          <w:szCs w:val="18"/>
+          <w:u w:val="single"/>
+        </w:rPr>
+        <w:t>Skills</w:t>
+      </w:r>
+    </w:p>
+    <w:p>
+      <w:pPr>
+        <w:pStyle w:val="Body"/>
+        <w:ind w:left="720" w:hanging="720"/>
+        <w:jc w:val="both"/>
+        <w:outlineLvl w:val="0"/>
+        <w:rPr>
+          <w:rFonts w:ascii="Arial" w:hAnsi="Arial" w:cs="Arial"/>
+          <w:b/>
+          <w:bCs/>
           <w:color w:val="000090"/>
           <w:sz w:val="18"/>
           <w:szCs w:val="18"/>
           <w:u w:val="single"/>
         </w:rPr>
-        <w:t xml:space="preserve">Technical </w:t>
-      </w:r>
-      <w:r>
-        <w:rPr>
-          <w:rFonts w:ascii="Arial" w:hAnsi="Arial" w:cs="Arial"/>
-          <w:b/>
-          <w:bCs/>
-          <w:color w:val="000090"/>
-          <w:sz w:val="18"/>
-          <w:szCs w:val="18"/>
-          <w:u w:val="single"/>
-        </w:rPr>
-        <w:t>Skills</w:t>
-      </w:r>
+      </w:pPr>
     </w:p>
     <w:p>
       <w:pPr>
@@ -568,14 +568,42 @@
         <w:outlineLvl w:val="0"/>
         <w:rPr>
           <w:rFonts w:ascii="Arial" w:hAnsi="Arial" w:cs="Arial"/>
-          <w:b/>
-          <w:bCs/>
           <w:color w:val="000090"/>
           <w:sz w:val="18"/>
           <w:szCs w:val="18"/>
-          <w:u w:val="single"/>
-        </w:rPr>
-      </w:pPr>
+        </w:rPr>
+      </w:pPr>
+      <w:r>
+        <w:rPr>
+          <w:rFonts w:ascii="Arial" w:hAnsi="Arial" w:cs="Arial"/>
+          <w:b/>
+          <w:bCs/>
+          <w:color w:val="001279"/>
+          <w:sz w:val="16"/>
+          <w:szCs w:val="16"/>
+        </w:rPr>
+        <w:t>Language</w:t>
+      </w:r>
+      <w:r>
+        <w:rPr>
+          <w:rFonts w:ascii="Arial" w:hAnsi="Arial" w:cs="Arial"/>
+          <w:b/>
+          <w:bCs/>
+          <w:color w:val="001279"/>
+          <w:sz w:val="18"/>
+          <w:szCs w:val="18"/>
+        </w:rPr>
+        <w:t xml:space="preserve">s: </w:t>
+      </w:r>
+      <w:r>
+        <w:rPr>
+          <w:rFonts w:ascii="Arial" w:hAnsi="Arial" w:cs="Arial"/>
+          <w:color w:val="001279"/>
+          <w:sz w:val="18"/>
+          <w:szCs w:val="18"/>
+        </w:rPr>
+        <w:t>Python, C, C++, Perl, Elixir, Haskell, PL/SQL, C#</w:t>
+      </w:r>
     </w:p>
     <w:p>
       <w:pPr>
@@ -595,31 +623,20 @@
           <w:rFonts w:ascii="Arial" w:hAnsi="Arial" w:cs="Arial"/>
           <w:b/>
           <w:bCs/>
-          <w:color w:val="000090"/>
-          <w:sz w:val="16"/>
-          <w:szCs w:val="16"/>
-        </w:rPr>
-        <w:t>Language</w:t>
-      </w:r>
-      <w:r>
-        <w:rPr>
-          <w:rFonts w:ascii="Arial" w:hAnsi="Arial" w:cs="Arial"/>
-          <w:b/>
-          <w:bCs/>
-          <w:color w:val="000090"/>
+          <w:color w:val="001279"/>
+          <w:sz w:val="16"/>
+          <w:szCs w:val="16"/>
+        </w:rPr>
+        <w:t>Frameworks:</w:t>
+      </w:r>
+      <w:r>
+        <w:rPr>
+          <w:rFonts w:ascii="Arial" w:hAnsi="Arial" w:cs="Arial"/>
+          <w:color w:val="001279"/>
           <w:sz w:val="18"/>
           <w:szCs w:val="18"/>
         </w:rPr>
-        <w:t xml:space="preserve">s: </w:t>
-      </w:r>
-      <w:r>
-        <w:rPr>
-          <w:rFonts w:ascii="Arial" w:hAnsi="Arial" w:cs="Arial"/>
-          <w:color w:val="000090"/>
-          <w:sz w:val="18"/>
-          <w:szCs w:val="18"/>
-        </w:rPr>
-        <w:t>Python, C, C++, Perl, Elixir, Haskell, PL/SQL, C#</w:t>
+        <w:t xml:space="preserve"> Django, Flask, Phoenix, SQLAlchemy,</w:t>
       </w:r>
     </w:p>
     <w:p>
@@ -640,20 +657,20 @@
           <w:rFonts w:ascii="Arial" w:hAnsi="Arial" w:cs="Arial"/>
           <w:b/>
           <w:bCs/>
-          <w:color w:val="000090"/>
-          <w:sz w:val="16"/>
-          <w:szCs w:val="16"/>
-        </w:rPr>
-        <w:t>Frameworks:</w:t>
-      </w:r>
-      <w:r>
-        <w:rPr>
-          <w:rFonts w:ascii="Arial" w:hAnsi="Arial" w:cs="Arial"/>
-          <w:color w:val="000090"/>
+          <w:color w:val="001279"/>
+          <w:sz w:val="16"/>
+          <w:szCs w:val="16"/>
+        </w:rPr>
+        <w:t>Databases:</w:t>
+      </w:r>
+      <w:r>
+        <w:rPr>
+          <w:rFonts w:ascii="Arial" w:hAnsi="Arial" w:cs="Arial"/>
+          <w:color w:val="001279"/>
           <w:sz w:val="18"/>
           <w:szCs w:val="18"/>
         </w:rPr>
-        <w:t xml:space="preserve"> Django, Flask, Phoenix, SQLAlchemy,</w:t>
+        <w:t xml:space="preserve"> PostgreSQL, MySQL, Oracle, MongoDB, MariaDB, Redis, Informix, DB2</w:t>
       </w:r>
     </w:p>
     <w:p>
@@ -674,20 +691,20 @@
           <w:rFonts w:ascii="Arial" w:hAnsi="Arial" w:cs="Arial"/>
           <w:b/>
           <w:bCs/>
-          <w:color w:val="000090"/>
-          <w:sz w:val="16"/>
-          <w:szCs w:val="16"/>
-        </w:rPr>
-        <w:t>Databases:</w:t>
-      </w:r>
-      <w:r>
-        <w:rPr>
-          <w:rFonts w:ascii="Arial" w:hAnsi="Arial" w:cs="Arial"/>
-          <w:color w:val="000090"/>
+          <w:color w:val="001279"/>
+          <w:sz w:val="16"/>
+          <w:szCs w:val="16"/>
+        </w:rPr>
+        <w:t>Platforms:</w:t>
+      </w:r>
+      <w:r>
+        <w:rPr>
+          <w:rFonts w:ascii="Arial" w:hAnsi="Arial" w:cs="Arial"/>
+          <w:color w:val="001279"/>
           <w:sz w:val="18"/>
           <w:szCs w:val="18"/>
         </w:rPr>
-        <w:t xml:space="preserve"> PostgreSQL, MySQL, Oracle, MongoDB, MariaDB, Redis, Informix, DB2</w:t>
+        <w:t xml:space="preserve"> Linux, Unix, macOS, Solaris, AIX, Windows</w:t>
       </w:r>
     </w:p>
     <w:p>
@@ -708,59 +725,25 @@
           <w:rFonts w:ascii="Arial" w:hAnsi="Arial" w:cs="Arial"/>
           <w:b/>
           <w:bCs/>
-          <w:color w:val="000090"/>
-          <w:sz w:val="16"/>
-          <w:szCs w:val="16"/>
-        </w:rPr>
-        <w:t>Platforms:</w:t>
-      </w:r>
-      <w:r>
-        <w:rPr>
-          <w:rFonts w:ascii="Arial" w:hAnsi="Arial" w:cs="Arial"/>
-          <w:color w:val="000090"/>
+          <w:color w:val="001279"/>
+          <w:sz w:val="16"/>
+          <w:szCs w:val="16"/>
+        </w:rPr>
+        <w:t>Tools &amp; Technologies:</w:t>
+      </w:r>
+      <w:r>
+        <w:rPr>
+          <w:rFonts w:ascii="Arial" w:hAnsi="Arial" w:cs="Arial"/>
+          <w:color w:val="001279"/>
           <w:sz w:val="18"/>
           <w:szCs w:val="18"/>
         </w:rPr>
-        <w:t xml:space="preserve"> Linux, Unix, macOS, Solaris, AIX, Windows</w:t>
-      </w:r>
-    </w:p>
-    <w:p>
-      <w:pPr>
-        <w:pStyle w:val="Body"/>
-        <w:ind w:left="720" w:hanging="720"/>
-        <w:jc w:val="both"/>
-        <w:outlineLvl w:val="0"/>
-        <w:rPr>
-          <w:rFonts w:ascii="Arial" w:hAnsi="Arial" w:cs="Arial"/>
-          <w:color w:val="000090"/>
-          <w:sz w:val="18"/>
-          <w:szCs w:val="18"/>
-        </w:rPr>
-      </w:pPr>
-      <w:r>
-        <w:rPr>
-          <w:rFonts w:ascii="Arial" w:hAnsi="Arial" w:cs="Arial"/>
-          <w:b/>
-          <w:bCs/>
-          <w:color w:val="000090"/>
-          <w:sz w:val="16"/>
-          <w:szCs w:val="16"/>
-        </w:rPr>
-        <w:t>Tools &amp; Technologies:</w:t>
-      </w:r>
-      <w:r>
-        <w:rPr>
-          <w:rFonts w:ascii="Arial" w:hAnsi="Arial" w:cs="Arial"/>
-          <w:color w:val="000090"/>
-          <w:sz w:val="18"/>
-          <w:szCs w:val="18"/>
-        </w:rPr>
         <w:t xml:space="preserve"> Git, Docker, Node.js, Shell Scripting, RESTful APIs.</w:t>
       </w:r>
       <w:r>
         <w:rPr>
           <w:rFonts w:ascii="Arial" w:hAnsi="Arial" w:cs="Arial"/>
-          <w:color w:val="000090"/>
+          <w:color w:val="001279"/>
           <w:sz w:val="18"/>
           <w:szCs w:val="18"/>
         </w:rPr>
@@ -797,7 +780,7 @@
         <w:rPr>
           <w:rFonts w:ascii="Arial" w:hAnsi="Arial" w:cs="Arial"/>
           <w:b/>
-          <w:color w:val="000090"/>
+          <w:color w:val="001279"/>
           <w:sz w:val="18"/>
           <w:szCs w:val="18"/>
           <w:u w:val="single"/>
@@ -808,7 +791,7 @@
         <w:rPr>
           <w:rFonts w:ascii="Arial" w:hAnsi="Arial" w:cs="Arial"/>
           <w:b/>
-          <w:color w:val="000090"/>
+          <w:color w:val="001279"/>
           <w:sz w:val="18"/>
           <w:szCs w:val="18"/>
         </w:rPr>
@@ -844,7 +827,7 @@
         <w:rPr>
           <w:rFonts w:ascii="Arial" w:hAnsi="Arial" w:cs="Arial"/>
           <w:b/>
-          <w:color w:val="000090"/>
+          <w:color w:val="001279"/>
           <w:sz w:val="16"/>
           <w:szCs w:val="16"/>
         </w:rPr>
@@ -869,6 +852,7 @@
             <w:sz w:val="16"/>
             <w:szCs w:val="16"/>
             <w:shd w:val="clear" w:color="auto" w:fill="FFFFFF"/>
+            <w:color w:val="0563C1"/>
           </w:rPr>
           <w:t>https://emrts.us/</w:t>
         </w:r>
@@ -898,7 +882,7 @@
       <w:r>
         <w:rPr>
           <w:rFonts w:ascii="Arial" w:eastAsia="Times New Roman" w:hAnsi="Arial" w:cs="Arial"/>
-          <w:color w:val="1F4E79" w:themeColor="accent5" w:themeShade="80"/>
+          <w:color w:val="001279"/>
           <w:sz w:val="16"/>
           <w:szCs w:val="16"/>
         </w:rPr>
@@ -1417,17 +1401,7 @@
           <w:sz w:val="16"/>
           <w:szCs w:val="16"/>
         </w:rPr>
-        <w:t>January 2012 – March 2012: </w:t>
-      </w:r>
-      <w:bookmarkStart w:id="0" w:name="_GoBack"/>
-      <w:r>
-        <w:rPr>
-          <w:rFonts w:ascii="Arial" w:hAnsi="Arial" w:cs="Arial"/>
-          <w:color w:val="001279"/>
-          <w:sz w:val="16"/>
-          <w:szCs w:val="16"/>
-        </w:rPr>
-        <w:t>Focused on electronic medical records, claims processing, and provider enrollment applications on GNU/Linux. Developed tools for handling JSON data and extended the application’s support for additional records processing.</w:t>
+        <w:t>January 2012 – March 2012: Focused on electronic medical records, claims processing, and provider enrollment applications on GNU/Linux. Developed tools for handling JSON data and extended the application’s support for additional records processing.</w:t>
       </w:r>
       <w:r>
         <w:rPr>
@@ -1437,15 +1411,6 @@
           <w:szCs w:val="16"/>
         </w:rPr>
         <w:br/>
-      </w:r>
-      <w:bookmarkEnd w:id="0"/>
-      <w:r>
-        <w:rPr>
-          <w:rFonts w:ascii="Arial" w:hAnsi="Arial" w:cs="Arial"/>
-          <w:color w:val="001279"/>
-          <w:sz w:val="16"/>
-          <w:szCs w:val="16"/>
-        </w:rPr>
         <w:t>Tech: Python, Django, JavaScript (jQuery, Node.js) | Databases: MariaDB, PostgreSQL, Redis</w:t>
       </w:r>
     </w:p>
@@ -1572,7 +1537,7 @@
           <w:rFonts w:ascii="Tahoma" w:hAnsi="Tahoma" w:cs="Arial"/>
           <w:b/>
           <w:bCs/>
-          <w:color w:val="000090"/>
+          <w:color w:val="001279"/>
           <w:sz w:val="18"/>
           <w:szCs w:val="18"/>
         </w:rPr>
@@ -1598,7 +1563,7 @@
           <w:rFonts w:ascii="Arial" w:hAnsi="Arial" w:cs="Arial"/>
           <w:b/>
           <w:bCs/>
-          <w:color w:val="002060"/>
+          <w:color w:val="001279"/>
           <w:sz w:val="16"/>
           <w:szCs w:val="16"/>
         </w:rPr>
@@ -1620,7 +1585,7 @@
       <w:r>
         <w:rPr>
           <w:rFonts w:ascii="Arial" w:hAnsi="Arial" w:cs="Arial"/>
-          <w:color w:val="002060"/>
+          <w:color w:val="001279"/>
           <w:sz w:val="16"/>
           <w:szCs w:val="16"/>
         </w:rPr>
@@ -1658,7 +1623,7 @@
         <w:rPr>
           <w:rFonts w:ascii="Arial" w:hAnsi="Arial" w:cs="Arial"/>
           <w:b/>
-          <w:color w:val="000090"/>
+          <w:color w:val="001279"/>
           <w:sz w:val="16"/>
           <w:szCs w:val="16"/>
         </w:rPr>
@@ -1668,7 +1633,7 @@
         <w:rPr>
           <w:rFonts w:ascii="Arial" w:hAnsi="Arial" w:cs="Arial"/>
           <w:b/>
-          <w:color w:val="000090"/>
+          <w:color w:val="001279"/>
           <w:sz w:val="16"/>
           <w:szCs w:val="16"/>
         </w:rPr>
@@ -1691,7 +1656,7 @@
           <w:rFonts w:ascii="Arial" w:hAnsi="Arial" w:cs="Arial"/>
           <w:b/>
           <w:bCs/>
-          <w:color w:val="002060"/>
+          <w:color w:val="001279"/>
           <w:sz w:val="16"/>
           <w:szCs w:val="16"/>
         </w:rPr>
@@ -1700,7 +1665,7 @@
       <w:r>
         <w:rPr>
           <w:rFonts w:ascii="Arial" w:hAnsi="Arial" w:cs="Arial"/>
-          <w:color w:val="002060"/>
+          <w:color w:val="001279"/>
           <w:sz w:val="16"/>
           <w:szCs w:val="16"/>
         </w:rPr>
@@ -1711,9 +1676,9 @@
           <w:rPr>
             <w:rStyle w:val="Hyperlink"/>
             <w:rFonts w:ascii="Arial" w:hAnsi="Arial" w:cs="Arial"/>
-            <w:color w:val="002060"/>
             <w:sz w:val="16"/>
             <w:szCs w:val="16"/>
+            <w:color w:val="0563C1"/>
           </w:rPr>
           <w:t>https://www.orchid-ortho.com</w:t>
         </w:r>
@@ -1734,7 +1699,7 @@
       <w:r>
         <w:rPr>
           <w:rFonts w:ascii="Arial" w:hAnsi="Arial" w:cs="Arial"/>
-          <w:color w:val="002060"/>
+          <w:color w:val="001279"/>
           <w:sz w:val="16"/>
           <w:szCs w:val="16"/>
         </w:rPr>
@@ -1769,6 +1734,7 @@
           <w:rFonts w:ascii="Arial" w:hAnsi="Arial" w:cs="Arial"/>
           <w:b/>
           <w:bCs/>
+          <w:color w:val="001279"/>
           <w:sz w:val="16"/>
           <w:szCs w:val="16"/>
         </w:rPr>
@@ -1788,6 +1754,7 @@
       <w:r>
         <w:rPr>
           <w:rFonts w:ascii="Arial" w:hAnsi="Arial" w:cs="Arial"/>
+          <w:color w:val="001279"/>
           <w:sz w:val="16"/>
           <w:szCs w:val="16"/>
         </w:rPr>
@@ -1798,6 +1765,7 @@
           <w:rFonts w:ascii="Arial" w:hAnsi="Arial" w:cs="Arial"/>
           <w:b/>
           <w:bCs/>
+          <w:color w:val="001279"/>
           <w:sz w:val="16"/>
           <w:szCs w:val="16"/>
         </w:rPr>
@@ -1806,6 +1774,7 @@
       <w:r>
         <w:rPr>
           <w:rFonts w:ascii="Arial" w:hAnsi="Arial" w:cs="Arial"/>
+          <w:color w:val="001279"/>
           <w:sz w:val="16"/>
           <w:szCs w:val="16"/>
         </w:rPr>
@@ -1818,6 +1787,7 @@
             <w:rFonts w:ascii="Arial" w:hAnsi="Arial" w:cs="Arial"/>
             <w:sz w:val="16"/>
             <w:szCs w:val="16"/>
+            <w:color w:val="0563C1"/>
           </w:rPr>
           <w:t>https://www.cspire.com</w:t>
         </w:r>
@@ -1836,7 +1806,7 @@
       <w:r>
         <w:rPr>
           <w:rFonts w:ascii="Arial" w:hAnsi="Arial" w:cs="Arial"/>
-          <w:color w:val="002060"/>
+          <w:color w:val="001279"/>
           <w:sz w:val="16"/>
           <w:szCs w:val="16"/>
         </w:rPr>
@@ -1857,6 +1827,7 @@
           <w:rFonts w:ascii="Arial" w:hAnsi="Arial" w:cs="Arial"/>
           <w:b/>
           <w:bCs/>
+          <w:color w:val="001279"/>
           <w:sz w:val="16"/>
           <w:szCs w:val="16"/>
         </w:rPr>
@@ -1865,6 +1836,7 @@
       <w:r>
         <w:rPr>
           <w:rFonts w:ascii="Arial" w:hAnsi="Arial" w:cs="Arial"/>
+          <w:color w:val="001279"/>
           <w:sz w:val="16"/>
           <w:szCs w:val="16"/>
         </w:rPr>
@@ -1885,6 +1857,7 @@
           <w:rFonts w:ascii="Arial" w:hAnsi="Arial" w:cs="Arial"/>
           <w:b/>
           <w:bCs/>
+          <w:color w:val="001279"/>
           <w:sz w:val="16"/>
           <w:szCs w:val="16"/>
         </w:rPr>
@@ -1893,6 +1866,7 @@
       <w:r>
         <w:rPr>
           <w:rFonts w:ascii="Arial" w:hAnsi="Arial" w:cs="Arial"/>
+          <w:color w:val="001279"/>
           <w:sz w:val="16"/>
           <w:szCs w:val="16"/>
         </w:rPr>
@@ -1905,6 +1879,7 @@
             <w:rFonts w:ascii="Arial" w:hAnsi="Arial" w:cs="Arial"/>
             <w:sz w:val="16"/>
             <w:szCs w:val="16"/>
+            <w:color w:val="0563C1"/>
           </w:rPr>
           <w:t>https://corporate.lowes.com</w:t>
         </w:r>
@@ -1922,6 +1897,7 @@
       <w:r>
         <w:rPr>
           <w:rFonts w:ascii="Arial" w:hAnsi="Arial" w:cs="Arial"/>
+          <w:color w:val="001279"/>
           <w:sz w:val="16"/>
           <w:szCs w:val="16"/>
         </w:rPr>
@@ -1945,6 +1921,7 @@
           <w:rFonts w:ascii="Arial" w:hAnsi="Arial" w:cs="Arial"/>
           <w:b/>
           <w:bCs/>
+          <w:color w:val="001279"/>
           <w:sz w:val="16"/>
           <w:szCs w:val="16"/>
         </w:rPr>
@@ -1967,6 +1944,7 @@
           <w:rFonts w:ascii="Arial" w:hAnsi="Arial" w:cs="Arial"/>
           <w:b/>
           <w:bCs/>
+          <w:color w:val="001279"/>
           <w:sz w:val="16"/>
           <w:szCs w:val="16"/>
         </w:rPr>
@@ -1987,6 +1965,7 @@
       <w:r>
         <w:rPr>
           <w:rFonts w:ascii="Arial" w:hAnsi="Arial" w:cs="Arial"/>
+          <w:color w:val="001279"/>
           <w:sz w:val="16"/>
           <w:szCs w:val="16"/>
         </w:rPr>
@@ -1995,6 +1974,7 @@
       <w:r>
         <w:rPr>
           <w:rFonts w:ascii="Arial" w:hAnsi="Arial" w:cs="Arial"/>
+          <w:color w:val="001279"/>
           <w:sz w:val="16"/>
           <w:szCs w:val="16"/>
         </w:rPr>
@@ -2005,6 +1985,7 @@
           <w:rFonts w:ascii="Arial" w:hAnsi="Arial" w:cs="Arial"/>
           <w:b/>
           <w:bCs/>
+          <w:color w:val="001279"/>
           <w:sz w:val="16"/>
           <w:szCs w:val="16"/>
         </w:rPr>
@@ -2013,6 +1994,7 @@
       <w:r>
         <w:rPr>
           <w:rFonts w:ascii="Arial" w:hAnsi="Arial" w:cs="Arial"/>
+          <w:color w:val="001279"/>
           <w:sz w:val="16"/>
           <w:szCs w:val="16"/>
         </w:rPr>
@@ -2047,6 +2029,7 @@
           <w:rFonts w:ascii="Arial" w:hAnsi="Arial" w:cs="Arial"/>
           <w:b/>
           <w:bCs/>
+          <w:color w:val="001279"/>
           <w:sz w:val="16"/>
           <w:szCs w:val="16"/>
         </w:rPr>
@@ -2069,6 +2052,7 @@
           <w:rFonts w:ascii="Arial" w:hAnsi="Arial" w:cs="Arial"/>
           <w:b/>
           <w:bCs/>
+          <w:color w:val="001279"/>
           <w:sz w:val="16"/>
           <w:szCs w:val="16"/>
         </w:rPr>
@@ -2089,6 +2073,7 @@
       <w:r>
         <w:rPr>
           <w:rFonts w:ascii="Arial" w:hAnsi="Arial" w:cs="Arial"/>
+          <w:color w:val="001279"/>
           <w:sz w:val="16"/>
           <w:szCs w:val="16"/>
         </w:rPr>
@@ -2104,17 +2089,17 @@
         </w:numPr>
         <w:rPr>
           <w:rFonts w:ascii="Arial" w:hAnsi="Arial" w:cs="Arial"/>
-          <w:sz w:val="16"/>
-          <w:szCs w:val="16"/>
           <w:color w:val="1F3763"/>
-        </w:rPr>
-      </w:pPr>
-      <w:r>
-        <w:rPr>
-          <w:rFonts w:ascii="Arial" w:hAnsi="Arial" w:cs="Arial"/>
-          <w:sz w:val="16"/>
-          <w:szCs w:val="16"/>
-          <w:color w:val="1F3763"/>
+          <w:sz w:val="16"/>
+          <w:szCs w:val="16"/>
+        </w:rPr>
+      </w:pPr>
+      <w:r>
+        <w:rPr>
+          <w:rFonts w:ascii="Arial" w:hAnsi="Arial" w:cs="Arial"/>
+          <w:color w:val="001279"/>
+          <w:sz w:val="16"/>
+          <w:szCs w:val="16"/>
         </w:rPr>
         <w:t>Refactored and extended a SOAP server (written in C) for enhanced data exchange within the Medicaid Management Information System (MMIS).</w:t>
       </w:r>
@@ -2128,17 +2113,17 @@
         </w:numPr>
         <w:rPr>
           <w:rFonts w:ascii="Arial" w:hAnsi="Arial" w:cs="Arial"/>
-          <w:sz w:val="16"/>
-          <w:szCs w:val="16"/>
           <w:color w:val="1F3763"/>
-        </w:rPr>
-      </w:pPr>
-      <w:r>
-        <w:rPr>
-          <w:rFonts w:ascii="Arial" w:hAnsi="Arial" w:cs="Arial"/>
-          <w:sz w:val="16"/>
-          <w:szCs w:val="16"/>
-          <w:color w:val="1F3763"/>
+          <w:sz w:val="16"/>
+          <w:szCs w:val="16"/>
+        </w:rPr>
+      </w:pPr>
+      <w:r>
+        <w:rPr>
+          <w:rFonts w:ascii="Arial" w:hAnsi="Arial" w:cs="Arial"/>
+          <w:color w:val="001279"/>
+          <w:sz w:val="16"/>
+          <w:szCs w:val="16"/>
         </w:rPr>
         <w:t>Developed monthly report generators for medical claims processing.</w:t>
       </w:r>
@@ -2152,17 +2137,17 @@
         </w:numPr>
         <w:rPr>
           <w:rFonts w:ascii="Arial" w:hAnsi="Arial" w:cs="Arial"/>
-          <w:sz w:val="16"/>
-          <w:szCs w:val="16"/>
           <w:color w:val="1F3763"/>
-        </w:rPr>
-      </w:pPr>
-      <w:r>
-        <w:rPr>
-          <w:rFonts w:ascii="Arial" w:hAnsi="Arial" w:cs="Arial"/>
-          <w:sz w:val="16"/>
-          <w:szCs w:val="16"/>
-          <w:color w:val="1F3763"/>
+          <w:sz w:val="16"/>
+          <w:szCs w:val="16"/>
+        </w:rPr>
+      </w:pPr>
+      <w:r>
+        <w:rPr>
+          <w:rFonts w:ascii="Arial" w:hAnsi="Arial" w:cs="Arial"/>
+          <w:color w:val="001279"/>
+          <w:sz w:val="16"/>
+          <w:szCs w:val="16"/>
         </w:rPr>
         <w:t>Ported the entire application codebase to a new 64-bit Solaris network with updated compilers and Oracle database version.</w:t>
       </w:r>
@@ -2176,59 +2161,50 @@
         </w:numPr>
         <w:rPr>
           <w:rFonts w:ascii="Arial" w:hAnsi="Arial" w:cs="Arial"/>
-          <w:sz w:val="16"/>
-          <w:szCs w:val="16"/>
           <w:color w:val="1F3763"/>
-        </w:rPr>
-      </w:pPr>
-      <w:r>
-        <w:rPr>
-          <w:rFonts w:ascii="Arial" w:hAnsi="Arial" w:cs="Arial"/>
-          <w:sz w:val="16"/>
-          <w:szCs w:val="16"/>
+          <w:sz w:val="16"/>
+          <w:szCs w:val="16"/>
+        </w:rPr>
+      </w:pPr>
+      <w:r>
+        <w:rPr>
+          <w:rFonts w:ascii="Arial" w:hAnsi="Arial" w:cs="Arial"/>
+          <w:color w:val="001279"/>
+          <w:sz w:val="16"/>
+          <w:szCs w:val="16"/>
+        </w:rPr>
+        <w:t>Contributed to technical writing and documentation.</w:t>
+      </w:r>
+    </w:p>
+    <w:p>
+      <w:pPr>
+        <w:pStyle w:val="FirstParagraph"/>
+        <w:rPr>
+          <w:rFonts w:ascii="Arial" w:hAnsi="Arial" w:cs="Arial"/>
           <w:color w:val="1F3763"/>
-        </w:rPr>
-        <w:t>Contributed to technical writing and documentation.</w:t>
-      </w:r>
-    </w:p>
-    <w:p>
-      <w:pPr>
-        <w:pStyle w:val="FirstParagraph"/>
-        <w:rPr>
-          <w:rFonts w:ascii="Arial" w:hAnsi="Arial" w:cs="Arial"/>
-          <w:sz w:val="16"/>
-          <w:szCs w:val="16"/>
-          <w:color w:val="1F3763"/>
-        </w:rPr>
-      </w:pPr>
-      <w:r>
-        <w:rPr>
-          <w:rFonts w:ascii="Arial" w:hAnsi="Arial" w:cs="Arial"/>
-          <w:b/>
-          <w:bCs/>
-          <w:sz w:val="16"/>
-          <w:szCs w:val="16"/>
-          <w:color w:val="1F3763"/>
+          <w:sz w:val="16"/>
+          <w:szCs w:val="16"/>
+        </w:rPr>
+      </w:pPr>
+      <w:r>
+        <w:rPr>
+          <w:rFonts w:ascii="Arial" w:hAnsi="Arial" w:cs="Arial"/>
+          <w:b/>
+          <w:bCs/>
+          <w:color w:val="001279"/>
+          <w:sz w:val="16"/>
+          <w:szCs w:val="16"/>
         </w:rPr>
         <w:t>Tech:</w:t>
       </w:r>
       <w:r>
         <w:rPr>
           <w:rFonts w:ascii="Arial" w:hAnsi="Arial" w:cs="Arial"/>
-          <w:sz w:val="16"/>
-          <w:szCs w:val="16"/>
-          <w:color w:val="1F3763"/>
-        </w:rPr>
-        <w:t xml:space="preserve"> C, PL/SQL, SOAP, Oracle</w:t>
-      </w:r>
-      <w:r>
-        <w:rPr>
-          <w:rFonts w:ascii="Arial" w:hAnsi="Arial" w:cs="Arial"/>
-          <w:sz w:val="16"/>
-          <w:szCs w:val="16"/>
-          <w:color w:val="1F3763"/>
-        </w:rPr>
-        <w:t>, Solaris</w:t>
+          <w:color w:val="001279"/>
+          <w:sz w:val="16"/>
+          <w:szCs w:val="16"/>
+        </w:rPr>
+        <w:t xml:space="preserve"> C, PL/SQL, SOAP, Oracle, Solaris</w:t>
       </w:r>
     </w:p>
     <w:p>
@@ -2247,6 +2223,7 @@
           <w:rFonts w:ascii="Arial" w:hAnsi="Arial" w:cs="Arial"/>
           <w:b/>
           <w:bCs/>
+          <w:color w:val="001279"/>
           <w:sz w:val="16"/>
           <w:szCs w:val="16"/>
         </w:rPr>
@@ -2269,6 +2246,7 @@
           <w:rFonts w:ascii="Arial" w:hAnsi="Arial" w:cs="Arial"/>
           <w:b/>
           <w:bCs/>
+          <w:color w:val="001279"/>
           <w:sz w:val="16"/>
           <w:szCs w:val="16"/>
         </w:rPr>
@@ -2289,7 +2267,7 @@
       <w:r>
         <w:rPr>
           <w:rFonts w:ascii="Arial" w:hAnsi="Arial" w:cs="Arial"/>
-          <w:color w:val="002060"/>
+          <w:color w:val="001279"/>
           <w:sz w:val="16"/>
           <w:szCs w:val="16"/>
         </w:rPr>
@@ -2324,6 +2302,7 @@
           <w:rFonts w:ascii="Arial" w:hAnsi="Arial" w:cs="Arial"/>
           <w:b/>
           <w:bCs/>
+          <w:color w:val="001279"/>
           <w:sz w:val="16"/>
           <w:szCs w:val="16"/>
         </w:rPr>
@@ -2344,6 +2323,7 @@
           <w:rFonts w:ascii="Arial" w:hAnsi="Arial" w:cs="Arial"/>
           <w:b/>
           <w:bCs/>
+          <w:color w:val="001279"/>
           <w:sz w:val="16"/>
           <w:szCs w:val="16"/>
         </w:rPr>
@@ -2354,6 +2334,7 @@
           <w:rFonts w:ascii="Arial" w:hAnsi="Arial" w:cs="Arial"/>
           <w:b/>
           <w:bCs/>
+          <w:color w:val="001279"/>
           <w:sz w:val="16"/>
           <w:szCs w:val="16"/>
         </w:rPr>
@@ -2362,6 +2343,7 @@
       <w:r>
         <w:rPr>
           <w:rFonts w:ascii="Arial" w:hAnsi="Arial" w:cs="Arial"/>
+          <w:color w:val="001279"/>
           <w:sz w:val="16"/>
           <w:szCs w:val="16"/>
         </w:rPr>
@@ -2370,6 +2352,7 @@
       <w:r>
         <w:rPr>
           <w:rFonts w:ascii="Arial" w:hAnsi="Arial" w:cs="Arial"/>
+          <w:color w:val="001279"/>
           <w:sz w:val="16"/>
           <w:szCs w:val="16"/>
         </w:rPr>
@@ -2380,6 +2363,7 @@
           <w:rFonts w:ascii="Arial" w:hAnsi="Arial" w:cs="Arial"/>
           <w:b/>
           <w:bCs/>
+          <w:color w:val="001279"/>
           <w:sz w:val="16"/>
           <w:szCs w:val="16"/>
         </w:rPr>
@@ -2388,6 +2372,7 @@
       <w:r>
         <w:rPr>
           <w:rFonts w:ascii="Arial" w:hAnsi="Arial" w:cs="Arial"/>
+          <w:color w:val="001279"/>
           <w:sz w:val="16"/>
           <w:szCs w:val="16"/>
         </w:rPr>
@@ -2424,6 +2409,7 @@
           <w:rFonts w:ascii="Arial" w:hAnsi="Arial" w:cs="Arial"/>
           <w:b/>
           <w:bCs/>
+          <w:color w:val="001279"/>
           <w:sz w:val="16"/>
           <w:szCs w:val="16"/>
         </w:rPr>
@@ -2444,6 +2430,7 @@
           <w:rFonts w:ascii="Arial" w:hAnsi="Arial" w:cs="Arial"/>
           <w:b/>
           <w:bCs/>
+          <w:color w:val="001279"/>
           <w:sz w:val="16"/>
           <w:szCs w:val="16"/>
         </w:rPr>
@@ -2452,6 +2439,7 @@
       <w:r>
         <w:rPr>
           <w:rFonts w:ascii="Arial" w:hAnsi="Arial" w:cs="Arial"/>
+          <w:color w:val="001279"/>
           <w:sz w:val="16"/>
           <w:szCs w:val="16"/>
         </w:rPr>
@@ -2464,6 +2452,7 @@
             <w:rFonts w:ascii="Arial" w:hAnsi="Arial" w:cs="Arial"/>
             <w:sz w:val="16"/>
             <w:szCs w:val="16"/>
+            <w:color w:val="0563C1"/>
           </w:rPr>
           <w:t>https://www.lexmark.com/en_us.html</w:t>
         </w:r>
@@ -2481,6 +2470,7 @@
       <w:r>
         <w:rPr>
           <w:rFonts w:ascii="Arial" w:hAnsi="Arial" w:cs="Arial"/>
+          <w:color w:val="001279"/>
           <w:sz w:val="16"/>
           <w:szCs w:val="16"/>
         </w:rPr>
@@ -2504,6 +2494,7 @@
           <w:rFonts w:ascii="Arial" w:hAnsi="Arial" w:cs="Arial"/>
           <w:b/>
           <w:bCs/>
+          <w:color w:val="001279"/>
           <w:sz w:val="16"/>
           <w:szCs w:val="16"/>
         </w:rPr>
@@ -2526,6 +2517,7 @@
           <w:rFonts w:ascii="Arial" w:hAnsi="Arial" w:cs="Arial"/>
           <w:b/>
           <w:bCs/>
+          <w:color w:val="001279"/>
           <w:sz w:val="16"/>
           <w:szCs w:val="16"/>
         </w:rPr>
@@ -2544,6 +2536,7 @@
       <w:r>
         <w:rPr>
           <w:rFonts w:ascii="Arial" w:hAnsi="Arial" w:cs="Arial"/>
+          <w:color w:val="001279"/>
           <w:sz w:val="16"/>
           <w:szCs w:val="16"/>
         </w:rPr>
@@ -2567,6 +2560,7 @@
           <w:rFonts w:ascii="Arial" w:hAnsi="Arial" w:cs="Arial"/>
           <w:b/>
           <w:bCs/>
+          <w:color w:val="001279"/>
           <w:sz w:val="16"/>
           <w:szCs w:val="16"/>
         </w:rPr>
@@ -2590,6 +2584,7 @@
           <w:rFonts w:ascii="Arial" w:hAnsi="Arial" w:cs="Arial"/>
           <w:b/>
           <w:bCs/>
+          <w:color w:val="001279"/>
           <w:sz w:val="16"/>
           <w:szCs w:val="16"/>
         </w:rPr>
@@ -2610,6 +2605,7 @@
           <w:rFonts w:ascii="Arial" w:hAnsi="Arial" w:cs="Arial"/>
           <w:b/>
           <w:bCs/>
+          <w:color w:val="001279"/>
           <w:sz w:val="16"/>
           <w:szCs w:val="16"/>
         </w:rPr>
@@ -2618,6 +2614,7 @@
       <w:r>
         <w:rPr>
           <w:rFonts w:ascii="Arial" w:hAnsi="Arial" w:cs="Arial"/>
+          <w:color w:val="001279"/>
           <w:sz w:val="16"/>
           <w:szCs w:val="16"/>
         </w:rPr>
@@ -2640,6 +2637,7 @@
           <w:rFonts w:ascii="Arial" w:hAnsi="Arial" w:cs="Arial"/>
           <w:b/>
           <w:bCs/>
+          <w:color w:val="001279"/>
           <w:sz w:val="16"/>
           <w:szCs w:val="16"/>
         </w:rPr>
@@ -2648,6 +2646,7 @@
       <w:r>
         <w:rPr>
           <w:rFonts w:ascii="Arial" w:hAnsi="Arial" w:cs="Arial"/>
+          <w:color w:val="001279"/>
           <w:sz w:val="16"/>
           <w:szCs w:val="16"/>
         </w:rPr>
@@ -2682,6 +2681,7 @@
           <w:rFonts w:ascii="Arial" w:hAnsi="Arial" w:cs="Arial"/>
           <w:b/>
           <w:bCs/>
+          <w:color w:val="001279"/>
           <w:sz w:val="16"/>
           <w:szCs w:val="16"/>
         </w:rPr>
@@ -2704,6 +2704,7 @@
           <w:rFonts w:ascii="Arial" w:hAnsi="Arial" w:cs="Arial"/>
           <w:b/>
           <w:bCs/>
+          <w:color w:val="001279"/>
           <w:sz w:val="16"/>
           <w:szCs w:val="16"/>
         </w:rPr>
@@ -2724,6 +2725,7 @@
       <w:r>
         <w:rPr>
           <w:rFonts w:ascii="Arial" w:hAnsi="Arial" w:cs="Arial"/>
+          <w:color w:val="001279"/>
           <w:sz w:val="16"/>
           <w:szCs w:val="16"/>
         </w:rPr>
@@ -2732,6 +2734,7 @@
       <w:r>
         <w:rPr>
           <w:rFonts w:ascii="Arial" w:hAnsi="Arial" w:cs="Arial"/>
+          <w:color w:val="001279"/>
           <w:sz w:val="16"/>
           <w:szCs w:val="16"/>
         </w:rPr>
@@ -2742,6 +2745,7 @@
           <w:rFonts w:ascii="Arial" w:hAnsi="Arial" w:cs="Arial"/>
           <w:b/>
           <w:bCs/>
+          <w:color w:val="001279"/>
           <w:sz w:val="16"/>
           <w:szCs w:val="16"/>
         </w:rPr>
@@ -2750,6 +2754,7 @@
       <w:r>
         <w:rPr>
           <w:rFonts w:ascii="Arial" w:hAnsi="Arial" w:cs="Arial"/>
+          <w:color w:val="001279"/>
           <w:sz w:val="16"/>
           <w:szCs w:val="16"/>
         </w:rPr>
@@ -2782,6 +2787,7 @@
           <w:rFonts w:ascii="Arial" w:hAnsi="Arial" w:cs="Arial"/>
           <w:b/>
           <w:bCs/>
+          <w:color w:val="001279"/>
           <w:sz w:val="16"/>
           <w:szCs w:val="16"/>
         </w:rPr>
@@ -2802,6 +2808,7 @@
           <w:rFonts w:ascii="Arial" w:hAnsi="Arial" w:cs="Arial"/>
           <w:b/>
           <w:bCs/>
+          <w:color w:val="001279"/>
           <w:sz w:val="16"/>
           <w:szCs w:val="16"/>
         </w:rPr>
@@ -2810,6 +2817,7 @@
       <w:r>
         <w:rPr>
           <w:rFonts w:ascii="Arial" w:hAnsi="Arial" w:cs="Arial"/>
+          <w:color w:val="001279"/>
           <w:sz w:val="16"/>
           <w:szCs w:val="16"/>
         </w:rPr>
@@ -2822,6 +2830,7 @@
             <w:rFonts w:ascii="Arial" w:hAnsi="Arial" w:cs="Arial"/>
             <w:sz w:val="16"/>
             <w:szCs w:val="16"/>
+            <w:color w:val="0563C1"/>
           </w:rPr>
           <w:t>https://saic.com</w:t>
         </w:r>
@@ -2839,6 +2848,7 @@
       <w:r>
         <w:rPr>
           <w:rFonts w:ascii="Arial" w:hAnsi="Arial" w:cs="Arial"/>
+          <w:color w:val="001279"/>
           <w:sz w:val="16"/>
           <w:szCs w:val="16"/>
         </w:rPr>
@@ -2862,6 +2872,7 @@
           <w:rFonts w:ascii="Arial" w:hAnsi="Arial" w:cs="Arial"/>
           <w:b/>
           <w:bCs/>
+          <w:color w:val="001279"/>
           <w:sz w:val="16"/>
           <w:szCs w:val="16"/>
         </w:rPr>
@@ -2884,6 +2895,7 @@
           <w:rFonts w:ascii="Arial" w:hAnsi="Arial" w:cs="Arial"/>
           <w:b/>
           <w:bCs/>
+          <w:color w:val="001279"/>
           <w:sz w:val="16"/>
           <w:szCs w:val="16"/>
         </w:rPr>
@@ -2892,6 +2904,7 @@
       <w:r>
         <w:rPr>
           <w:rFonts w:ascii="Arial" w:hAnsi="Arial" w:cs="Arial"/>
+          <w:color w:val="001279"/>
           <w:sz w:val="16"/>
           <w:szCs w:val="16"/>
         </w:rPr>
@@ -2904,6 +2917,7 @@
             <w:rFonts w:ascii="Arial" w:hAnsi="Arial" w:cs="Arial"/>
             <w:sz w:val="16"/>
             <w:szCs w:val="16"/>
+            <w:color w:val="0563C1"/>
           </w:rPr>
           <w:t>https://ceb.utk.edu/</w:t>
         </w:r>
@@ -2911,6 +2925,7 @@
       <w:r>
         <w:rPr>
           <w:rFonts w:ascii="Arial" w:hAnsi="Arial" w:cs="Arial"/>
+          <w:color w:val="001279"/>
           <w:sz w:val="16"/>
           <w:szCs w:val="16"/>
         </w:rPr>
@@ -2919,6 +2934,7 @@
       <w:r>
         <w:rPr>
           <w:rFonts w:ascii="Arial" w:hAnsi="Arial" w:cs="Arial"/>
+          <w:color w:val="001279"/>
           <w:sz w:val="16"/>
           <w:szCs w:val="16"/>
         </w:rPr>
@@ -2928,6 +2944,7 @@
       <w:r>
         <w:rPr>
           <w:rFonts w:ascii="Arial" w:hAnsi="Arial" w:cs="Arial"/>
+          <w:color w:val="001279"/>
           <w:sz w:val="16"/>
           <w:szCs w:val="16"/>
         </w:rPr>
@@ -2938,6 +2955,7 @@
           <w:rFonts w:ascii="Arial" w:hAnsi="Arial" w:cs="Arial"/>
           <w:b/>
           <w:bCs/>
+          <w:color w:val="001279"/>
           <w:sz w:val="16"/>
           <w:szCs w:val="16"/>
         </w:rPr>
@@ -2949,6 +2967,7 @@
           <w:rFonts w:ascii="Arial" w:hAnsi="Arial" w:cs="Arial"/>
           <w:b/>
           <w:bCs/>
+          <w:color w:val="001279"/>
           <w:sz w:val="16"/>
           <w:szCs w:val="16"/>
         </w:rPr>
@@ -2957,6 +2976,7 @@
       <w:r>
         <w:rPr>
           <w:rFonts w:ascii="Arial" w:hAnsi="Arial" w:cs="Arial"/>
+          <w:color w:val="001279"/>
           <w:sz w:val="16"/>
           <w:szCs w:val="16"/>
         </w:rPr>
@@ -2980,6 +3000,7 @@
           <w:rFonts w:ascii="Arial" w:hAnsi="Arial" w:cs="Arial"/>
           <w:b/>
           <w:bCs/>
+          <w:color w:val="001279"/>
           <w:sz w:val="16"/>
           <w:szCs w:val="16"/>
         </w:rPr>
@@ -3002,6 +3023,7 @@
           <w:rFonts w:ascii="Arial" w:hAnsi="Arial" w:cs="Arial"/>
           <w:b/>
           <w:bCs/>
+          <w:color w:val="001279"/>
           <w:sz w:val="16"/>
           <w:szCs w:val="16"/>
         </w:rPr>
@@ -3022,6 +3044,7 @@
       <w:r>
         <w:rPr>
           <w:rFonts w:ascii="Arial" w:hAnsi="Arial" w:cs="Arial"/>
+          <w:color w:val="001279"/>
           <w:sz w:val="16"/>
           <w:szCs w:val="16"/>
         </w:rPr>
@@ -3056,6 +3079,7 @@
           <w:rFonts w:ascii="Arial" w:hAnsi="Arial" w:cs="Arial"/>
           <w:b/>
           <w:bCs/>
+          <w:color w:val="001279"/>
           <w:sz w:val="16"/>
           <w:szCs w:val="16"/>
         </w:rPr>
@@ -3078,6 +3102,7 @@
           <w:rFonts w:ascii="Arial" w:hAnsi="Arial" w:cs="Arial"/>
           <w:b/>
           <w:bCs/>
+          <w:color w:val="001279"/>
           <w:sz w:val="16"/>
           <w:szCs w:val="16"/>
         </w:rPr>
@@ -3096,6 +3121,7 @@
       <w:r>
         <w:rPr>
           <w:rFonts w:ascii="Arial" w:hAnsi="Arial" w:cs="Arial"/>
+          <w:color w:val="001279"/>
           <w:sz w:val="16"/>
           <w:szCs w:val="16"/>
         </w:rPr>
@@ -3104,6 +3130,7 @@
       <w:r>
         <w:rPr>
           <w:rFonts w:ascii="Arial" w:hAnsi="Arial" w:cs="Arial"/>
+          <w:color w:val="001279"/>
           <w:sz w:val="16"/>
           <w:szCs w:val="16"/>
         </w:rPr>
@@ -3114,6 +3141,7 @@
           <w:rFonts w:ascii="Arial" w:hAnsi="Arial" w:cs="Arial"/>
           <w:b/>
           <w:bCs/>
+          <w:color w:val="001279"/>
           <w:sz w:val="16"/>
           <w:szCs w:val="16"/>
         </w:rPr>
@@ -3122,6 +3150,7 @@
       <w:r>
         <w:rPr>
           <w:rFonts w:ascii="Arial" w:hAnsi="Arial" w:cs="Arial"/>
+          <w:color w:val="001279"/>
           <w:sz w:val="16"/>
           <w:szCs w:val="16"/>
         </w:rPr>
@@ -3145,6 +3174,7 @@
           <w:rFonts w:ascii="Arial" w:hAnsi="Arial" w:cs="Arial"/>
           <w:b/>
           <w:bCs/>
+          <w:color w:val="001279"/>
           <w:sz w:val="16"/>
           <w:szCs w:val="16"/>
         </w:rPr>
@@ -3167,6 +3197,7 @@
           <w:rFonts w:ascii="Arial" w:hAnsi="Arial" w:cs="Arial"/>
           <w:b/>
           <w:bCs/>
+          <w:color w:val="001279"/>
           <w:sz w:val="16"/>
           <w:szCs w:val="16"/>
         </w:rPr>
@@ -3185,6 +3216,7 @@
       <w:r>
         <w:rPr>
           <w:rFonts w:ascii="Arial" w:hAnsi="Arial" w:cs="Arial"/>
+          <w:color w:val="001279"/>
           <w:sz w:val="16"/>
           <w:szCs w:val="16"/>
         </w:rPr>
@@ -3193,6 +3225,7 @@
       <w:r>
         <w:rPr>
           <w:rFonts w:ascii="Arial" w:hAnsi="Arial" w:cs="Arial"/>
+          <w:color w:val="001279"/>
           <w:sz w:val="16"/>
           <w:szCs w:val="16"/>
         </w:rPr>
@@ -3203,6 +3236,7 @@
           <w:rFonts w:ascii="Arial" w:hAnsi="Arial" w:cs="Arial"/>
           <w:b/>
           <w:bCs/>
+          <w:color w:val="001279"/>
           <w:sz w:val="16"/>
           <w:szCs w:val="16"/>
         </w:rPr>
@@ -3211,6 +3245,7 @@
       <w:r>
         <w:rPr>
           <w:rFonts w:ascii="Arial" w:hAnsi="Arial" w:cs="Arial"/>
+          <w:color w:val="001279"/>
           <w:sz w:val="16"/>
           <w:szCs w:val="16"/>
         </w:rPr>
@@ -3247,6 +3282,7 @@
           <w:rFonts w:ascii="Arial" w:hAnsi="Arial" w:cs="Arial"/>
           <w:b/>
           <w:bCs/>
+          <w:color w:val="001279"/>
           <w:sz w:val="16"/>
           <w:szCs w:val="16"/>
         </w:rPr>
@@ -3269,6 +3305,7 @@
           <w:rFonts w:ascii="Arial" w:hAnsi="Arial" w:cs="Arial"/>
           <w:b/>
           <w:bCs/>
+          <w:color w:val="001279"/>
           <w:sz w:val="16"/>
           <w:szCs w:val="16"/>
         </w:rPr>
@@ -3287,6 +3324,7 @@
       <w:r>
         <w:rPr>
           <w:rFonts w:ascii="Arial" w:hAnsi="Arial" w:cs="Arial"/>
+          <w:color w:val="001279"/>
           <w:sz w:val="16"/>
           <w:szCs w:val="16"/>
         </w:rPr>
@@ -3295,6 +3333,7 @@
       <w:r>
         <w:rPr>
           <w:rFonts w:ascii="Arial" w:hAnsi="Arial" w:cs="Arial"/>
+          <w:color w:val="001279"/>
           <w:sz w:val="16"/>
           <w:szCs w:val="16"/>
         </w:rPr>
@@ -3305,6 +3344,7 @@
           <w:rFonts w:ascii="Arial" w:hAnsi="Arial" w:cs="Arial"/>
           <w:b/>
           <w:bCs/>
+          <w:color w:val="001279"/>
           <w:sz w:val="16"/>
           <w:szCs w:val="16"/>
         </w:rPr>
@@ -3313,6 +3353,7 @@
       <w:r>
         <w:rPr>
           <w:rFonts w:ascii="Arial" w:hAnsi="Arial" w:cs="Arial"/>
+          <w:color w:val="001279"/>
           <w:sz w:val="16"/>
           <w:szCs w:val="16"/>
         </w:rPr>
@@ -4365,7 +4406,7 @@
     <w:name w:val="Hyperlink"/>
     <w:rsid w:val="002B111C"/>
     <w:rPr>
-      <w:color w:val="0000FF"/>
+      <w:color w:val="0563C1"/>
       <w:u w:val="single"/>
     </w:rPr>
   </w:style>

</xml_diff>

<commit_message>
Update resume and index to reflect Medicaid Claims Checker and completed Provider Vault work
Co-Authored-By: Claude Sonnet 4.6 <noreply@anthropic.com>
</commit_message>
<xml_diff>
--- a/static/files/Resume.v3.7.docx
+++ b/static/files/Resume.v3.7.docx
@@ -16,8 +16,6 @@
           <w:szCs w:val="18"/>
         </w:rPr>
       </w:pPr>
-      <w:bookmarkStart w:id="0" w:name="_GoBack"/>
-      <w:bookmarkEnd w:id="0"/>
       <w:r>
         <w:rPr>
           <w:rFonts w:ascii="Tahoma" w:hAnsi="Tahoma" w:cs="Tahoma"/>
@@ -37,7 +35,7 @@
         <w:jc w:val="center"/>
         <w:rPr>
           <w:rFonts w:ascii="Tahoma" w:hAnsi="Tahoma" w:cs="Tahoma"/>
-          <w:color w:val="000090"/>
+          <w:color w:val="001279"/>
           <w:sz w:val="18"/>
           <w:szCs w:val="18"/>
         </w:rPr>
@@ -49,7 +47,6 @@
             <w:rFonts w:ascii="Tahoma" w:hAnsi="Tahoma" w:cs="Tahoma"/>
             <w:sz w:val="18"/>
             <w:szCs w:val="18"/>
-            <w:color w:val="0563C1"/>
           </w:rPr>
           <w:t>donfox1@mac.com</w:t>
         </w:r>
@@ -111,15 +108,84 @@
     </w:p>
     <w:p>
       <w:pPr>
-        <w:rPr>
-          <w:rFonts w:ascii="Arial" w:hAnsi="Arial" w:cs="Arial"/>
-          <w:b/>
-          <w:bCs/>
+        <w:pStyle w:val="Body"/>
+        <w:ind w:right="180"/>
+        <w:jc w:val="center"/>
+        <w:rPr>
+          <w:rFonts w:ascii="Tahoma" w:hAnsi="Tahoma" w:cs="Tahoma"/>
+          <w:color w:val="2F5496" w:themeColor="accent1" w:themeShade="BF"/>
+          <w:sz w:val="18"/>
+          <w:szCs w:val="18"/>
+        </w:rPr>
+      </w:pPr>
+      <w:r>
+        <w:rPr>
+          <w:rFonts w:ascii="Tahoma" w:eastAsiaTheme="minorHAnsi" w:hAnsi="Tahoma" w:cs="Tahoma"/>
+          <w:color w:val="2F5496" w:themeColor="accent1" w:themeShade="BF"/>
+          <w:sz w:val="18"/>
+          <w:szCs w:val="18"/>
+        </w:rPr>
+        <w:fldChar w:fldCharType="begin"/>
+      </w:r>
+      <w:r>
+        <w:rPr>
+          <w:rFonts w:ascii="Tahoma" w:eastAsiaTheme="minorHAnsi" w:hAnsi="Tahoma" w:cs="Tahoma"/>
+          <w:color w:val="2F5496" w:themeColor="accent1" w:themeShade="BF"/>
+          <w:sz w:val="18"/>
+          <w:szCs w:val="18"/>
+        </w:rPr>
+        <w:instrText>HYPERLINK "https://resume-site-b43d.onrender.com/resume"</w:instrText>
+      </w:r>
+      <w:r>
+        <w:rPr>
+          <w:rFonts w:ascii="Tahoma" w:eastAsiaTheme="minorHAnsi" w:hAnsi="Tahoma" w:cs="Tahoma"/>
+          <w:color w:val="2F5496" w:themeColor="accent1" w:themeShade="BF"/>
+          <w:sz w:val="18"/>
+          <w:szCs w:val="18"/>
+        </w:rPr>
+      </w:r>
+      <w:r>
+        <w:rPr>
+          <w:rFonts w:ascii="Tahoma" w:eastAsiaTheme="minorHAnsi" w:hAnsi="Tahoma" w:cs="Tahoma"/>
+          <w:color w:val="2F5496" w:themeColor="accent1" w:themeShade="BF"/>
+          <w:sz w:val="18"/>
+          <w:szCs w:val="18"/>
+        </w:rPr>
+        <w:fldChar w:fldCharType="separate"/>
+      </w:r>
+      <w:r>
+        <w:rPr>
+          <w:rFonts w:ascii="Tahoma" w:eastAsiaTheme="minorHAnsi" w:hAnsi="Tahoma" w:cs="Tahoma"/>
+          <w:color w:val="2F5496" w:themeColor="accent1" w:themeShade="BF"/>
+          <w:sz w:val="18"/>
+          <w:szCs w:val="18"/>
+        </w:rPr>
+        <w:t>https://resume-site-b43d.onrender.com/resume</w:t>
+      </w:r>
+      <w:r>
+        <w:rPr>
+          <w:rFonts w:ascii="Tahoma" w:eastAsiaTheme="minorHAnsi" w:hAnsi="Tahoma" w:cs="Tahoma"/>
+          <w:color w:val="2F5496" w:themeColor="accent1" w:themeShade="BF"/>
+          <w:sz w:val="18"/>
+          <w:szCs w:val="18"/>
+        </w:rPr>
+        <w:fldChar w:fldCharType="end"/>
+      </w:r>
+    </w:p>
+    <w:p>
+      <w:pPr>
+        <w:rPr>
+          <w:rFonts w:ascii="Arial" w:hAnsi="Arial" w:cs="Arial"/>
+          <w:b/>
+          <w:bCs/>
+          <w:color w:val="2F5496" w:themeColor="accent1" w:themeShade="BF"/>
           <w:sz w:val="18"/>
           <w:szCs w:val="18"/>
           <w:u w:val="single"/>
         </w:rPr>
       </w:pPr>
+      <w:bookmarkStart w:id="0" w:name="_GoBack"/>
+      <w:bookmarkEnd w:id="0"/>
     </w:p>
     <w:p>
       <w:pPr>
@@ -852,7 +918,6 @@
             <w:sz w:val="16"/>
             <w:szCs w:val="16"/>
             <w:shd w:val="clear" w:color="auto" w:fill="FFFFFF"/>
-            <w:color w:val="0563C1"/>
           </w:rPr>
           <w:t>https://emrts.us/</w:t>
         </w:r>
@@ -1466,6 +1531,7 @@
           <w:sz w:val="16"/>
           <w:szCs w:val="16"/>
         </w:rPr>
+        <w:lastRenderedPageBreak/>
         <w:t>July 2009 – May 2010: Conducted code analysis for GNUmed, an open-source electronic medical record system, to evaluate its suitability for client needs. Built a RESTful web service for state medical provider validation.</w:t>
       </w:r>
       <w:r>
@@ -1678,7 +1744,6 @@
             <w:rFonts w:ascii="Arial" w:hAnsi="Arial" w:cs="Arial"/>
             <w:sz w:val="16"/>
             <w:szCs w:val="16"/>
-            <w:color w:val="0563C1"/>
           </w:rPr>
           <w:t>https://www.orchid-ortho.com</w:t>
         </w:r>
@@ -1787,7 +1852,6 @@
             <w:rFonts w:ascii="Arial" w:hAnsi="Arial" w:cs="Arial"/>
             <w:sz w:val="16"/>
             <w:szCs w:val="16"/>
-            <w:color w:val="0563C1"/>
           </w:rPr>
           <w:t>https://www.cspire.com</w:t>
         </w:r>
@@ -1879,7 +1943,6 @@
             <w:rFonts w:ascii="Arial" w:hAnsi="Arial" w:cs="Arial"/>
             <w:sz w:val="16"/>
             <w:szCs w:val="16"/>
-            <w:color w:val="0563C1"/>
           </w:rPr>
           <w:t>https://corporate.lowes.com</w:t>
         </w:r>
@@ -2452,7 +2515,6 @@
             <w:rFonts w:ascii="Arial" w:hAnsi="Arial" w:cs="Arial"/>
             <w:sz w:val="16"/>
             <w:szCs w:val="16"/>
-            <w:color w:val="0563C1"/>
           </w:rPr>
           <w:t>https://www.lexmark.com/en_us.html</w:t>
         </w:r>
@@ -2498,6 +2560,7 @@
           <w:sz w:val="16"/>
           <w:szCs w:val="16"/>
         </w:rPr>
+        <w:lastRenderedPageBreak/>
         <w:t>IBM Internet Security Systems</w:t>
       </w:r>
     </w:p>
@@ -2564,7 +2627,6 @@
           <w:sz w:val="16"/>
           <w:szCs w:val="16"/>
         </w:rPr>
-        <w:lastRenderedPageBreak/>
         <w:t>Lowe’s Inc.</w:t>
       </w:r>
     </w:p>
@@ -2830,7 +2892,6 @@
             <w:rFonts w:ascii="Arial" w:hAnsi="Arial" w:cs="Arial"/>
             <w:sz w:val="16"/>
             <w:szCs w:val="16"/>
-            <w:color w:val="0563C1"/>
           </w:rPr>
           <w:t>https://saic.com</w:t>
         </w:r>
@@ -2917,7 +2978,6 @@
             <w:rFonts w:ascii="Arial" w:hAnsi="Arial" w:cs="Arial"/>
             <w:sz w:val="16"/>
             <w:szCs w:val="16"/>
-            <w:color w:val="0563C1"/>
           </w:rPr>
           <w:t>https://ceb.utk.edu/</w:t>
         </w:r>

</xml_diff>

<commit_message>
Update Resume.v3.7.docx to match HTML resume changes
Co-Authored-By: Claude Sonnet 4.6 <noreply@anthropic.com>
</commit_message>
<xml_diff>
--- a/static/files/Resume.v3.7.docx
+++ b/static/files/Resume.v3.7.docx
@@ -241,7 +241,7 @@
           <w:sz w:val="16"/>
           <w:szCs w:val="16"/>
         </w:rPr>
-        <w:t>Thirty years of professional software development spanning telecommunications, warehousing, healthcare IT, and data systems. Primary focus has been backend engineering on Unix/Linux platforms, with experience across a broad range of languages, databases, and system architectures. More recent work includes web development, functional programming, and applied AI/prompt engineering. Proof-of-concept development — particularly in healthcare IT — has been a recurring part of the work, as has occasional intern mentoring.</w:t>
+        <w:t>Thirty years of professional software development spanning telecommunications, warehousing, healthcare IT, and data systems. Primary focus has been backend engineering on Unix/Linux platforms, with experience across a broad range of languages, databases, and system architectures. More recent work includes web development, functional programming, and applied AI/prompt engineering. Proof-of-concept development — particularly in healthcare IT — has been a recurring part of the work, as has intern mentoring in machine learning and prompt engineering.</w:t>
       </w:r>
     </w:p>
     <w:p>
@@ -980,88 +980,79 @@
           <w:sz w:val="16"/>
           <w:szCs w:val="16"/>
         </w:rPr>
-        <w:t>July 2025-</w:t>
-      </w:r>
-      <w:r>
-        <w:rPr>
-          <w:rFonts w:ascii="Arial" w:hAnsi="Arial" w:cs="Arial"/>
-          <w:color w:val="001279"/>
-          <w:sz w:val="16"/>
-          <w:szCs w:val="16"/>
-        </w:rPr>
-        <w:t>Present</w:t>
-      </w:r>
-      <w:r>
-        <w:rPr>
-          <w:rFonts w:ascii="Arial" w:hAnsi="Arial" w:cs="Arial"/>
-          <w:color w:val="001279"/>
-          <w:sz w:val="16"/>
-          <w:szCs w:val="16"/>
-        </w:rPr>
-        <w:t>:</w:t>
-      </w:r>
-      <w:r>
-        <w:rPr>
-          <w:rFonts w:ascii="Arial" w:hAnsi="Arial" w:cs="Arial"/>
-          <w:color w:val="001279"/>
-          <w:sz w:val="16"/>
-          <w:szCs w:val="16"/>
-        </w:rPr>
-        <w:t xml:space="preserve"> Developing a proof-of-concept application for a Provider Vault medical enrollment website. Combines Elixir/Phoenix for scalability and concurrency with Python components for AI prompting to explore how large </w:t>
-      </w:r>
-      <w:r>
-        <w:rPr>
-          <w:rFonts w:ascii="Arial" w:hAnsi="Arial" w:cs="Arial"/>
-          <w:color w:val="001279"/>
-          <w:sz w:val="16"/>
-          <w:szCs w:val="16"/>
-        </w:rPr>
-        <w:t>language</w:t>
-      </w:r>
-      <w:r>
-        <w:rPr>
-          <w:rFonts w:ascii="Arial" w:hAnsi="Arial" w:cs="Arial"/>
-          <w:color w:val="001279"/>
-          <w:sz w:val="16"/>
-          <w:szCs w:val="16"/>
-        </w:rPr>
-        <w:t xml:space="preserve"> models can augment provider data workflows. Mentoring interns on complementary healthcare IT projects and supplementing rapid prototyping.  Tech:</w:t>
-      </w:r>
-      <w:r>
-        <w:rPr>
-          <w:rFonts w:ascii="Arial" w:hAnsi="Arial" w:cs="Arial"/>
-          <w:color w:val="001279"/>
-          <w:sz w:val="16"/>
-          <w:szCs w:val="16"/>
-        </w:rPr>
-        <w:t xml:space="preserve"> </w:t>
-      </w:r>
-      <w:r>
-        <w:rPr>
-          <w:rFonts w:ascii="Arial" w:hAnsi="Arial" w:cs="Arial"/>
-          <w:color w:val="001279"/>
-          <w:sz w:val="16"/>
-          <w:szCs w:val="16"/>
-        </w:rPr>
-        <w:t>Elixir, Phoenix, Python 3.</w:t>
-      </w:r>
-      <w:r>
-        <w:rPr>
-          <w:rFonts w:ascii="Arial" w:hAnsi="Arial" w:cs="Arial"/>
-          <w:color w:val="001279"/>
-          <w:sz w:val="16"/>
-          <w:szCs w:val="16"/>
-        </w:rPr>
-        <w:t>x</w:t>
-      </w:r>
-      <w:r>
-        <w:rPr>
-          <w:rFonts w:ascii="Arial" w:hAnsi="Arial" w:cs="Arial"/>
-          <w:color w:val="001279"/>
-          <w:sz w:val="16"/>
-          <w:szCs w:val="16"/>
-        </w:rPr>
-        <w:t xml:space="preserve">, </w:t>
+        <w:t>July 2025–Current: Developed a proof-of-concept Provider Vault medical enrollment website, combining Elixir/Phoenix for scalability and concurrency with Python for AI-assisted development and prompt engineering. Subsequently developed the Medicaid Claims Checker, a fraud detection tool written in Haskell (core logic) with Elixir/Phoenix for I/O, submitted via RFI to several state governments. Mentoring interns on complementary healthcare IT projects, with topics including machine learning and prompt engineering. Tech: Haskell, Elixir, Phoenix, Python 3.11, PostgreSQL, Django</w:t>
+      </w:r>
+      <w:r>
+        <w:rPr>
+          <w:rFonts w:ascii="Arial" w:hAnsi="Arial" w:cs="Arial"/>
+          <w:color w:val="001279"/>
+          <w:sz w:val="16"/>
+          <w:szCs w:val="16"/>
+        </w:rPr>
+      </w:r>
+      <w:r>
+        <w:rPr>
+          <w:rFonts w:ascii="Arial" w:hAnsi="Arial" w:cs="Arial"/>
+          <w:color w:val="001279"/>
+          <w:sz w:val="16"/>
+          <w:szCs w:val="16"/>
+        </w:rPr>
+      </w:r>
+      <w:r>
+        <w:rPr>
+          <w:rFonts w:ascii="Arial" w:hAnsi="Arial" w:cs="Arial"/>
+          <w:color w:val="001279"/>
+          <w:sz w:val="16"/>
+          <w:szCs w:val="16"/>
+        </w:rPr>
+      </w:r>
+      <w:r>
+        <w:rPr>
+          <w:rFonts w:ascii="Arial" w:hAnsi="Arial" w:cs="Arial"/>
+          <w:color w:val="001279"/>
+          <w:sz w:val="16"/>
+          <w:szCs w:val="16"/>
+        </w:rPr>
+      </w:r>
+      <w:r>
+        <w:rPr>
+          <w:rFonts w:ascii="Arial" w:hAnsi="Arial" w:cs="Arial"/>
+          <w:color w:val="001279"/>
+          <w:sz w:val="16"/>
+          <w:szCs w:val="16"/>
+        </w:rPr>
+      </w:r>
+      <w:r>
+        <w:rPr>
+          <w:rFonts w:ascii="Arial" w:hAnsi="Arial" w:cs="Arial"/>
+          <w:color w:val="001279"/>
+          <w:sz w:val="16"/>
+          <w:szCs w:val="16"/>
+        </w:rPr>
+      </w:r>
+      <w:r>
+        <w:rPr>
+          <w:rFonts w:ascii="Arial" w:hAnsi="Arial" w:cs="Arial"/>
+          <w:color w:val="001279"/>
+          <w:sz w:val="16"/>
+          <w:szCs w:val="16"/>
+        </w:rPr>
+      </w:r>
+      <w:r>
+        <w:rPr>
+          <w:rFonts w:ascii="Arial" w:hAnsi="Arial" w:cs="Arial"/>
+          <w:color w:val="001279"/>
+          <w:sz w:val="16"/>
+          <w:szCs w:val="16"/>
+        </w:rPr>
+      </w:r>
+      <w:r>
+        <w:rPr>
+          <w:rFonts w:ascii="Arial" w:hAnsi="Arial" w:cs="Arial"/>
+          <w:color w:val="001279"/>
+          <w:sz w:val="16"/>
+          <w:szCs w:val="16"/>
+        </w:rPr>
       </w:r>
     </w:p>
     <w:p>
@@ -1087,88 +1078,79 @@
           <w:sz w:val="16"/>
           <w:szCs w:val="16"/>
         </w:rPr>
-        <w:t>August 23, 202</w:t>
-      </w:r>
-      <w:r>
-        <w:rPr>
-          <w:rFonts w:ascii="Arial" w:hAnsi="Arial" w:cs="Arial"/>
-          <w:color w:val="001279"/>
-          <w:sz w:val="16"/>
-          <w:szCs w:val="16"/>
-        </w:rPr>
-        <w:t>4</w:t>
-      </w:r>
-      <w:r>
-        <w:rPr>
-          <w:rFonts w:ascii="Arial" w:hAnsi="Arial" w:cs="Arial"/>
-          <w:color w:val="001279"/>
-          <w:sz w:val="16"/>
-          <w:szCs w:val="16"/>
-        </w:rPr>
-        <w:t xml:space="preserve"> – </w:t>
-      </w:r>
-      <w:r>
-        <w:rPr>
-          <w:rFonts w:ascii="Arial" w:hAnsi="Arial" w:cs="Arial"/>
-          <w:color w:val="001279"/>
-          <w:sz w:val="16"/>
-          <w:szCs w:val="16"/>
-        </w:rPr>
-        <w:t>December</w:t>
-      </w:r>
-      <w:r>
-        <w:rPr>
-          <w:rFonts w:ascii="Arial" w:hAnsi="Arial" w:cs="Arial"/>
-          <w:color w:val="001279"/>
-          <w:sz w:val="16"/>
-          <w:szCs w:val="16"/>
-        </w:rPr>
-        <w:t xml:space="preserve"> 2024: </w:t>
-      </w:r>
-      <w:r>
-        <w:rPr>
-          <w:rFonts w:ascii="Arial" w:hAnsi="Arial" w:cs="Arial"/>
-          <w:color w:val="001279"/>
-          <w:sz w:val="16"/>
-          <w:szCs w:val="16"/>
-        </w:rPr>
-        <w:t>Collaborated with interns on a Medicaid prediction research project, including</w:t>
-      </w:r>
-      <w:r>
-        <w:rPr>
-          <w:rFonts w:ascii="Arial" w:hAnsi="Arial" w:cs="Arial"/>
-          <w:color w:val="001279"/>
-          <w:sz w:val="16"/>
-          <w:szCs w:val="16"/>
-        </w:rPr>
-        <w:t xml:space="preserve"> foundational data science concepts and workflows. Led a follow-up imitative exploring cryptocurrency. Developing a Bitcoin indexer prototype. Project paused when students returned to academic commitments. Tech</w:t>
-      </w:r>
-      <w:r>
-        <w:rPr>
-          <w:rFonts w:ascii="Arial" w:hAnsi="Arial" w:cs="Arial"/>
-          <w:color w:val="001279"/>
-          <w:sz w:val="16"/>
-          <w:szCs w:val="16"/>
-        </w:rPr>
-        <w:t>: macOS, Windows, EMRTS Linux network, GitHub, Python 3.x, Flask, Postgres</w:t>
-      </w:r>
-      <w:r>
-        <w:rPr>
-          <w:rFonts w:ascii="Arial" w:hAnsi="Arial" w:cs="Arial"/>
-          <w:color w:val="001279"/>
-          <w:sz w:val="16"/>
-          <w:szCs w:val="16"/>
-        </w:rPr>
-        <w:t>.</w:t>
-      </w:r>
-      <w:r>
-        <w:rPr>
-          <w:rFonts w:ascii="Arial" w:hAnsi="Arial" w:cs="Arial"/>
-          <w:color w:val="001279"/>
-          <w:sz w:val="16"/>
-          <w:szCs w:val="16"/>
-        </w:rPr>
-        <w:t xml:space="preserve">       </w:t>
+        <w:t>August 23, 2024 – December 2024: Collaborated with interns on a Medicaid prediction research project, introducing foundational data science concepts and workflows. Led a follow-up initiative exploring cryptocurrency, developing a Bitcoin indexer prototype. Project concluded as students returned to academic commitments. Tech: Python 3.x, Flask, PostgreSQL</w:t>
+      </w:r>
+      <w:r>
+        <w:rPr>
+          <w:rFonts w:ascii="Arial" w:hAnsi="Arial" w:cs="Arial"/>
+          <w:color w:val="001279"/>
+          <w:sz w:val="16"/>
+          <w:szCs w:val="16"/>
+        </w:rPr>
+      </w:r>
+      <w:r>
+        <w:rPr>
+          <w:rFonts w:ascii="Arial" w:hAnsi="Arial" w:cs="Arial"/>
+          <w:color w:val="001279"/>
+          <w:sz w:val="16"/>
+          <w:szCs w:val="16"/>
+        </w:rPr>
+      </w:r>
+      <w:r>
+        <w:rPr>
+          <w:rFonts w:ascii="Arial" w:hAnsi="Arial" w:cs="Arial"/>
+          <w:color w:val="001279"/>
+          <w:sz w:val="16"/>
+          <w:szCs w:val="16"/>
+        </w:rPr>
+      </w:r>
+      <w:r>
+        <w:rPr>
+          <w:rFonts w:ascii="Arial" w:hAnsi="Arial" w:cs="Arial"/>
+          <w:color w:val="001279"/>
+          <w:sz w:val="16"/>
+          <w:szCs w:val="16"/>
+        </w:rPr>
+      </w:r>
+      <w:r>
+        <w:rPr>
+          <w:rFonts w:ascii="Arial" w:hAnsi="Arial" w:cs="Arial"/>
+          <w:color w:val="001279"/>
+          <w:sz w:val="16"/>
+          <w:szCs w:val="16"/>
+        </w:rPr>
+      </w:r>
+      <w:r>
+        <w:rPr>
+          <w:rFonts w:ascii="Arial" w:hAnsi="Arial" w:cs="Arial"/>
+          <w:color w:val="001279"/>
+          <w:sz w:val="16"/>
+          <w:szCs w:val="16"/>
+        </w:rPr>
+      </w:r>
+      <w:r>
+        <w:rPr>
+          <w:rFonts w:ascii="Arial" w:hAnsi="Arial" w:cs="Arial"/>
+          <w:color w:val="001279"/>
+          <w:sz w:val="16"/>
+          <w:szCs w:val="16"/>
+        </w:rPr>
+      </w:r>
+      <w:r>
+        <w:rPr>
+          <w:rFonts w:ascii="Arial" w:hAnsi="Arial" w:cs="Arial"/>
+          <w:color w:val="001279"/>
+          <w:sz w:val="16"/>
+          <w:szCs w:val="16"/>
+        </w:rPr>
+      </w:r>
+      <w:r>
+        <w:rPr>
+          <w:rFonts w:ascii="Arial" w:hAnsi="Arial" w:cs="Arial"/>
+          <w:color w:val="001279"/>
+          <w:sz w:val="16"/>
+          <w:szCs w:val="16"/>
+        </w:rPr>
       </w:r>
     </w:p>
     <w:p>

</xml_diff>

<commit_message>
Serve resume as a direct download instead of emailing it
/resume now returns the PDF/DOCX as a file download (Content-Disposition:
attachment) instead of sending it via Brevo/SMTP, while still logging
name/email/IP to EmailRequest for visibility into requests. Removes the
mail-service dependency from this path.

Also syncs Resume.v3.7.docx with the current site content (EMRTS end date,
full month names, "Lowe's" naming, missing "Contract position." labels,
and several Tech lines that had drifted, were missing, or in one case
were duplicated from the wrong entry) and re-exports Resume.v3.7.pdf to
match.

Co-Authored-By: Claude Sonnet 5 <noreply@anthropic.com>
</commit_message>
<xml_diff>
--- a/static/files/Resume.v3.7.docx
+++ b/static/files/Resume.v3.7.docx
@@ -241,7 +241,7 @@
           <w:sz w:val="16"/>
           <w:szCs w:val="16"/>
         </w:rPr>
-        <w:t>Thirty years of professional software development spanning telecommunications, warehousing, healthcare IT, and data systems. Primary focus has been backend engineering on Unix/Linux platforms, with experience across a broad range of languages, databases, and system architectures. More recent work includes web development, functional programming, and applied AI/prompt engineering. Proof-of-concept development — particularly in healthcare IT — has been a recurring part of the work, as has intern mentoring in machine learning and prompt engineering.</w:t>
+        <w:t>Thirty years of professional software development spanning telecommunications, healthcare IT, and data systems. Primary focus has been backend engineering on Unix/Linux platforms, with experience across a broad range of languages, databases, and system architectures. More recent work includes web development, functional programming, and AI-assisted development and prompt engineering.</w:t>
       </w:r>
     </w:p>
     <w:p>
@@ -261,97 +261,87 @@
           <w:sz w:val="16"/>
           <w:szCs w:val="16"/>
         </w:rPr>
-        <w:t xml:space="preserve">I’ve mentored interns and </w:t>
-      </w:r>
-      <w:r>
-        <w:rPr>
-          <w:rFonts w:ascii="Arial" w:hAnsi="Arial" w:cs="Arial"/>
-          <w:color w:val="001279"/>
-          <w:sz w:val="16"/>
-          <w:szCs w:val="16"/>
-        </w:rPr>
-        <w:t>worked</w:t>
-      </w:r>
-      <w:r>
-        <w:rPr>
-          <w:rFonts w:ascii="Arial" w:hAnsi="Arial" w:cs="Arial"/>
-          <w:color w:val="001279"/>
-          <w:sz w:val="16"/>
-          <w:szCs w:val="16"/>
-        </w:rPr>
-        <w:t xml:space="preserve"> on co</w:t>
-      </w:r>
-      <w:r>
-        <w:rPr>
-          <w:rFonts w:ascii="Arial" w:hAnsi="Arial" w:cs="Arial"/>
-          <w:color w:val="001279"/>
-          <w:sz w:val="16"/>
-          <w:szCs w:val="16"/>
-        </w:rPr>
-        <w:t>llaborative</w:t>
-      </w:r>
-      <w:r>
-        <w:rPr>
-          <w:rFonts w:ascii="Arial" w:hAnsi="Arial" w:cs="Arial"/>
-          <w:color w:val="001279"/>
-          <w:sz w:val="16"/>
-          <w:szCs w:val="16"/>
-        </w:rPr>
-        <w:t xml:space="preserve"> projects,</w:t>
-      </w:r>
-      <w:r>
-        <w:rPr>
-          <w:rFonts w:ascii="Arial" w:hAnsi="Arial" w:cs="Arial"/>
-          <w:color w:val="001279"/>
-          <w:sz w:val="16"/>
-          <w:szCs w:val="16"/>
-        </w:rPr>
-        <w:t xml:space="preserve"> over many occasions.</w:t>
-      </w:r>
-      <w:r>
-        <w:rPr>
-          <w:rFonts w:ascii="Arial" w:hAnsi="Arial" w:cs="Arial"/>
-          <w:color w:val="001279"/>
-          <w:sz w:val="16"/>
-          <w:szCs w:val="16"/>
-        </w:rPr>
-        <w:t xml:space="preserve"> </w:t>
-      </w:r>
-      <w:r>
-        <w:rPr>
-          <w:rFonts w:ascii="Arial" w:hAnsi="Arial" w:cs="Arial"/>
-          <w:color w:val="001279"/>
-          <w:sz w:val="16"/>
-          <w:szCs w:val="16"/>
-        </w:rPr>
-        <w:t>Currently exploring AI engineering and functional programming with Elixir and Haskell.</w:t>
-      </w:r>
-      <w:r>
-        <w:rPr>
-          <w:rFonts w:ascii="Arial" w:hAnsi="Arial" w:cs="Arial"/>
-          <w:color w:val="001279"/>
-          <w:sz w:val="16"/>
-          <w:szCs w:val="16"/>
-        </w:rPr>
-        <w:t xml:space="preserve"> </w:t>
-      </w:r>
-      <w:r>
-        <w:rPr>
-          <w:rFonts w:ascii="Arial" w:hAnsi="Arial" w:cs="Arial"/>
-          <w:color w:val="001279"/>
-          <w:sz w:val="16"/>
-          <w:szCs w:val="16"/>
-        </w:rPr>
-        <w:t xml:space="preserve">Available for </w:t>
-      </w:r>
-      <w:r>
-        <w:rPr>
-          <w:rFonts w:ascii="Arial" w:hAnsi="Arial" w:cs="Arial"/>
-          <w:color w:val="001279"/>
-          <w:sz w:val="16"/>
-          <w:szCs w:val="16"/>
-        </w:rPr>
-        <w:t>remote or freelance opportunities.</w:t>
+        <w:t>Proof-of-concept development — particularly in healthcare IT — has been a recurring part of the work, as has intern mentoring and occasional collaboration with academic and research teams. Interested in expanding on that going forward.</w:t>
+      </w:r>
+      <w:r>
+        <w:rPr>
+          <w:rFonts w:ascii="Arial" w:hAnsi="Arial" w:cs="Arial"/>
+          <w:color w:val="001279"/>
+          <w:sz w:val="16"/>
+          <w:szCs w:val="16"/>
+        </w:rPr>
+      </w:r>
+      <w:r>
+        <w:rPr>
+          <w:rFonts w:ascii="Arial" w:hAnsi="Arial" w:cs="Arial"/>
+          <w:color w:val="001279"/>
+          <w:sz w:val="16"/>
+          <w:szCs w:val="16"/>
+        </w:rPr>
+      </w:r>
+      <w:r>
+        <w:rPr>
+          <w:rFonts w:ascii="Arial" w:hAnsi="Arial" w:cs="Arial"/>
+          <w:color w:val="001279"/>
+          <w:sz w:val="16"/>
+          <w:szCs w:val="16"/>
+        </w:rPr>
+      </w:r>
+      <w:r>
+        <w:rPr>
+          <w:rFonts w:ascii="Arial" w:hAnsi="Arial" w:cs="Arial"/>
+          <w:color w:val="001279"/>
+          <w:sz w:val="16"/>
+          <w:szCs w:val="16"/>
+        </w:rPr>
+      </w:r>
+      <w:r>
+        <w:rPr>
+          <w:rFonts w:ascii="Arial" w:hAnsi="Arial" w:cs="Arial"/>
+          <w:color w:val="001279"/>
+          <w:sz w:val="16"/>
+          <w:szCs w:val="16"/>
+        </w:rPr>
+      </w:r>
+      <w:r>
+        <w:rPr>
+          <w:rFonts w:ascii="Arial" w:hAnsi="Arial" w:cs="Arial"/>
+          <w:color w:val="001279"/>
+          <w:sz w:val="16"/>
+          <w:szCs w:val="16"/>
+        </w:rPr>
+      </w:r>
+      <w:r>
+        <w:rPr>
+          <w:rFonts w:ascii="Arial" w:hAnsi="Arial" w:cs="Arial"/>
+          <w:color w:val="001279"/>
+          <w:sz w:val="16"/>
+          <w:szCs w:val="16"/>
+        </w:rPr>
+      </w:r>
+      <w:r>
+        <w:rPr>
+          <w:rFonts w:ascii="Arial" w:hAnsi="Arial" w:cs="Arial"/>
+          <w:color w:val="001279"/>
+          <w:sz w:val="16"/>
+          <w:szCs w:val="16"/>
+        </w:rPr>
+      </w:r>
+      <w:r>
+        <w:rPr>
+          <w:rFonts w:ascii="Arial" w:hAnsi="Arial" w:cs="Arial"/>
+          <w:color w:val="001279"/>
+          <w:sz w:val="16"/>
+          <w:szCs w:val="16"/>
+        </w:rPr>
+      </w:r>
+      <w:r>
+        <w:rPr>
+          <w:rFonts w:ascii="Arial" w:hAnsi="Arial" w:cs="Arial"/>
+          <w:color w:val="001279"/>
+          <w:sz w:val="16"/>
+          <w:szCs w:val="16"/>
+        </w:rPr>
       </w:r>
     </w:p>
     <w:p>
@@ -702,7 +692,7 @@
           <w:sz w:val="18"/>
           <w:szCs w:val="18"/>
         </w:rPr>
-        <w:t xml:space="preserve"> Django, Flask, Phoenix, SQLAlchemy,</w:t>
+        <w:t xml:space="preserve"> Django, Flask, Phoenix, SQLAlchemy</w:t>
       </w:r>
     </w:p>
     <w:p>
@@ -804,7 +794,7 @@
           <w:sz w:val="18"/>
           <w:szCs w:val="18"/>
         </w:rPr>
-        <w:t xml:space="preserve"> Git, Docker, Node.js, Shell Scripting, RESTful APIs.</w:t>
+        <w:t xml:space="preserve"> Git, Docker, Node.js, Shell Scripting, RESTful APIs</w:t>
       </w:r>
       <w:r>
         <w:rPr>
@@ -951,7 +941,7 @@
           <w:sz w:val="16"/>
           <w:szCs w:val="16"/>
         </w:rPr>
-        <w:t>Software engineer working with a healthcare IT startup across six engagements, developing open-source tools for medical records, billing, provider enrollment, and claims. Work has centered on proof-of-concept development and R&amp;D, often in collaboration with academic and professional partners. Contracts listed below fill the gaps between EMRTS engagements.</w:t>
+        <w:t>Software engineer working with a healthcare IT startup across six engagements, developing open-source tools for medical records, billing, provider enrollment, and claims. Work has centered on proof-of-concept development and R&amp;D, with occasional collaboration with academic and professional partners. Contracts listed below fill the gaps between EMRTS engagements.</w:t>
       </w:r>
     </w:p>
     <w:p>
@@ -980,7 +970,7 @@
           <w:sz w:val="16"/>
           <w:szCs w:val="16"/>
         </w:rPr>
-        <w:t>July 2025–Current: Developed a proof-of-concept Provider Vault medical enrollment website, combining Elixir/Phoenix for scalability and concurrency with Python for AI-assisted development and prompt engineering. Subsequently developed the Medicaid Claims Checker, a fraud detection tool written in Haskell (core logic) with Elixir/Phoenix for I/O, submitted via RFI to several state governments. Mentoring interns on complementary healthcare IT projects, with topics including machine learning and prompt engineering. Tech: Haskell, Elixir, Phoenix, Python 3.11, PostgreSQL, Django</w:t>
+        <w:t>July 2025–August 2026: Developed a proof-of-concept Provider Vault medical enrollment website, combining Elixir/Phoenix for scalability and concurrency with Python for AI-assisted development and prompt engineering. Subsequently developed the Medicaid Claims Checker, a fraud detection tool written in Haskell (core logic) with Elixir/Phoenix for I/O, submitted via RFI (Request for Information) to several state governments. Mentoring interns on complementary healthcare IT projects, with topics including machine learning and prompt engineering. Tech: Haskell, Elixir, Phoenix, Python 3.11, PostgreSQL</w:t>
       </w:r>
       <w:r>
         <w:rPr>
@@ -1078,7 +1068,7 @@
           <w:sz w:val="16"/>
           <w:szCs w:val="16"/>
         </w:rPr>
-        <w:t>August 23, 2024 – December 2024: Collaborated with interns on a Medicaid prediction research project, introducing foundational data science concepts and workflows. Led a follow-up initiative exploring cryptocurrency, developing a Bitcoin indexer prototype. Project concluded as students returned to academic commitments. Tech: Python 3.x, Flask, PostgreSQL</w:t>
+        <w:t>August 2024–December 2024: Collaborated with interns on a Medicaid prediction research project, introducing foundational data science concepts and workflows. Led a follow-up initiative exploring cryptocurrency, developing a Bitcoin indexer prototype. Tech: Python 3.x, Flask, PostgreSQL</w:t>
       </w:r>
       <w:r>
         <w:rPr>
@@ -1180,7 +1170,7 @@
           <w:sz w:val="16"/>
           <w:szCs w:val="16"/>
         </w:rPr>
-        <w:t>Interim contracts: CSpire, Jackson MS (Jul 2018–Jan 2019); Orchid Orthopedic Solutions, Remote (Feb 2020–Dec 2020); Quantuvos, Remote (Jul 2021–Feb 2022) — see entries below.</w:t>
+        <w:t>Interim contracts: CSpire, Jackson MS (July 2018–January 2019); Orchid Orthopedic Solutions, Remote (February 2020–December 2020); Quantuvos, Remote (July 2021–February 2022) — see entries below.</w:t>
       </w:r>
     </w:p>
     <w:p>
@@ -1422,7 +1412,7 @@
           <w:sz w:val="16"/>
           <w:szCs w:val="16"/>
         </w:rPr>
-        <w:t>Interim contracts: Hilton, Memphis TN (Apr 2012–Aug 2012); Lowes Inc., Mooresville NC (Aug 2012–Jun 2013) — see entries below.</w:t>
+        <w:t>Interim contracts: Hilton, Memphis TN (April 2012–August 2012); Lowe's, Mooresville NC (August 2012–June 2013) — see entries below.</w:t>
       </w:r>
     </w:p>
     <w:p>
@@ -1486,7 +1476,7 @@
           <w:sz w:val="16"/>
           <w:szCs w:val="16"/>
         </w:rPr>
-        <w:t>Interim contract: Hewlett-Packard, Nashville TN (May 2010–Dec 2011) — see entry below.</w:t>
+        <w:t>Interim contract: Hewlett-Packard, Nashville TN (May 2010–December 2011) — see entry below.</w:t>
       </w:r>
     </w:p>
     <w:p>
@@ -1614,7 +1604,7 @@
           <w:sz w:val="16"/>
           <w:szCs w:val="16"/>
         </w:rPr>
-        <w:t>Remote | Jul 2021 – Feb 2022</w:t>
+        <w:t>Remote | July 2021 – February 2022</w:t>
       </w:r>
     </w:p>
     <w:p>
@@ -1636,7 +1626,19 @@
           <w:sz w:val="16"/>
           <w:szCs w:val="16"/>
         </w:rPr>
-        <w:t>Technical consulting for Quantuvos, a coaching-platform startup. Reviewed and evaluated code for the client-facing MVP, supporting coaches and clients in scheduling workshops and sessions. Performed code reviews, identified issues, and recommended improvements. Contract position.</w:t>
+        <w:t>Technical consulting for Quantuvos, a coaching-platform startup. Reviewed and evaluated code for the client-facing MVP, supporting coaches and clients in scheduling workshops and sessions, identifying issues and recommending improvements. Contract position.</w:t>
+      </w:r>
+      <w:r>
+        <w:t xml:space="preserve"> </w:t>
+      </w:r>
+      <w:r>
+        <w:rPr>
+          <w:b/>
+        </w:rPr>
+        <w:t>Tech:</w:t>
+      </w:r>
+      <w:r>
+        <w:t xml:space="preserve"> Python 3.9, Django 3.1, PostgreSQL 14.1, Docker</w:t>
       </w:r>
     </w:p>
     <w:p>
@@ -1707,7 +1709,7 @@
           <w:sz w:val="16"/>
           <w:szCs w:val="16"/>
         </w:rPr>
-        <w:t>Remote | Feb 2020 – Dec 2020</w:t>
+        <w:t>Remote | February 2020 – December 2020</w:t>
       </w:r>
       <w:r>
         <w:rPr>
@@ -1749,7 +1751,19 @@
           <w:sz w:val="16"/>
           <w:szCs w:val="16"/>
         </w:rPr>
-        <w:t>Contract work preparing Word, Excel, and PDF documents for archival submission to EtQ Reliance. Programmatically inserted tags and formatting in Word documents and validated spreadsheet metadata for accuracy and completeness. Contract position.</w:t>
+        <w:t>Contract work preparing Word, Excel, and PDF documents for archival submission to EtQ Reliance. Programmatically inserted tags and formatting into them and validated spreadsheet metadata for accuracy and completeness. Contract position.</w:t>
+      </w:r>
+      <w:r>
+        <w:t xml:space="preserve"> </w:t>
+      </w:r>
+      <w:r>
+        <w:rPr>
+          <w:b/>
+        </w:rPr>
+        <w:t>Tech:</w:t>
+      </w:r>
+      <w:r>
+        <w:t xml:space="preserve"> Python 3.8, C#, Windows/macOS</w:t>
       </w:r>
     </w:p>
     <w:p>
@@ -1815,7 +1829,7 @@
           <w:sz w:val="16"/>
           <w:szCs w:val="16"/>
         </w:rPr>
-        <w:t>ackson, MS | July 2018 – Jan 2019</w:t>
+        <w:t>ackson, MS | July 2018 – January 2019</w:t>
       </w:r>
       <w:r>
         <w:rPr>
@@ -1857,6 +1871,18 @@
         </w:rPr>
         <w:t>Led development of a RESTful auto-provisioning API for tracking and managing customer services delivered through CSpire and its third-party vendor partners. The application supported logging, reporting, and administration for both business office and network teams. Contract position.</w:t>
       </w:r>
+      <w:r>
+        <w:t xml:space="preserve"> </w:t>
+      </w:r>
+      <w:r>
+        <w:rPr>
+          <w:b/>
+        </w:rPr>
+        <w:t>Tech:</w:t>
+      </w:r>
+      <w:r>
+        <w:t xml:space="preserve"> Python 2.7, Flask, SQLAlchemy, MySQL, PostgreSQL</w:t>
+      </w:r>
     </w:p>
     <w:p>
       <w:pPr>
@@ -1876,16 +1902,15 @@
           <w:sz w:val="16"/>
           <w:szCs w:val="16"/>
         </w:rPr>
-        <w:t>Lowes Inc</w:t>
-      </w:r>
-      <w:r>
-        <w:rPr>
-          <w:rFonts w:ascii="Arial" w:hAnsi="Arial" w:cs="Arial"/>
-          <w:color w:val="001279"/>
-          <w:sz w:val="16"/>
-          <w:szCs w:val="16"/>
-        </w:rPr>
-        <w:t>.</w:t>
+        <w:t>Lowe’s</w:t>
+      </w:r>
+      <w:r>
+        <w:rPr>
+          <w:rFonts w:ascii="Arial" w:hAnsi="Arial" w:cs="Arial"/>
+          <w:color w:val="001279"/>
+          <w:sz w:val="16"/>
+          <w:szCs w:val="16"/>
+        </w:rPr>
       </w:r>
     </w:p>
     <w:p>
@@ -1906,7 +1931,7 @@
           <w:sz w:val="16"/>
           <w:szCs w:val="16"/>
         </w:rPr>
-        <w:t>Mooresville, NC | Aug 2012 – Jun 2013</w:t>
+        <w:t>Mooresville, NC | August 2012 – June 2013</w:t>
       </w:r>
       <w:r>
         <w:rPr>
@@ -1945,7 +1970,7 @@
           <w:sz w:val="16"/>
           <w:szCs w:val="16"/>
         </w:rPr>
-        <w:t>Refactored and extended legacy C code to support EMV (chip-based credit and debit card) transaction processing as part of Lowe’s transition away from magnetic stripe. Work included code analysis, bug fixes, and documentation. Contract position.</w:t>
+        <w:t>Refactored and extended legacy C code to support EMV (chip-based credit and debit card) transaction processing as part of Lowe’s transition away from magnetic stripe (swipe) cards. Work included code analysis, bug fixes, and documentation. Contract position.</w:t>
       </w:r>
     </w:p>
     <w:p/>
@@ -1992,7 +2017,7 @@
           <w:sz w:val="16"/>
           <w:szCs w:val="16"/>
         </w:rPr>
-        <w:t>Memphis, TN | Apr 2012 – Aug 2012</w:t>
+        <w:t>Memphis, TN | April 2012 – August 2012</w:t>
       </w:r>
     </w:p>
     <w:p>
@@ -2013,7 +2038,7 @@
           <w:sz w:val="16"/>
           <w:szCs w:val="16"/>
         </w:rPr>
-        <w:t>Provided production support for Hilton’s Central Reservation System. Contributed programming support using C, Perl, and shell scripting.</w:t>
+        <w:t>Provided production support for Hilton’s Central Reservation System, contributing bug fixes and maintenance using C, Perl, and shell scripting. Contract position.</w:t>
       </w:r>
       <w:r>
         <w:rPr>
@@ -2100,7 +2125,7 @@
           <w:sz w:val="16"/>
           <w:szCs w:val="16"/>
         </w:rPr>
-        <w:t>Nashville, TN | May 2010 – Dec 2011</w:t>
+        <w:t>Nashville, TN | May 2010 – December 2011</w:t>
       </w:r>
     </w:p>
     <w:p>
@@ -2294,7 +2319,7 @@
           <w:sz w:val="16"/>
           <w:szCs w:val="16"/>
         </w:rPr>
-        <w:t>Nashville, TN | Feb 2009 – Jun 2009</w:t>
+        <w:t>Nashville, TN | February 2009 – June 2009</w:t>
       </w:r>
     </w:p>
     <w:p>
@@ -2315,7 +2340,7 @@
           <w:sz w:val="16"/>
           <w:szCs w:val="16"/>
         </w:rPr>
-        <w:t>Migrated MMIS (Medicaid Management Information System) software for TennCare from Hewlett-Packard’s infrastructure to ACS. Developed automation scripts and analyzed legacy C modules. Contract position.</w:t>
+        <w:t>Migrated MMIS (Medicaid Management Information System) software for TennCare from Hewlett-Packard’s infrastructure to ACS (Affiliated Computer Services). Developed automation scripts and analyzed legacy C modules. Contract position.</w:t>
       </w:r>
     </w:p>
     <w:p>
@@ -2371,7 +2396,7 @@
           <w:sz w:val="16"/>
           <w:szCs w:val="16"/>
         </w:rPr>
-        <w:t>Columbus, OH | Oct 2008 – Feb 2009</w:t>
+        <w:t>Columbus, OH | October 2008 – February 2009</w:t>
       </w:r>
       <w:r>
         <w:rPr>
@@ -2391,7 +2416,7 @@
           <w:sz w:val="16"/>
           <w:szCs w:val="16"/>
         </w:rPr>
-        <w:t>Analyzed annuity and financial data daily to detect anomalies in high-volume datasets. Proposed and developed a Python-based data validation and reporting tool to modernize and replace aging shell scripts used in production.</w:t>
+        <w:t>Analyzed annuity and financial data daily to detect anomalies in high-volume datasets. Proposed and developed a Python-based data validation and reporting tool to modernize and replace aging shell scripts used in production. Contract position.</w:t>
       </w:r>
       <w:r>
         <w:rPr>
@@ -2420,7 +2445,7 @@
           <w:sz w:val="16"/>
           <w:szCs w:val="16"/>
         </w:rPr>
-        <w:t xml:space="preserve"> Solaris, Oracle, proprietary scripting</w:t>
+        <w:t xml:space="preserve"> Solaris, Oracle, proprietary DSL</w:t>
       </w:r>
     </w:p>
     <w:p>
@@ -2478,7 +2503,7 @@
           <w:sz w:val="16"/>
           <w:szCs w:val="16"/>
         </w:rPr>
-        <w:t>Lexington, KY | May 2007 – Oct 2008</w:t>
+        <w:t>Lexington, KY | May 2007 – October 2008</w:t>
       </w:r>
       <w:r>
         <w:rPr>
@@ -2519,6 +2544,18 @@
         </w:rPr>
         <w:t>Bug fixes, code analysis, and refactoring of C code for high-end prototype printers designed for secure environments (government, military, finance). Developed Python scripts for daily integration testing. Contract position.</w:t>
       </w:r>
+      <w:r>
+        <w:t xml:space="preserve"> </w:t>
+      </w:r>
+      <w:r>
+        <w:rPr>
+          <w:b/>
+        </w:rPr>
+        <w:t>Tech:</w:t>
+      </w:r>
+      <w:r>
+        <w:t xml:space="preserve"> C, Python 2.6, RHEL</w:t>
+      </w:r>
     </w:p>
     <w:p/>
     <w:p>
@@ -2565,7 +2602,7 @@
           <w:sz w:val="16"/>
           <w:szCs w:val="16"/>
         </w:rPr>
-        <w:t>Atlanta, GA | Jan 2007 – May 2007</w:t>
+        <w:t>Atlanta, GA | January 2007 – May 2007</w:t>
       </w:r>
     </w:p>
     <w:p>
@@ -2584,7 +2621,19 @@
           <w:sz w:val="16"/>
           <w:szCs w:val="16"/>
         </w:rPr>
-        <w:t>Bug fixes, code analysis, and refactoring of C code for high-end prototype printers designed for secure environments (government, military, finance). Developed Python scripts for daily integration testing. Contract position.</w:t>
+        <w:t>Developed tools for porting and rebuilding C/C++ applications from Microsoft Visual Studio to Unix environments, using Visual Studio build artifacts rather than traditional makefile-based builds. Contract position.</w:t>
+      </w:r>
+      <w:r>
+        <w:t xml:space="preserve"> </w:t>
+      </w:r>
+      <w:r>
+        <w:rPr>
+          <w:b/>
+        </w:rPr>
+        <w:t>Tech:</w:t>
+      </w:r>
+      <w:r>
+        <w:t xml:space="preserve"> C/C++, Visual Studio, macOS, Ubuntu Linux, Windows XP</w:t>
       </w:r>
     </w:p>
     <w:p/>
@@ -2608,7 +2657,7 @@
           <w:sz w:val="16"/>
           <w:szCs w:val="16"/>
         </w:rPr>
-        <w:t>Lowe’s Inc.</w:t>
+        <w:t>Lowe’s</w:t>
       </w:r>
     </w:p>
     <w:p>
@@ -2631,7 +2680,7 @@
           <w:sz w:val="16"/>
           <w:szCs w:val="16"/>
         </w:rPr>
-        <w:t>Wilkesboro, NC | Feb 2006 – Dec 2006</w:t>
+        <w:t>Wilkesboro, NC | February 2006 – December 2006</w:t>
       </w:r>
     </w:p>
     <w:p>
@@ -2652,16 +2701,15 @@
           <w:sz w:val="16"/>
           <w:szCs w:val="16"/>
         </w:rPr>
-        <w:t>I</w:t>
-      </w:r>
-      <w:r>
-        <w:rPr>
-          <w:rFonts w:ascii="Arial" w:hAnsi="Arial" w:cs="Arial"/>
-          <w:color w:val="001279"/>
-          <w:sz w:val="16"/>
-          <w:szCs w:val="16"/>
-        </w:rPr>
-        <w:t>nternationalized software for Lowe’s first Canadian store. Maintained and extended existing C and shell scripting on AIX.</w:t>
+      </w:r>
+      <w:r>
+        <w:rPr>
+          <w:rFonts w:ascii="Arial" w:hAnsi="Arial" w:cs="Arial"/>
+          <w:color w:val="001279"/>
+          <w:sz w:val="16"/>
+          <w:szCs w:val="16"/>
+        </w:rPr>
+        <w:t>Adapted Lowe’s point-of-sale software for the company’s first Canadian store, modifying C code for local currency, card processing, and regulatory compliance. Contract position.</w:t>
       </w:r>
     </w:p>
     <w:p>
@@ -2751,7 +2799,7 @@
           <w:sz w:val="16"/>
           <w:szCs w:val="16"/>
         </w:rPr>
-        <w:t>Alpharetta, GA | Aug 2004 – Feb 2006</w:t>
+        <w:t>Alpharetta, GA | August 2004 – February 2006</w:t>
       </w:r>
     </w:p>
     <w:p>
@@ -2772,7 +2820,7 @@
           <w:sz w:val="16"/>
           <w:szCs w:val="16"/>
         </w:rPr>
-        <w:t>Maintained and extended a legacy billing engine running on AIX and GNU/Linux using Oracle. The system was written primarily in C++ with shell scripts. Taught a C++ course to the code acceptance testing group and developed a Perl application that automated the configuration of their test boxes.</w:t>
+        <w:t>Maintained and extended a legacy billing engine running on AIX and GNU/Linux using Oracle. The system was written primarily in C++ with shell scripts. Taught a C++ course to the code acceptance testing group and developed a Perl application that automated the configuration of their test boxes. Contract position.</w:t>
       </w:r>
       <w:r>
         <w:rPr>
@@ -2801,7 +2849,7 @@
           <w:sz w:val="16"/>
           <w:szCs w:val="16"/>
         </w:rPr>
-        <w:t xml:space="preserve"> C, C++, Perl, Oracle, AIX</w:t>
+        <w:t xml:space="preserve"> C++, Perl, Shell, Oracle, AIX, GNU/Linux</w:t>
       </w:r>
     </w:p>
     <w:p>
@@ -2834,7 +2882,7 @@
           <w:sz w:val="16"/>
           <w:szCs w:val="16"/>
         </w:rPr>
-        <w:t>SAIC</w:t>
+        <w:t>SAIC (Science Applications International Corporation)</w:t>
       </w:r>
     </w:p>
     <w:p>
@@ -2855,7 +2903,7 @@
           <w:sz w:val="16"/>
           <w:szCs w:val="16"/>
         </w:rPr>
-        <w:t>Oak Ridge, TN | Feb 2003 – Aug 2004</w:t>
+        <w:t>Oak Ridge, TN | February 2003 – August 2004</w:t>
       </w:r>
       <w:r>
         <w:rPr>
@@ -2894,7 +2942,19 @@
           <w:sz w:val="16"/>
           <w:szCs w:val="16"/>
         </w:rPr>
-        <w:t>Maintained and extended a legacy Perl application for network-wide resource and account management at Oak Ridge and Los Alamos National Laboratories until it was decommissioned.</w:t>
+        <w:t>Maintained and extended a legacy Perl application for network-wide resource and account management at Oak Ridge and Los Alamos National Laboratories until it was decommissioned. Contract position.</w:t>
+      </w:r>
+      <w:r>
+        <w:t xml:space="preserve"> </w:t>
+      </w:r>
+      <w:r>
+        <w:rPr>
+          <w:b/>
+        </w:rPr>
+        <w:t>Tech:</w:t>
+      </w:r>
+      <w:r>
+        <w:t xml:space="preserve"> Perl, Oracle, Unix</w:t>
       </w:r>
     </w:p>
     <w:p/>
@@ -2941,7 +3001,7 @@
           <w:sz w:val="16"/>
           <w:szCs w:val="16"/>
         </w:rPr>
-        <w:t>Knoxville, TN | Aug 2002 – Dec 2002</w:t>
+        <w:t>Knoxville, TN | August 2002 – December 2002</w:t>
       </w:r>
       <w:r>
         <w:rPr>
@@ -2979,7 +3039,7 @@
           <w:sz w:val="16"/>
           <w:szCs w:val="16"/>
         </w:rPr>
-        <w:t xml:space="preserve">Built bioinformatics tools for monitoring, reporting, and analysis of microarray gene data. Tutored professional staff and graduate students in Perl programming for bioinformatics </w:t>
+        <w:t xml:space="preserve">Built bioinformatics tools in Perl and C, backed by MySQL on Red Hat Linux, for monitoring, reporting, and analysis of microarray gene data. Tutored professional staff and graduate </w:t>
       </w:r>
       <w:proofErr w:type="spellStart"/>
       <w:r>
@@ -2989,7 +3049,7 @@
           <w:sz w:val="16"/>
           <w:szCs w:val="16"/>
         </w:rPr>
-        <w:t>research.</w:t>
+        <w:t xml:space="preserve">students in Perl programming for bioinformatics research. Contract position. </w:t>
       </w:r>
       <w:r>
         <w:rPr>
@@ -3068,7 +3128,7 @@
           <w:sz w:val="16"/>
           <w:szCs w:val="16"/>
         </w:rPr>
-        <w:t>Atlanta, GA | Jul 2001 – Jul 2002</w:t>
+        <w:t>Atlanta, GA | July 2001 – July 2002</w:t>
       </w:r>
     </w:p>
     <w:p>
@@ -3089,7 +3149,19 @@
           <w:sz w:val="16"/>
           <w:szCs w:val="16"/>
         </w:rPr>
-        <w:t>Performed code maintenance on a cross-platform warehouse management system written in C++ for Linux and Windows. Contract position.</w:t>
+        <w:t>Performed code maintenance on a cross-platform warehouse management system written in C++ for Linux and Windows, using Oracle for data storage and the MKS Toolkit for Unix-style tooling on Windows. Contract position.</w:t>
+      </w:r>
+      <w:r>
+        <w:t xml:space="preserve"> </w:t>
+      </w:r>
+      <w:r>
+        <w:rPr>
+          <w:b/>
+        </w:rPr>
+        <w:t>Tech:</w:t>
+      </w:r>
+      <w:r>
+        <w:t xml:space="preserve"> C++, Oracle, Linux, Windows, MKS Toolkit</w:t>
       </w:r>
     </w:p>
     <w:p>
@@ -3147,7 +3219,7 @@
           <w:sz w:val="16"/>
           <w:szCs w:val="16"/>
         </w:rPr>
-        <w:t>Atlanta, GA | Jan 2000 – Jul 2001</w:t>
+        <w:t>Atlanta, GA | January 2000 – July 2001</w:t>
       </w:r>
     </w:p>
     <w:p>
@@ -3166,7 +3238,7 @@
           <w:sz w:val="16"/>
           <w:szCs w:val="16"/>
         </w:rPr>
-        <w:t>Performed code maintenance and enhancement for a large legacy billing engine written in C/C++ using Oracle, spanning multiple Unix platforms. Contributed to major technical documentation rewrites.</w:t>
+        <w:t>Performed code maintenance and enhancement for a large legacy billing engine written in C/C++ using Oracle, spanning multiple Unix platforms. Contributed to major technical documentation rewrites. Contract position.</w:t>
       </w:r>
       <w:r>
         <w:rPr>
@@ -3242,7 +3314,7 @@
           <w:sz w:val="16"/>
           <w:szCs w:val="16"/>
         </w:rPr>
-        <w:t>Atlanta, GA | Nov 1998 – Jan 2000</w:t>
+        <w:t>Atlanta, GA | November 1998 – January 2000</w:t>
       </w:r>
     </w:p>
     <w:p>
@@ -3261,7 +3333,7 @@
           <w:sz w:val="16"/>
           <w:szCs w:val="16"/>
         </w:rPr>
-        <w:t>Worked on multimedia integration R&amp;D for distributed Solaris networks. Developed coding projects using C++ and evaluated third-party middleware (such as CORBA) to facilitate network communication.</w:t>
+        <w:t>Worked on multimedia integration R&amp;D for distributed Solaris networks. Developed coding projects using C++ and evaluated third-party middleware (such as CORBA) to facilitate network communication. Contract position.</w:t>
       </w:r>
       <w:r>
         <w:rPr>
@@ -3350,7 +3422,7 @@
           <w:sz w:val="16"/>
           <w:szCs w:val="16"/>
         </w:rPr>
-        <w:t>Atlanta, GA | Feb 1996 – Nov 1998</w:t>
+        <w:t>Atlanta, GA | February 1996 – November 1998</w:t>
       </w:r>
     </w:p>
     <w:p>
@@ -3369,7 +3441,7 @@
           <w:sz w:val="16"/>
           <w:szCs w:val="16"/>
         </w:rPr>
-        <w:t>Full-cycle project to implement a billing engine on AIX using C++, Pro*C, and Oracle. Developed a Perl application that processed firearm purchase applications for the State of California (an MCI client).</w:t>
+        <w:t>Full-cycle project to implement a billing engine on AIX using C++, Pro*C, and Oracle. Developed a Perl application that processed firearm purchase applications for the State of California (an MCI client). Contract position.</w:t>
       </w:r>
       <w:r>
         <w:rPr>
@@ -3398,7 +3470,7 @@
           <w:sz w:val="16"/>
           <w:szCs w:val="16"/>
         </w:rPr>
-        <w:t xml:space="preserve"> C++, SQL, Unix, Perl</w:t>
+        <w:t xml:space="preserve"> C++, Pro*C, Oracle, SQL, AIX, Unix, Perl</w:t>
       </w:r>
     </w:p>
     <w:bookmarkEnd w:id="1"/>

</xml_diff>

<commit_message>
Update homepage/resume copy and books page; reformat routes.py imports
Revise the Medicaid Claims Checker description on the homepage and
resume to accurately reflect the rule engine/front-end split and ML
integration point rather than framing it as a fraud detection tool.
Fix a broken sentence in The Little Schemer entry, add a missing link
for Burn Math Class, and correct Hofstadter's field to cognitive
scientist. Also updates the exported resume docx/pdf and reorders
routes.py imports.

Co-Authored-By: Claude Sonnet 5 <noreply@anthropic.com>
</commit_message>
<xml_diff>
--- a/static/files/Resume.v3.7.docx
+++ b/static/files/Resume.v3.7.docx
@@ -1633,11 +1633,21 @@
       </w:r>
       <w:r>
         <w:rPr>
+          <w:rFonts w:ascii="Arial" w:hAnsi="Arial" w:cs="Arial"/>
+          <w:color w:val="001279"/>
+          <w:sz w:val="16"/>
+          <w:szCs w:val="16"/>
           <w:b/>
         </w:rPr>
         <w:t>Tech:</w:t>
       </w:r>
       <w:r>
+        <w:rPr>
+          <w:rFonts w:ascii="Arial" w:hAnsi="Arial" w:cs="Arial"/>
+          <w:color w:val="001279"/>
+          <w:sz w:val="16"/>
+          <w:szCs w:val="16"/>
+        </w:rPr>
         <w:t xml:space="preserve"> Python 3.9, Django 3.1, PostgreSQL 14.1, Docker</w:t>
       </w:r>
     </w:p>
@@ -1758,11 +1768,21 @@
       </w:r>
       <w:r>
         <w:rPr>
+          <w:rFonts w:ascii="Arial" w:hAnsi="Arial" w:cs="Arial"/>
+          <w:color w:val="001279"/>
+          <w:sz w:val="16"/>
+          <w:szCs w:val="16"/>
           <w:b/>
         </w:rPr>
         <w:t>Tech:</w:t>
       </w:r>
       <w:r>
+        <w:rPr>
+          <w:rFonts w:ascii="Arial" w:hAnsi="Arial" w:cs="Arial"/>
+          <w:color w:val="001279"/>
+          <w:sz w:val="16"/>
+          <w:szCs w:val="16"/>
+        </w:rPr>
         <w:t xml:space="preserve"> Python 3.8, C#, Windows/macOS</w:t>
       </w:r>
     </w:p>
@@ -1876,11 +1896,21 @@
       </w:r>
       <w:r>
         <w:rPr>
+          <w:rFonts w:ascii="Arial" w:hAnsi="Arial" w:cs="Arial"/>
+          <w:color w:val="001279"/>
+          <w:sz w:val="16"/>
+          <w:szCs w:val="16"/>
           <w:b/>
         </w:rPr>
         <w:t>Tech:</w:t>
       </w:r>
       <w:r>
+        <w:rPr>
+          <w:rFonts w:ascii="Arial" w:hAnsi="Arial" w:cs="Arial"/>
+          <w:color w:val="001279"/>
+          <w:sz w:val="16"/>
+          <w:szCs w:val="16"/>
+        </w:rPr>
         <w:t xml:space="preserve"> Python 2.7, Flask, SQLAlchemy, MySQL, PostgreSQL</w:t>
       </w:r>
     </w:p>
@@ -2549,11 +2579,21 @@
       </w:r>
       <w:r>
         <w:rPr>
+          <w:rFonts w:ascii="Arial" w:hAnsi="Arial" w:cs="Arial"/>
+          <w:color w:val="001279"/>
+          <w:sz w:val="16"/>
+          <w:szCs w:val="16"/>
           <w:b/>
         </w:rPr>
         <w:t>Tech:</w:t>
       </w:r>
       <w:r>
+        <w:rPr>
+          <w:rFonts w:ascii="Arial" w:hAnsi="Arial" w:cs="Arial"/>
+          <w:color w:val="001279"/>
+          <w:sz w:val="16"/>
+          <w:szCs w:val="16"/>
+        </w:rPr>
         <w:t xml:space="preserve"> C, Python 2.6, RHEL</w:t>
       </w:r>
     </w:p>
@@ -2628,11 +2668,21 @@
       </w:r>
       <w:r>
         <w:rPr>
+          <w:rFonts w:ascii="Arial" w:hAnsi="Arial" w:cs="Arial"/>
+          <w:color w:val="001279"/>
+          <w:sz w:val="16"/>
+          <w:szCs w:val="16"/>
           <w:b/>
         </w:rPr>
         <w:t>Tech:</w:t>
       </w:r>
       <w:r>
+        <w:rPr>
+          <w:rFonts w:ascii="Arial" w:hAnsi="Arial" w:cs="Arial"/>
+          <w:color w:val="001279"/>
+          <w:sz w:val="16"/>
+          <w:szCs w:val="16"/>
+        </w:rPr>
         <w:t xml:space="preserve"> C/C++, Visual Studio, macOS, Ubuntu Linux, Windows XP</w:t>
       </w:r>
     </w:p>
@@ -2949,11 +2999,21 @@
       </w:r>
       <w:r>
         <w:rPr>
+          <w:rFonts w:ascii="Arial" w:hAnsi="Arial" w:cs="Arial"/>
+          <w:color w:val="001279"/>
+          <w:sz w:val="16"/>
+          <w:szCs w:val="16"/>
           <w:b/>
         </w:rPr>
         <w:t>Tech:</w:t>
       </w:r>
       <w:r>
+        <w:rPr>
+          <w:rFonts w:ascii="Arial" w:hAnsi="Arial" w:cs="Arial"/>
+          <w:color w:val="001279"/>
+          <w:sz w:val="16"/>
+          <w:szCs w:val="16"/>
+        </w:rPr>
         <w:t xml:space="preserve"> Perl, Oracle, Unix</w:t>
       </w:r>
     </w:p>
@@ -3156,11 +3216,21 @@
       </w:r>
       <w:r>
         <w:rPr>
+          <w:rFonts w:ascii="Arial" w:hAnsi="Arial" w:cs="Arial"/>
+          <w:color w:val="001279"/>
+          <w:sz w:val="16"/>
+          <w:szCs w:val="16"/>
           <w:b/>
         </w:rPr>
         <w:t>Tech:</w:t>
       </w:r>
       <w:r>
+        <w:rPr>
+          <w:rFonts w:ascii="Arial" w:hAnsi="Arial" w:cs="Arial"/>
+          <w:color w:val="001279"/>
+          <w:sz w:val="16"/>
+          <w:szCs w:val="16"/>
+        </w:rPr>
         <w:t xml:space="preserve"> C++, Oracle, Linux, Windows, MKS Toolkit</w:t>
       </w:r>
     </w:p>

</xml_diff>

<commit_message>
Add job titles to downloadable resume docx and pdf
Mirror the site's job titles in the Word and PDF resumes: each employer
heading now carries an italic title, and EMRTS and the University of
Tennessee are worded as independent contractor roles. The PDF is
exported from the matching Pages document.

Co-Authored-By: Claude Opus 5.5 <noreply@anthropic.com>
</commit_message>
<xml_diff>
--- a/static/files/Resume.v3.7.docx
+++ b/static/files/Resume.v3.7.docx
@@ -888,6 +888,17 @@
           <w:szCs w:val="16"/>
         </w:rPr>
         <w:t>EMR Technical Solutions (EMRTS)</w:t>
+      </w:r>
+      <w:r>
+        <w:rPr>
+          <w:rFonts w:ascii="Arial" w:hAnsi="Arial" w:cs="Arial"/>
+          <w:i/>
+          <w:iCs/>
+          <w:color w:val="001279"/>
+          <w:sz w:val="16"/>
+          <w:szCs w:val="16"/>
+        </w:rPr>
+        <w:t xml:space="preserve"> — Software Engineer (Independent Contractor)</w:t>
       </w:r>
     </w:p>
     <w:p>
@@ -941,7 +952,7 @@
           <w:sz w:val="16"/>
           <w:szCs w:val="16"/>
         </w:rPr>
-        <w:t>Software engineer working with a healthcare IT startup across six engagements, developing open-source tools for medical records, billing, provider enrollment, and claims. Work has centered on proof-of-concept development and R&amp;D, with occasional collaboration with academic and professional partners. Contracts listed below fill the gaps between EMRTS engagements.</w:t>
+        <w:t>Independent contractor working with a healthcare IT startup across six engagements, developing open-source tools for medical records, billing, provider enrollment, and claims. Work has centered on proof-of-concept development and R&amp;D, with occasional collaboration with academic and professional partners. Contracts listed below fill the gaps between EMRTS engagements.</w:t>
       </w:r>
     </w:p>
     <w:p>
@@ -1580,6 +1591,17 @@
         </w:rPr>
         <w:t>Quantuvos</w:t>
       </w:r>
+      <w:r>
+        <w:rPr>
+          <w:rFonts w:ascii="Tahoma" w:hAnsi="Tahoma" w:cs="Arial"/>
+          <w:i/>
+          <w:iCs/>
+          <w:color w:val="001279"/>
+          <w:sz w:val="18"/>
+          <w:szCs w:val="18"/>
+        </w:rPr>
+        <w:t xml:space="preserve"> — Technical Consultant (Contract)</w:t>
+      </w:r>
     </w:p>
     <w:p>
       <w:pPr>
@@ -1686,17 +1708,18 @@
           <w:sz w:val="16"/>
           <w:szCs w:val="16"/>
         </w:rPr>
-        <w:t>O</w:t>
-      </w:r>
-      <w:r>
-        <w:rPr>
-          <w:rFonts w:ascii="Arial" w:hAnsi="Arial" w:cs="Arial"/>
-          <w:b/>
-          <w:color w:val="001279"/>
-          <w:sz w:val="16"/>
-          <w:szCs w:val="16"/>
-        </w:rPr>
-        <w:t>rchid Orthopedic Solutions</w:t>
+        <w:t>Orchid Orthopedic Solutions</w:t>
+      </w:r>
+      <w:r>
+        <w:rPr>
+          <w:rFonts w:ascii="Arial" w:hAnsi="Arial" w:cs="Arial"/>
+          <w:i/>
+          <w:iCs/>
+          <w:color w:val="001279"/>
+          <w:sz w:val="16"/>
+          <w:szCs w:val="16"/>
+        </w:rPr>
+        <w:t xml:space="preserve"> — Python Developer (Contract)</w:t>
       </w:r>
     </w:p>
     <w:p>
@@ -1820,6 +1843,17 @@
         </w:rPr>
         <w:t>CSpire</w:t>
       </w:r>
+      <w:r>
+        <w:rPr>
+          <w:rFonts w:ascii="Arial" w:hAnsi="Arial" w:cs="Arial"/>
+          <w:i/>
+          <w:iCs/>
+          <w:color w:val="001279"/>
+          <w:sz w:val="16"/>
+          <w:szCs w:val="16"/>
+        </w:rPr>
+        <w:t xml:space="preserve"> — Python Developer (Contract)</w:t>
+      </w:r>
       <w:proofErr w:type="spellEnd"/>
     </w:p>
     <w:p>
@@ -1937,6 +1971,17 @@
       <w:r>
         <w:rPr>
           <w:rFonts w:ascii="Arial" w:hAnsi="Arial" w:cs="Arial"/>
+          <w:i/>
+          <w:iCs/>
+          <w:color w:val="001279"/>
+          <w:sz w:val="16"/>
+          <w:szCs w:val="16"/>
+        </w:rPr>
+        <w:t xml:space="preserve"> — C Developer (Contract)</w:t>
+      </w:r>
+      <w:r>
+        <w:rPr>
+          <w:rFonts w:ascii="Arial" w:hAnsi="Arial" w:cs="Arial"/>
           <w:color w:val="001279"/>
           <w:sz w:val="16"/>
           <w:szCs w:val="16"/>
@@ -2026,6 +2071,17 @@
         </w:rPr>
         <w:t>Hilton</w:t>
       </w:r>
+      <w:r>
+        <w:rPr>
+          <w:rFonts w:ascii="Arial" w:hAnsi="Arial" w:cs="Arial"/>
+          <w:i/>
+          <w:iCs/>
+          <w:color w:val="001279"/>
+          <w:sz w:val="16"/>
+          <w:szCs w:val="16"/>
+        </w:rPr>
+        <w:t xml:space="preserve"> — Production Support Developer (Contract)</w:t>
+      </w:r>
     </w:p>
     <w:p>
       <w:pPr>
@@ -2133,6 +2189,17 @@
           <w:szCs w:val="16"/>
         </w:rPr>
         <w:t>Hewlett-Packard</w:t>
+      </w:r>
+      <w:r>
+        <w:rPr>
+          <w:rFonts w:ascii="Arial" w:hAnsi="Arial" w:cs="Arial"/>
+          <w:i/>
+          <w:iCs/>
+          <w:color w:val="001279"/>
+          <w:sz w:val="16"/>
+          <w:szCs w:val="16"/>
+        </w:rPr>
+        <w:t xml:space="preserve"> — Software Engineer</w:t>
       </w:r>
     </w:p>
     <w:p>
@@ -2328,6 +2395,17 @@
         </w:rPr>
         <w:t>ACS</w:t>
       </w:r>
+      <w:r>
+        <w:rPr>
+          <w:rFonts w:ascii="Arial" w:hAnsi="Arial" w:cs="Arial"/>
+          <w:i/>
+          <w:iCs/>
+          <w:color w:val="001279"/>
+          <w:sz w:val="16"/>
+          <w:szCs w:val="16"/>
+        </w:rPr>
+        <w:t xml:space="preserve"> — Software Developer (Contract)</w:t>
+      </w:r>
     </w:p>
     <w:p>
       <w:pPr>
@@ -2406,6 +2484,17 @@
           <w:szCs w:val="16"/>
         </w:rPr>
         <w:t>Nationwide</w:t>
+      </w:r>
+      <w:r>
+        <w:rPr>
+          <w:rFonts w:ascii="Arial" w:hAnsi="Arial" w:cs="Arial"/>
+          <w:i/>
+          <w:iCs/>
+          <w:color w:val="001279"/>
+          <w:sz w:val="16"/>
+          <w:szCs w:val="16"/>
+        </w:rPr>
+        <w:t xml:space="preserve"> — Python Developer / Data Analyst (Contract)</w:t>
       </w:r>
     </w:p>
     <w:p>
@@ -2513,6 +2602,17 @@
           <w:szCs w:val="16"/>
         </w:rPr>
         <w:t>Lexmark</w:t>
+      </w:r>
+      <w:r>
+        <w:rPr>
+          <w:rFonts w:ascii="Arial" w:hAnsi="Arial" w:cs="Arial"/>
+          <w:i/>
+          <w:iCs/>
+          <w:color w:val="001279"/>
+          <w:sz w:val="16"/>
+          <w:szCs w:val="16"/>
+        </w:rPr>
+        <w:t xml:space="preserve"> — C Developer (Contract)</w:t>
       </w:r>
     </w:p>
     <w:p>
@@ -2621,6 +2721,17 @@
         <w:lastRenderedPageBreak/>
         <w:t>IBM Internet Security Systems</w:t>
       </w:r>
+      <w:r>
+        <w:rPr>
+          <w:rFonts w:ascii="Arial" w:hAnsi="Arial" w:cs="Arial"/>
+          <w:i/>
+          <w:iCs/>
+          <w:color w:val="001279"/>
+          <w:sz w:val="16"/>
+          <w:szCs w:val="16"/>
+        </w:rPr>
+        <w:t xml:space="preserve"> — Build Tools Developer (Contract)</w:t>
+      </w:r>
     </w:p>
     <w:p>
       <w:pPr>
@@ -2708,6 +2819,17 @@
           <w:szCs w:val="16"/>
         </w:rPr>
         <w:t>Lowe’s</w:t>
+      </w:r>
+      <w:r>
+        <w:rPr>
+          <w:rFonts w:ascii="Arial" w:hAnsi="Arial" w:cs="Arial"/>
+          <w:i/>
+          <w:iCs/>
+          <w:color w:val="001279"/>
+          <w:sz w:val="16"/>
+          <w:szCs w:val="16"/>
+        </w:rPr>
+        <w:t xml:space="preserve"> — C Developer (Contract)</w:t>
       </w:r>
     </w:p>
     <w:p>
@@ -2828,6 +2950,17 @@
         </w:rPr>
         <w:t>Cingular Wireless</w:t>
       </w:r>
+      <w:r>
+        <w:rPr>
+          <w:rFonts w:ascii="Arial" w:hAnsi="Arial" w:cs="Arial"/>
+          <w:i/>
+          <w:iCs/>
+          <w:color w:val="001279"/>
+          <w:sz w:val="16"/>
+          <w:szCs w:val="16"/>
+        </w:rPr>
+        <w:t xml:space="preserve"> — C++ Developer (Contract)</w:t>
+      </w:r>
     </w:p>
     <w:p>
       <w:pPr>
@@ -2933,6 +3066,17 @@
           <w:szCs w:val="16"/>
         </w:rPr>
         <w:t>SAIC (Science Applications International Corporation)</w:t>
+      </w:r>
+      <w:r>
+        <w:rPr>
+          <w:rFonts w:ascii="Arial" w:hAnsi="Arial" w:cs="Arial"/>
+          <w:i/>
+          <w:iCs/>
+          <w:color w:val="001279"/>
+          <w:sz w:val="16"/>
+          <w:szCs w:val="16"/>
+        </w:rPr>
+        <w:t xml:space="preserve"> — Perl Developer (Contract)</w:t>
       </w:r>
     </w:p>
     <w:p>
@@ -3040,6 +3184,17 @@
         </w:rPr>
         <w:t>University of Tennessee – Center for Environmental Biotechnology</w:t>
       </w:r>
+      <w:r>
+        <w:rPr>
+          <w:rFonts w:ascii="Arial" w:hAnsi="Arial" w:cs="Arial"/>
+          <w:i/>
+          <w:iCs/>
+          <w:color w:val="001279"/>
+          <w:sz w:val="16"/>
+          <w:szCs w:val="16"/>
+        </w:rPr>
+        <w:t xml:space="preserve"> — Bioinformatics Programmer (Independent Contractor)</w:t>
+      </w:r>
     </w:p>
     <w:p>
       <w:pPr>
@@ -3109,7 +3264,7 @@
           <w:sz w:val="16"/>
           <w:szCs w:val="16"/>
         </w:rPr>
-        <w:t xml:space="preserve">students in Perl programming for bioinformatics research. Contract position. </w:t>
+        <w:t xml:space="preserve">students in Perl programming for bioinformatics research. Independent contract position. </w:t>
       </w:r>
       <w:r>
         <w:rPr>
@@ -3166,6 +3321,17 @@
           <w:szCs w:val="16"/>
         </w:rPr>
         <w:t>Manhattan Associates</w:t>
+      </w:r>
+      <w:r>
+        <w:rPr>
+          <w:rFonts w:ascii="Arial" w:hAnsi="Arial" w:cs="Arial"/>
+          <w:i/>
+          <w:iCs/>
+          <w:color w:val="001279"/>
+          <w:sz w:val="16"/>
+          <w:szCs w:val="16"/>
+        </w:rPr>
+        <w:t xml:space="preserve"> — C++ Developer (Contract)</w:t>
       </w:r>
     </w:p>
     <w:p>
@@ -3268,6 +3434,17 @@
         </w:rPr>
         <w:t>LHS/Sema Group Telecom</w:t>
       </w:r>
+      <w:r>
+        <w:rPr>
+          <w:rFonts w:ascii="Arial" w:hAnsi="Arial" w:cs="Arial"/>
+          <w:i/>
+          <w:iCs/>
+          <w:color w:val="001279"/>
+          <w:sz w:val="16"/>
+          <w:szCs w:val="16"/>
+        </w:rPr>
+        <w:t xml:space="preserve"> — C/C++ Developer (Contract)</w:t>
+      </w:r>
     </w:p>
     <w:p>
       <w:pPr>
@@ -3362,6 +3539,17 @@
           <w:szCs w:val="16"/>
         </w:rPr>
         <w:t>Intellivoice / Premier Technologies</w:t>
+      </w:r>
+      <w:r>
+        <w:rPr>
+          <w:rFonts w:ascii="Arial" w:hAnsi="Arial" w:cs="Arial"/>
+          <w:i/>
+          <w:iCs/>
+          <w:color w:val="001279"/>
+          <w:sz w:val="16"/>
+          <w:szCs w:val="16"/>
+        </w:rPr>
+        <w:t xml:space="preserve"> — R&amp;D Software Developer (Contract)</w:t>
       </w:r>
     </w:p>
     <w:p>
@@ -3470,6 +3658,17 @@
           <w:szCs w:val="16"/>
         </w:rPr>
         <w:t>MCI/WorldCom</w:t>
+      </w:r>
+      <w:r>
+        <w:rPr>
+          <w:rFonts w:ascii="Arial" w:hAnsi="Arial" w:cs="Arial"/>
+          <w:i/>
+          <w:iCs/>
+          <w:color w:val="001279"/>
+          <w:sz w:val="16"/>
+          <w:szCs w:val="16"/>
+        </w:rPr>
+        <w:t xml:space="preserve"> — Software Developer (Contract)</w:t>
       </w:r>
     </w:p>
     <w:p>

</xml_diff>